<commit_message>
Finission PCB et documentation
Ajout des modifications finales du PCB et ajout de plusieurs éléments dans la doc.
</commit_message>
<xml_diff>
--- a/jeu_du_moulin_boura/rpt/jeu-du-moulin-bourquenouda-rpt-development.docx
+++ b/jeu_du_moulin_boura/rpt/jeu-du-moulin-bourquenouda-rpt-development.docx
@@ -21,7 +21,7 @@
       <w:sdtContent>
         <w:p>
           <w:pPr>
-            <w:pStyle w:val="NoSpacing"/>
+            <w:pStyle w:val="Sansinterligne"/>
           </w:pPr>
           <w:r>
             <w:rPr>
@@ -206,7 +206,7 @@
                               <w:txbxContent>
                                 <w:p>
                                   <w:pPr>
-                                    <w:pStyle w:val="NoSpacing"/>
+                                    <w:pStyle w:val="Sansinterligne"/>
                                     <w:rPr>
                                       <w:b/>
                                       <w:color w:val="000000" w:themeColor="text1"/>
@@ -3511,7 +3511,7 @@
                         <w:txbxContent>
                           <w:p>
                             <w:pPr>
-                              <w:pStyle w:val="NoSpacing"/>
+                              <w:pStyle w:val="Sansinterligne"/>
                               <w:rPr>
                                 <w:b/>
                                 <w:color w:val="000000" w:themeColor="text1"/>
@@ -3717,7 +3717,7 @@
                             <w:txbxContent>
                               <w:p>
                                 <w:pPr>
-                                  <w:pStyle w:val="NoSpacing"/>
+                                  <w:pStyle w:val="Sansinterligne"/>
                                   <w:jc w:val="center"/>
                                   <w:rPr>
                                     <w:rFonts w:asciiTheme="majorHAnsi" w:eastAsiaTheme="majorEastAsia" w:hAnsiTheme="majorHAnsi" w:cstheme="majorBidi"/>
@@ -3738,7 +3738,6 @@
                                     <w:dataBinding w:prefixMappings="xmlns:ns0='http://purl.org/dc/elements/1.1/' xmlns:ns1='http://schemas.openxmlformats.org/package/2006/metadata/core-properties' " w:xpath="/ns1:coreProperties[1]/ns0:title[1]" w:storeItemID="{6C3C8BC8-F283-45AE-878A-BAB7291924A1}"/>
                                     <w:text/>
                                   </w:sdtPr>
-                                  <w:sdtEndPr/>
                                   <w:sdtContent>
                                     <w:r>
                                       <w:rPr>
@@ -3753,7 +3752,7 @@
                               </w:p>
                               <w:p>
                                 <w:pPr>
-                                  <w:pStyle w:val="NoSpacing"/>
+                                  <w:pStyle w:val="Sansinterligne"/>
                                   <w:jc w:val="center"/>
                                   <w:rPr>
                                     <w:rFonts w:eastAsiaTheme="majorEastAsia" w:cstheme="minorHAnsi"/>
@@ -3772,7 +3771,7 @@
                               </w:p>
                               <w:p>
                                 <w:pPr>
-                                  <w:pStyle w:val="NoSpacing"/>
+                                  <w:pStyle w:val="Sansinterligne"/>
                                   <w:jc w:val="center"/>
                                   <w:rPr>
                                     <w:rFonts w:eastAsiaTheme="majorEastAsia" w:cstheme="minorHAnsi"/>
@@ -3783,7 +3782,7 @@
                               </w:p>
                               <w:p>
                                 <w:pPr>
-                                  <w:pStyle w:val="NoSpacing"/>
+                                  <w:pStyle w:val="Sansinterligne"/>
                                   <w:jc w:val="center"/>
                                   <w:rPr>
                                     <w:rFonts w:eastAsiaTheme="majorEastAsia" w:cstheme="minorHAnsi"/>
@@ -3794,7 +3793,7 @@
                               </w:p>
                               <w:p>
                                 <w:pPr>
-                                  <w:pStyle w:val="NoSpacing"/>
+                                  <w:pStyle w:val="Sansinterligne"/>
                                   <w:jc w:val="center"/>
                                   <w:rPr>
                                     <w:rFonts w:eastAsiaTheme="majorEastAsia" w:cstheme="minorHAnsi"/>
@@ -3805,7 +3804,7 @@
                               </w:p>
                               <w:p>
                                 <w:pPr>
-                                  <w:pStyle w:val="NoSpacing"/>
+                                  <w:pStyle w:val="Sansinterligne"/>
                                   <w:jc w:val="center"/>
                                   <w:rPr>
                                     <w:rFonts w:eastAsiaTheme="majorEastAsia" w:cstheme="minorHAnsi"/>
@@ -3851,7 +3850,7 @@
                       <w:txbxContent>
                         <w:p>
                           <w:pPr>
-                            <w:pStyle w:val="NoSpacing"/>
+                            <w:pStyle w:val="Sansinterligne"/>
                             <w:jc w:val="center"/>
                             <w:rPr>
                               <w:rFonts w:asciiTheme="majorHAnsi" w:eastAsiaTheme="majorEastAsia" w:hAnsiTheme="majorHAnsi" w:cstheme="majorBidi"/>
@@ -3872,7 +3871,6 @@
                               <w:dataBinding w:prefixMappings="xmlns:ns0='http://purl.org/dc/elements/1.1/' xmlns:ns1='http://schemas.openxmlformats.org/package/2006/metadata/core-properties' " w:xpath="/ns1:coreProperties[1]/ns0:title[1]" w:storeItemID="{6C3C8BC8-F283-45AE-878A-BAB7291924A1}"/>
                               <w:text/>
                             </w:sdtPr>
-                            <w:sdtEndPr/>
                             <w:sdtContent>
                               <w:r>
                                 <w:rPr>
@@ -3887,7 +3885,7 @@
                         </w:p>
                         <w:p>
                           <w:pPr>
-                            <w:pStyle w:val="NoSpacing"/>
+                            <w:pStyle w:val="Sansinterligne"/>
                             <w:jc w:val="center"/>
                             <w:rPr>
                               <w:rFonts w:eastAsiaTheme="majorEastAsia" w:cstheme="minorHAnsi"/>
@@ -3906,7 +3904,7 @@
                         </w:p>
                         <w:p>
                           <w:pPr>
-                            <w:pStyle w:val="NoSpacing"/>
+                            <w:pStyle w:val="Sansinterligne"/>
                             <w:jc w:val="center"/>
                             <w:rPr>
                               <w:rFonts w:eastAsiaTheme="majorEastAsia" w:cstheme="minorHAnsi"/>
@@ -3917,7 +3915,7 @@
                         </w:p>
                         <w:p>
                           <w:pPr>
-                            <w:pStyle w:val="NoSpacing"/>
+                            <w:pStyle w:val="Sansinterligne"/>
                             <w:jc w:val="center"/>
                             <w:rPr>
                               <w:rFonts w:eastAsiaTheme="majorEastAsia" w:cstheme="minorHAnsi"/>
@@ -3928,7 +3926,7 @@
                         </w:p>
                         <w:p>
                           <w:pPr>
-                            <w:pStyle w:val="NoSpacing"/>
+                            <w:pStyle w:val="Sansinterligne"/>
                             <w:jc w:val="center"/>
                             <w:rPr>
                               <w:rFonts w:eastAsiaTheme="majorEastAsia" w:cstheme="minorHAnsi"/>
@@ -3939,7 +3937,7 @@
                         </w:p>
                         <w:p>
                           <w:pPr>
-                            <w:pStyle w:val="NoSpacing"/>
+                            <w:pStyle w:val="Sansinterligne"/>
                             <w:jc w:val="center"/>
                             <w:rPr>
                               <w:rFonts w:eastAsiaTheme="majorEastAsia" w:cstheme="minorHAnsi"/>
@@ -4091,7 +4089,7 @@
                             <w:txbxContent>
                               <w:p>
                                 <w:pPr>
-                                  <w:pStyle w:val="NoSpacing"/>
+                                  <w:pStyle w:val="Sansinterligne"/>
                                   <w:ind w:left="360"/>
                                   <w:rPr>
                                     <w:rFonts w:cstheme="minorHAnsi"/>
@@ -4150,7 +4148,7 @@
                       <w:txbxContent>
                         <w:p>
                           <w:pPr>
-                            <w:pStyle w:val="NoSpacing"/>
+                            <w:pStyle w:val="Sansinterligne"/>
                             <w:ind w:left="360"/>
                             <w:rPr>
                               <w:rFonts w:cstheme="minorHAnsi"/>
@@ -4258,7 +4256,7 @@
                             <w:txbxContent>
                               <w:p>
                                 <w:pPr>
-                                  <w:pStyle w:val="NoSpacing"/>
+                                  <w:pStyle w:val="Sansinterligne"/>
                                   <w:jc w:val="center"/>
                                   <w:rPr>
                                     <w:color w:val="5B9BD5" w:themeColor="accent1"/>
@@ -4279,7 +4277,6 @@
                                     <w:dataBinding w:prefixMappings="xmlns:ns0='http://purl.org/dc/elements/1.1/' xmlns:ns1='http://schemas.openxmlformats.org/package/2006/metadata/core-properties' " w:xpath="/ns1:coreProperties[1]/ns0:creator[1]" w:storeItemID="{6C3C8BC8-F283-45AE-878A-BAB7291924A1}"/>
                                     <w:text/>
                                   </w:sdtPr>
-                                  <w:sdtEndPr/>
                                   <w:sdtContent>
                                     <w:r>
                                       <w:rPr>
@@ -4294,7 +4291,7 @@
                               </w:p>
                               <w:p>
                                 <w:pPr>
-                                  <w:pStyle w:val="NoSpacing"/>
+                                  <w:pStyle w:val="Sansinterligne"/>
                                   <w:jc w:val="center"/>
                                   <w:rPr>
                                     <w:caps/>
@@ -4313,7 +4310,7 @@
                               </w:p>
                               <w:p>
                                 <w:pPr>
-                                  <w:pStyle w:val="NoSpacing"/>
+                                  <w:pStyle w:val="Sansinterligne"/>
                                   <w:jc w:val="center"/>
                                   <w:rPr>
                                     <w:caps/>
@@ -4334,7 +4331,6 @@
                                     <w:dataBinding w:prefixMappings="xmlns:ns0='http://schemas.openxmlformats.org/officeDocument/2006/extended-properties' " w:xpath="/ns0:Properties[1]/ns0:Company[1]" w:storeItemID="{6668398D-A668-4E3E-A5EB-62B293D839F1}"/>
                                     <w:text/>
                                   </w:sdtPr>
-                                  <w:sdtEndPr/>
                                   <w:sdtContent>
                                     <w:r>
                                       <w:rPr>
@@ -4365,7 +4361,7 @@
                               </w:p>
                               <w:p>
                                 <w:pPr>
-                                  <w:pStyle w:val="NoSpacing"/>
+                                  <w:pStyle w:val="Sansinterligne"/>
                                   <w:jc w:val="center"/>
                                   <w:rPr>
                                     <w:sz w:val="20"/>
@@ -4404,7 +4400,7 @@
                       <w:txbxContent>
                         <w:p>
                           <w:pPr>
-                            <w:pStyle w:val="NoSpacing"/>
+                            <w:pStyle w:val="Sansinterligne"/>
                             <w:jc w:val="center"/>
                             <w:rPr>
                               <w:color w:val="5B9BD5" w:themeColor="accent1"/>
@@ -4425,7 +4421,6 @@
                               <w:dataBinding w:prefixMappings="xmlns:ns0='http://purl.org/dc/elements/1.1/' xmlns:ns1='http://schemas.openxmlformats.org/package/2006/metadata/core-properties' " w:xpath="/ns1:coreProperties[1]/ns0:creator[1]" w:storeItemID="{6C3C8BC8-F283-45AE-878A-BAB7291924A1}"/>
                               <w:text/>
                             </w:sdtPr>
-                            <w:sdtEndPr/>
                             <w:sdtContent>
                               <w:r>
                                 <w:rPr>
@@ -4440,7 +4435,7 @@
                         </w:p>
                         <w:p>
                           <w:pPr>
-                            <w:pStyle w:val="NoSpacing"/>
+                            <w:pStyle w:val="Sansinterligne"/>
                             <w:jc w:val="center"/>
                             <w:rPr>
                               <w:caps/>
@@ -4459,7 +4454,7 @@
                         </w:p>
                         <w:p>
                           <w:pPr>
-                            <w:pStyle w:val="NoSpacing"/>
+                            <w:pStyle w:val="Sansinterligne"/>
                             <w:jc w:val="center"/>
                             <w:rPr>
                               <w:caps/>
@@ -4480,7 +4475,6 @@
                               <w:dataBinding w:prefixMappings="xmlns:ns0='http://schemas.openxmlformats.org/officeDocument/2006/extended-properties' " w:xpath="/ns0:Properties[1]/ns0:Company[1]" w:storeItemID="{6668398D-A668-4E3E-A5EB-62B293D839F1}"/>
                               <w:text/>
                             </w:sdtPr>
-                            <w:sdtEndPr/>
                             <w:sdtContent>
                               <w:r>
                                 <w:rPr>
@@ -4511,7 +4505,7 @@
                         </w:p>
                         <w:p>
                           <w:pPr>
-                            <w:pStyle w:val="NoSpacing"/>
+                            <w:pStyle w:val="Sansinterligne"/>
                             <w:jc w:val="center"/>
                             <w:rPr>
                               <w:sz w:val="20"/>
@@ -4540,12 +4534,12 @@
         </w:p>
       </w:sdtContent>
     </w:sdt>
-    <w:bookmarkStart w:id="0" w:name="_Toc40260289" w:displacedByCustomXml="prev"/>
+    <w:bookmarkStart w:id="0" w:name="_Toc40259938" w:displacedByCustomXml="prev"/>
     <w:bookmarkStart w:id="1" w:name="_Toc40260205" w:displacedByCustomXml="prev"/>
-    <w:bookmarkStart w:id="2" w:name="_Toc40259938" w:displacedByCustomXml="prev"/>
+    <w:bookmarkStart w:id="2" w:name="_Toc40260289" w:displacedByCustomXml="prev"/>
     <w:p>
       <w:pPr>
-        <w:pStyle w:val="Title"/>
+        <w:pStyle w:val="Titre"/>
         <w:rPr>
           <w:rFonts w:eastAsiaTheme="minorHAnsi"/>
         </w:rPr>
@@ -4561,7 +4555,7 @@
     <w:bookmarkStart w:id="3" w:name="_Toc40260336"/>
     <w:p>
       <w:pPr>
-        <w:pStyle w:val="TOC1"/>
+        <w:pStyle w:val="TM1"/>
         <w:tabs>
           <w:tab w:val="left" w:pos="440"/>
           <w:tab w:val="right" w:leader="dot" w:pos="9062"/>
@@ -4604,7 +4598,7 @@
       <w:hyperlink w:anchor="_Toc72079929" w:history="1">
         <w:r>
           <w:rPr>
-            <w:rStyle w:val="Hyperlink"/>
+            <w:rStyle w:val="Lienhypertexte"/>
             <w:noProof/>
           </w:rPr>
           <w:t>1</w:t>
@@ -4624,7 +4618,7 @@
         </w:r>
         <w:r>
           <w:rPr>
-            <w:rStyle w:val="Hyperlink"/>
+            <w:rStyle w:val="Lienhypertexte"/>
             <w:noProof/>
           </w:rPr>
           <w:t>Information</w:t>
@@ -4681,7 +4675,7 @@
     </w:p>
     <w:p>
       <w:pPr>
-        <w:pStyle w:val="TOC2"/>
+        <w:pStyle w:val="TM2"/>
         <w:tabs>
           <w:tab w:val="left" w:pos="880"/>
           <w:tab w:val="right" w:leader="dot" w:pos="9062"/>
@@ -4698,7 +4692,7 @@
       <w:hyperlink w:anchor="_Toc72079930" w:history="1">
         <w:r>
           <w:rPr>
-            <w:rStyle w:val="Hyperlink"/>
+            <w:rStyle w:val="Lienhypertexte"/>
             <w:noProof/>
           </w:rPr>
           <w:t>1.1</w:t>
@@ -4716,7 +4710,7 @@
         </w:r>
         <w:r>
           <w:rPr>
-            <w:rStyle w:val="Hyperlink"/>
+            <w:rStyle w:val="Lienhypertexte"/>
             <w:noProof/>
           </w:rPr>
           <w:t>Objectifs du projet</w:t>
@@ -4773,7 +4767,7 @@
     </w:p>
     <w:p>
       <w:pPr>
-        <w:pStyle w:val="TOC2"/>
+        <w:pStyle w:val="TM2"/>
         <w:tabs>
           <w:tab w:val="left" w:pos="880"/>
           <w:tab w:val="right" w:leader="dot" w:pos="9062"/>
@@ -4790,7 +4784,7 @@
       <w:hyperlink w:anchor="_Toc72079931" w:history="1">
         <w:r>
           <w:rPr>
-            <w:rStyle w:val="Hyperlink"/>
+            <w:rStyle w:val="Lienhypertexte"/>
             <w:noProof/>
           </w:rPr>
           <w:t>1.2</w:t>
@@ -4808,7 +4802,7 @@
         </w:r>
         <w:r>
           <w:rPr>
-            <w:rStyle w:val="Hyperlink"/>
+            <w:rStyle w:val="Lienhypertexte"/>
             <w:noProof/>
           </w:rPr>
           <w:t>Schéma de principe de l'environnement</w:t>
@@ -4865,7 +4859,7 @@
     </w:p>
     <w:p>
       <w:pPr>
-        <w:pStyle w:val="TOC1"/>
+        <w:pStyle w:val="TM1"/>
         <w:tabs>
           <w:tab w:val="left" w:pos="440"/>
           <w:tab w:val="right" w:leader="dot" w:pos="9062"/>
@@ -4884,7 +4878,7 @@
       <w:hyperlink w:anchor="_Toc72079932" w:history="1">
         <w:r>
           <w:rPr>
-            <w:rStyle w:val="Hyperlink"/>
+            <w:rStyle w:val="Lienhypertexte"/>
             <w:noProof/>
           </w:rPr>
           <w:t>2</w:t>
@@ -4904,7 +4898,7 @@
         </w:r>
         <w:r>
           <w:rPr>
-            <w:rStyle w:val="Hyperlink"/>
+            <w:rStyle w:val="Lienhypertexte"/>
             <w:noProof/>
           </w:rPr>
           <w:t>Planification</w:t>
@@ -4961,7 +4955,7 @@
     </w:p>
     <w:p>
       <w:pPr>
-        <w:pStyle w:val="TOC2"/>
+        <w:pStyle w:val="TM2"/>
         <w:tabs>
           <w:tab w:val="left" w:pos="880"/>
           <w:tab w:val="right" w:leader="dot" w:pos="9062"/>
@@ -4978,7 +4972,7 @@
       <w:hyperlink w:anchor="_Toc72079933" w:history="1">
         <w:r>
           <w:rPr>
-            <w:rStyle w:val="Hyperlink"/>
+            <w:rStyle w:val="Lienhypertexte"/>
             <w:noProof/>
           </w:rPr>
           <w:t>2.1</w:t>
@@ -4996,7 +4990,7 @@
         </w:r>
         <w:r>
           <w:rPr>
-            <w:rStyle w:val="Hyperlink"/>
+            <w:rStyle w:val="Lienhypertexte"/>
             <w:noProof/>
           </w:rPr>
           <w:t>Calendrier prévisionnelle des tâches à réaliser</w:t>
@@ -5053,7 +5047,7 @@
     </w:p>
     <w:p>
       <w:pPr>
-        <w:pStyle w:val="TOC2"/>
+        <w:pStyle w:val="TM2"/>
         <w:tabs>
           <w:tab w:val="left" w:pos="880"/>
           <w:tab w:val="right" w:leader="dot" w:pos="9062"/>
@@ -5070,7 +5064,7 @@
       <w:hyperlink w:anchor="_Toc72079934" w:history="1">
         <w:r>
           <w:rPr>
-            <w:rStyle w:val="Hyperlink"/>
+            <w:rStyle w:val="Lienhypertexte"/>
             <w:noProof/>
           </w:rPr>
           <w:t>2.2</w:t>
@@ -5088,7 +5082,7 @@
         </w:r>
         <w:r>
           <w:rPr>
-            <w:rStyle w:val="Hyperlink"/>
+            <w:rStyle w:val="Lienhypertexte"/>
             <w:noProof/>
           </w:rPr>
           <w:t>Calendrier réel des tâches réalisées</w:t>
@@ -5145,7 +5139,7 @@
     </w:p>
     <w:p>
       <w:pPr>
-        <w:pStyle w:val="TOC1"/>
+        <w:pStyle w:val="TM1"/>
         <w:tabs>
           <w:tab w:val="left" w:pos="440"/>
           <w:tab w:val="right" w:leader="dot" w:pos="9062"/>
@@ -5164,7 +5158,7 @@
       <w:hyperlink w:anchor="_Toc72079935" w:history="1">
         <w:r>
           <w:rPr>
-            <w:rStyle w:val="Hyperlink"/>
+            <w:rStyle w:val="Lienhypertexte"/>
             <w:noProof/>
           </w:rPr>
           <w:t>3</w:t>
@@ -5184,7 +5178,7 @@
         </w:r>
         <w:r>
           <w:rPr>
-            <w:rStyle w:val="Hyperlink"/>
+            <w:rStyle w:val="Lienhypertexte"/>
             <w:noProof/>
           </w:rPr>
           <w:t>Décision</w:t>
@@ -5241,7 +5235,7 @@
     </w:p>
     <w:p>
       <w:pPr>
-        <w:pStyle w:val="TOC1"/>
+        <w:pStyle w:val="TM1"/>
         <w:tabs>
           <w:tab w:val="left" w:pos="440"/>
           <w:tab w:val="right" w:leader="dot" w:pos="9062"/>
@@ -5260,7 +5254,7 @@
       <w:hyperlink w:anchor="_Toc72079936" w:history="1">
         <w:r>
           <w:rPr>
-            <w:rStyle w:val="Hyperlink"/>
+            <w:rStyle w:val="Lienhypertexte"/>
             <w:noProof/>
           </w:rPr>
           <w:t>4</w:t>
@@ -5280,7 +5274,7 @@
         </w:r>
         <w:r>
           <w:rPr>
-            <w:rStyle w:val="Hyperlink"/>
+            <w:rStyle w:val="Lienhypertexte"/>
             <w:noProof/>
           </w:rPr>
           <w:t>Réalisation</w:t>
@@ -5337,7 +5331,7 @@
     </w:p>
     <w:p>
       <w:pPr>
-        <w:pStyle w:val="TOC2"/>
+        <w:pStyle w:val="TM2"/>
         <w:tabs>
           <w:tab w:val="left" w:pos="880"/>
           <w:tab w:val="right" w:leader="dot" w:pos="9062"/>
@@ -5354,7 +5348,7 @@
       <w:hyperlink w:anchor="_Toc72079937" w:history="1">
         <w:r>
           <w:rPr>
-            <w:rStyle w:val="Hyperlink"/>
+            <w:rStyle w:val="Lienhypertexte"/>
             <w:noProof/>
           </w:rPr>
           <w:t>4.1</w:t>
@@ -5372,7 +5366,7 @@
         </w:r>
         <w:r>
           <w:rPr>
-            <w:rStyle w:val="Hyperlink"/>
+            <w:rStyle w:val="Lienhypertexte"/>
             <w:noProof/>
           </w:rPr>
           <w:t>Schéma bloc de l'électronique à développer</w:t>
@@ -5429,7 +5423,7 @@
     </w:p>
     <w:p>
       <w:pPr>
-        <w:pStyle w:val="TOC2"/>
+        <w:pStyle w:val="TM2"/>
         <w:tabs>
           <w:tab w:val="left" w:pos="880"/>
           <w:tab w:val="right" w:leader="dot" w:pos="9062"/>
@@ -5446,7 +5440,7 @@
       <w:hyperlink w:anchor="_Toc72079938" w:history="1">
         <w:r>
           <w:rPr>
-            <w:rStyle w:val="Hyperlink"/>
+            <w:rStyle w:val="Lienhypertexte"/>
             <w:noProof/>
           </w:rPr>
           <w:t>4.2</w:t>
@@ -5464,7 +5458,7 @@
         </w:r>
         <w:r>
           <w:rPr>
-            <w:rStyle w:val="Hyperlink"/>
+            <w:rStyle w:val="Lienhypertexte"/>
             <w:noProof/>
           </w:rPr>
           <w:t>Description des éléments principaux</w:t>
@@ -5521,7 +5515,7 @@
     </w:p>
     <w:p>
       <w:pPr>
-        <w:pStyle w:val="TOC2"/>
+        <w:pStyle w:val="TM2"/>
         <w:tabs>
           <w:tab w:val="left" w:pos="880"/>
           <w:tab w:val="right" w:leader="dot" w:pos="9062"/>
@@ -5538,7 +5532,7 @@
       <w:hyperlink w:anchor="_Toc72079939" w:history="1">
         <w:r>
           <w:rPr>
-            <w:rStyle w:val="Hyperlink"/>
+            <w:rStyle w:val="Lienhypertexte"/>
             <w:noProof/>
           </w:rPr>
           <w:t>4.3</w:t>
@@ -5556,7 +5550,7 @@
         </w:r>
         <w:r>
           <w:rPr>
-            <w:rStyle w:val="Hyperlink"/>
+            <w:rStyle w:val="Lienhypertexte"/>
             <w:noProof/>
           </w:rPr>
           <w:t>Schématique, Dimensionnement &amp; simulation</w:t>
@@ -5613,7 +5607,7 @@
     </w:p>
     <w:p>
       <w:pPr>
-        <w:pStyle w:val="TOC2"/>
+        <w:pStyle w:val="TM2"/>
         <w:tabs>
           <w:tab w:val="left" w:pos="880"/>
           <w:tab w:val="right" w:leader="dot" w:pos="9062"/>
@@ -5630,7 +5624,7 @@
       <w:hyperlink w:anchor="_Toc72079940" w:history="1">
         <w:r>
           <w:rPr>
-            <w:rStyle w:val="Hyperlink"/>
+            <w:rStyle w:val="Lienhypertexte"/>
             <w:noProof/>
           </w:rPr>
           <w:t>4.4</w:t>
@@ -5648,7 +5642,7 @@
         </w:r>
         <w:r>
           <w:rPr>
-            <w:rStyle w:val="Hyperlink"/>
+            <w:rStyle w:val="Lienhypertexte"/>
             <w:noProof/>
           </w:rPr>
           <w:t>Rédaction du protocole de mise en service du prototype</w:t>
@@ -5705,7 +5699,7 @@
     </w:p>
     <w:p>
       <w:pPr>
-        <w:pStyle w:val="TOC2"/>
+        <w:pStyle w:val="TM2"/>
         <w:tabs>
           <w:tab w:val="left" w:pos="880"/>
           <w:tab w:val="right" w:leader="dot" w:pos="9062"/>
@@ -5722,7 +5716,7 @@
       <w:hyperlink w:anchor="_Toc72079941" w:history="1">
         <w:r>
           <w:rPr>
-            <w:rStyle w:val="Hyperlink"/>
+            <w:rStyle w:val="Lienhypertexte"/>
             <w:noProof/>
           </w:rPr>
           <w:t>4.5</w:t>
@@ -5740,7 +5734,7 @@
         </w:r>
         <w:r>
           <w:rPr>
-            <w:rStyle w:val="Hyperlink"/>
+            <w:rStyle w:val="Lienhypertexte"/>
             <w:noProof/>
           </w:rPr>
           <w:t>Liste de matériel</w:t>
@@ -5797,7 +5791,7 @@
     </w:p>
     <w:p>
       <w:pPr>
-        <w:pStyle w:val="TOC2"/>
+        <w:pStyle w:val="TM2"/>
         <w:tabs>
           <w:tab w:val="left" w:pos="880"/>
           <w:tab w:val="right" w:leader="dot" w:pos="9062"/>
@@ -5814,7 +5808,7 @@
       <w:hyperlink w:anchor="_Toc72079942" w:history="1">
         <w:r>
           <w:rPr>
-            <w:rStyle w:val="Hyperlink"/>
+            <w:rStyle w:val="Lienhypertexte"/>
             <w:noProof/>
           </w:rPr>
           <w:t>4.6</w:t>
@@ -5832,7 +5826,7 @@
         </w:r>
         <w:r>
           <w:rPr>
-            <w:rStyle w:val="Hyperlink"/>
+            <w:rStyle w:val="Lienhypertexte"/>
             <w:noProof/>
           </w:rPr>
           <w:t>Layout</w:t>
@@ -5889,7 +5883,7 @@
     </w:p>
     <w:p>
       <w:pPr>
-        <w:pStyle w:val="TOC2"/>
+        <w:pStyle w:val="TM2"/>
         <w:tabs>
           <w:tab w:val="left" w:pos="880"/>
           <w:tab w:val="right" w:leader="dot" w:pos="9062"/>
@@ -5906,7 +5900,7 @@
       <w:hyperlink w:anchor="_Toc72079943" w:history="1">
         <w:r>
           <w:rPr>
-            <w:rStyle w:val="Hyperlink"/>
+            <w:rStyle w:val="Lienhypertexte"/>
             <w:noProof/>
           </w:rPr>
           <w:t>4.7</w:t>
@@ -5924,7 +5918,7 @@
         </w:r>
         <w:r>
           <w:rPr>
-            <w:rStyle w:val="Hyperlink"/>
+            <w:rStyle w:val="Lienhypertexte"/>
             <w:noProof/>
           </w:rPr>
           <w:t>Firmware</w:t>
@@ -5981,7 +5975,7 @@
     </w:p>
     <w:p>
       <w:pPr>
-        <w:pStyle w:val="TOC2"/>
+        <w:pStyle w:val="TM2"/>
         <w:tabs>
           <w:tab w:val="left" w:pos="880"/>
           <w:tab w:val="right" w:leader="dot" w:pos="9062"/>
@@ -5998,7 +5992,7 @@
       <w:hyperlink w:anchor="_Toc72079944" w:history="1">
         <w:r>
           <w:rPr>
-            <w:rStyle w:val="Hyperlink"/>
+            <w:rStyle w:val="Lienhypertexte"/>
             <w:noProof/>
           </w:rPr>
           <w:t>4.8</w:t>
@@ -6016,7 +6010,7 @@
         </w:r>
         <w:r>
           <w:rPr>
-            <w:rStyle w:val="Hyperlink"/>
+            <w:rStyle w:val="Lienhypertexte"/>
             <w:noProof/>
           </w:rPr>
           <w:t>Software</w:t>
@@ -6073,7 +6067,7 @@
     </w:p>
     <w:p>
       <w:pPr>
-        <w:pStyle w:val="TOC2"/>
+        <w:pStyle w:val="TM2"/>
         <w:tabs>
           <w:tab w:val="left" w:pos="880"/>
           <w:tab w:val="right" w:leader="dot" w:pos="9062"/>
@@ -6090,7 +6084,7 @@
       <w:hyperlink w:anchor="_Toc72079945" w:history="1">
         <w:r>
           <w:rPr>
-            <w:rStyle w:val="Hyperlink"/>
+            <w:rStyle w:val="Lienhypertexte"/>
             <w:noProof/>
           </w:rPr>
           <w:t>4.9</w:t>
@@ -6108,7 +6102,7 @@
         </w:r>
         <w:r>
           <w:rPr>
-            <w:rStyle w:val="Hyperlink"/>
+            <w:rStyle w:val="Lienhypertexte"/>
             <w:noProof/>
           </w:rPr>
           <w:t>Phase de production en série</w:t>
@@ -6165,7 +6159,7 @@
     </w:p>
     <w:p>
       <w:pPr>
-        <w:pStyle w:val="TOC2"/>
+        <w:pStyle w:val="TM2"/>
         <w:tabs>
           <w:tab w:val="left" w:pos="880"/>
           <w:tab w:val="right" w:leader="dot" w:pos="9062"/>
@@ -6182,7 +6176,7 @@
       <w:hyperlink w:anchor="_Toc72079946" w:history="1">
         <w:r>
           <w:rPr>
-            <w:rStyle w:val="Hyperlink"/>
+            <w:rStyle w:val="Lienhypertexte"/>
             <w:noProof/>
           </w:rPr>
           <w:t>4.10</w:t>
@@ -6200,7 +6194,7 @@
         </w:r>
         <w:r>
           <w:rPr>
-            <w:rStyle w:val="Hyperlink"/>
+            <w:rStyle w:val="Lienhypertexte"/>
             <w:noProof/>
           </w:rPr>
           <w:t>Liste des outils utilisés et leur version</w:t>
@@ -6257,7 +6251,7 @@
     </w:p>
     <w:p>
       <w:pPr>
-        <w:pStyle w:val="TOC1"/>
+        <w:pStyle w:val="TM1"/>
         <w:tabs>
           <w:tab w:val="left" w:pos="440"/>
           <w:tab w:val="right" w:leader="dot" w:pos="9062"/>
@@ -6276,7 +6270,7 @@
       <w:hyperlink w:anchor="_Toc72079947" w:history="1">
         <w:r>
           <w:rPr>
-            <w:rStyle w:val="Hyperlink"/>
+            <w:rStyle w:val="Lienhypertexte"/>
             <w:noProof/>
           </w:rPr>
           <w:t>5</w:t>
@@ -6296,7 +6290,7 @@
         </w:r>
         <w:r>
           <w:rPr>
-            <w:rStyle w:val="Hyperlink"/>
+            <w:rStyle w:val="Lienhypertexte"/>
             <w:noProof/>
           </w:rPr>
           <w:t>Contrôle</w:t>
@@ -6353,7 +6347,7 @@
     </w:p>
     <w:p>
       <w:pPr>
-        <w:pStyle w:val="TOC2"/>
+        <w:pStyle w:val="TM2"/>
         <w:tabs>
           <w:tab w:val="left" w:pos="880"/>
           <w:tab w:val="right" w:leader="dot" w:pos="9062"/>
@@ -6370,7 +6364,7 @@
       <w:hyperlink w:anchor="_Toc72079948" w:history="1">
         <w:r>
           <w:rPr>
-            <w:rStyle w:val="Hyperlink"/>
+            <w:rStyle w:val="Lienhypertexte"/>
             <w:noProof/>
           </w:rPr>
           <w:t>5.1</w:t>
@@ -6388,7 +6382,7 @@
         </w:r>
         <w:r>
           <w:rPr>
-            <w:rStyle w:val="Hyperlink"/>
+            <w:rStyle w:val="Lienhypertexte"/>
             <w:noProof/>
           </w:rPr>
           <w:t>Validation ERC</w:t>
@@ -6445,7 +6439,7 @@
     </w:p>
     <w:p>
       <w:pPr>
-        <w:pStyle w:val="TOC2"/>
+        <w:pStyle w:val="TM2"/>
         <w:tabs>
           <w:tab w:val="left" w:pos="880"/>
           <w:tab w:val="right" w:leader="dot" w:pos="9062"/>
@@ -6462,7 +6456,7 @@
       <w:hyperlink w:anchor="_Toc72079949" w:history="1">
         <w:r>
           <w:rPr>
-            <w:rStyle w:val="Hyperlink"/>
+            <w:rStyle w:val="Lienhypertexte"/>
             <w:noProof/>
           </w:rPr>
           <w:t>5.2</w:t>
@@ -6480,7 +6474,7 @@
         </w:r>
         <w:r>
           <w:rPr>
-            <w:rStyle w:val="Hyperlink"/>
+            <w:rStyle w:val="Lienhypertexte"/>
             <w:noProof/>
           </w:rPr>
           <w:t>Validation DRC</w:t>
@@ -6537,7 +6531,7 @@
     </w:p>
     <w:p>
       <w:pPr>
-        <w:pStyle w:val="TOC2"/>
+        <w:pStyle w:val="TM2"/>
         <w:tabs>
           <w:tab w:val="left" w:pos="880"/>
           <w:tab w:val="right" w:leader="dot" w:pos="9062"/>
@@ -6554,7 +6548,7 @@
       <w:hyperlink w:anchor="_Toc72079950" w:history="1">
         <w:r>
           <w:rPr>
-            <w:rStyle w:val="Hyperlink"/>
+            <w:rStyle w:val="Lienhypertexte"/>
             <w:noProof/>
           </w:rPr>
           <w:t>5.3</w:t>
@@ -6572,7 +6566,7 @@
         </w:r>
         <w:r>
           <w:rPr>
-            <w:rStyle w:val="Hyperlink"/>
+            <w:rStyle w:val="Lienhypertexte"/>
             <w:noProof/>
           </w:rPr>
           <w:t>Validation Eurocircuits</w:t>
@@ -6629,7 +6623,7 @@
     </w:p>
     <w:p>
       <w:pPr>
-        <w:pStyle w:val="TOC2"/>
+        <w:pStyle w:val="TM2"/>
         <w:tabs>
           <w:tab w:val="left" w:pos="880"/>
           <w:tab w:val="right" w:leader="dot" w:pos="9062"/>
@@ -6646,7 +6640,7 @@
       <w:hyperlink w:anchor="_Toc72079951" w:history="1">
         <w:r>
           <w:rPr>
-            <w:rStyle w:val="Hyperlink"/>
+            <w:rStyle w:val="Lienhypertexte"/>
             <w:noProof/>
           </w:rPr>
           <w:t>5.4</w:t>
@@ -6664,7 +6658,7 @@
         </w:r>
         <w:r>
           <w:rPr>
-            <w:rStyle w:val="Hyperlink"/>
+            <w:rStyle w:val="Lienhypertexte"/>
             <w:noProof/>
           </w:rPr>
           <w:t>Validation par la mise en service du prototype</w:t>
@@ -6721,7 +6715,7 @@
     </w:p>
     <w:p>
       <w:pPr>
-        <w:pStyle w:val="TOC1"/>
+        <w:pStyle w:val="TM1"/>
         <w:tabs>
           <w:tab w:val="left" w:pos="440"/>
           <w:tab w:val="right" w:leader="dot" w:pos="9062"/>
@@ -6740,7 +6734,7 @@
       <w:hyperlink w:anchor="_Toc72079952" w:history="1">
         <w:r>
           <w:rPr>
-            <w:rStyle w:val="Hyperlink"/>
+            <w:rStyle w:val="Lienhypertexte"/>
             <w:noProof/>
           </w:rPr>
           <w:t>6</w:t>
@@ -6760,7 +6754,7 @@
         </w:r>
         <w:r>
           <w:rPr>
-            <w:rStyle w:val="Hyperlink"/>
+            <w:rStyle w:val="Lienhypertexte"/>
             <w:noProof/>
           </w:rPr>
           <w:t>Evaluation</w:t>
@@ -6817,7 +6811,7 @@
     </w:p>
     <w:p>
       <w:pPr>
-        <w:pStyle w:val="TOC2"/>
+        <w:pStyle w:val="TM2"/>
         <w:tabs>
           <w:tab w:val="left" w:pos="880"/>
           <w:tab w:val="right" w:leader="dot" w:pos="9062"/>
@@ -6834,7 +6828,7 @@
       <w:hyperlink w:anchor="_Toc72079953" w:history="1">
         <w:r>
           <w:rPr>
-            <w:rStyle w:val="Hyperlink"/>
+            <w:rStyle w:val="Lienhypertexte"/>
             <w:noProof/>
           </w:rPr>
           <w:t>6.1</w:t>
@@ -6852,7 +6846,7 @@
         </w:r>
         <w:r>
           <w:rPr>
-            <w:rStyle w:val="Hyperlink"/>
+            <w:rStyle w:val="Lienhypertexte"/>
             <w:noProof/>
           </w:rPr>
           <w:t>Etat du projet</w:t>
@@ -6909,7 +6903,7 @@
     </w:p>
     <w:p>
       <w:pPr>
-        <w:pStyle w:val="TOC2"/>
+        <w:pStyle w:val="TM2"/>
         <w:tabs>
           <w:tab w:val="left" w:pos="880"/>
           <w:tab w:val="right" w:leader="dot" w:pos="9062"/>
@@ -6926,7 +6920,7 @@
       <w:hyperlink w:anchor="_Toc72079954" w:history="1">
         <w:r>
           <w:rPr>
-            <w:rStyle w:val="Hyperlink"/>
+            <w:rStyle w:val="Lienhypertexte"/>
             <w:noProof/>
           </w:rPr>
           <w:t>6.2</w:t>
@@ -6944,7 +6938,7 @@
         </w:r>
         <w:r>
           <w:rPr>
-            <w:rStyle w:val="Hyperlink"/>
+            <w:rStyle w:val="Lienhypertexte"/>
             <w:noProof/>
           </w:rPr>
           <w:t>Liste des modifications pour la prochaine version</w:t>
@@ -7001,7 +6995,7 @@
     </w:p>
     <w:p>
       <w:pPr>
-        <w:pStyle w:val="TOC2"/>
+        <w:pStyle w:val="TM2"/>
         <w:tabs>
           <w:tab w:val="left" w:pos="880"/>
           <w:tab w:val="right" w:leader="dot" w:pos="9062"/>
@@ -7018,7 +7012,7 @@
       <w:hyperlink w:anchor="_Toc72079955" w:history="1">
         <w:r>
           <w:rPr>
-            <w:rStyle w:val="Hyperlink"/>
+            <w:rStyle w:val="Lienhypertexte"/>
             <w:noProof/>
           </w:rPr>
           <w:t>6.3</w:t>
@@ -7036,7 +7030,7 @@
         </w:r>
         <w:r>
           <w:rPr>
-            <w:rStyle w:val="Hyperlink"/>
+            <w:rStyle w:val="Lienhypertexte"/>
             <w:noProof/>
           </w:rPr>
           <w:t>Liste des délivrables</w:t>
@@ -7093,7 +7087,7 @@
     </w:p>
     <w:p>
       <w:pPr>
-        <w:pStyle w:val="TOC2"/>
+        <w:pStyle w:val="TM2"/>
         <w:tabs>
           <w:tab w:val="left" w:pos="880"/>
           <w:tab w:val="right" w:leader="dot" w:pos="9062"/>
@@ -7110,7 +7104,7 @@
       <w:hyperlink w:anchor="_Toc72079956" w:history="1">
         <w:r>
           <w:rPr>
-            <w:rStyle w:val="Hyperlink"/>
+            <w:rStyle w:val="Lienhypertexte"/>
             <w:noProof/>
           </w:rPr>
           <w:t>6.4</w:t>
@@ -7128,7 +7122,7 @@
         </w:r>
         <w:r>
           <w:rPr>
-            <w:rStyle w:val="Hyperlink"/>
+            <w:rStyle w:val="Lienhypertexte"/>
             <w:noProof/>
           </w:rPr>
           <w:t>Amélioration possible</w:t>
@@ -7185,7 +7179,7 @@
     </w:p>
     <w:p>
       <w:pPr>
-        <w:pStyle w:val="TOC2"/>
+        <w:pStyle w:val="TM2"/>
         <w:tabs>
           <w:tab w:val="left" w:pos="880"/>
           <w:tab w:val="right" w:leader="dot" w:pos="9062"/>
@@ -7202,7 +7196,7 @@
       <w:hyperlink w:anchor="_Toc72079957" w:history="1">
         <w:r>
           <w:rPr>
-            <w:rStyle w:val="Hyperlink"/>
+            <w:rStyle w:val="Lienhypertexte"/>
             <w:noProof/>
           </w:rPr>
           <w:t>6.5</w:t>
@@ -7220,7 +7214,7 @@
         </w:r>
         <w:r>
           <w:rPr>
-            <w:rStyle w:val="Hyperlink"/>
+            <w:rStyle w:val="Lienhypertexte"/>
             <w:noProof/>
           </w:rPr>
           <w:t>Conclusion et avis personnel</w:t>
@@ -7303,22 +7297,22 @@
     </w:p>
     <w:p>
       <w:pPr>
-        <w:pStyle w:val="Heading1"/>
+        <w:pStyle w:val="Titre1"/>
       </w:pPr>
       <w:bookmarkStart w:id="4" w:name="_Toc72079929"/>
       <w:r>
         <w:lastRenderedPageBreak/>
         <w:t>Information</w:t>
       </w:r>
-      <w:bookmarkEnd w:id="3"/>
-      <w:bookmarkEnd w:id="4"/>
       <w:bookmarkEnd w:id="2"/>
       <w:bookmarkEnd w:id="1"/>
       <w:bookmarkEnd w:id="0"/>
+      <w:bookmarkEnd w:id="3"/>
+      <w:bookmarkEnd w:id="4"/>
     </w:p>
     <w:p>
       <w:pPr>
-        <w:pStyle w:val="Heading2"/>
+        <w:pStyle w:val="Titre2"/>
       </w:pPr>
       <w:bookmarkStart w:id="5" w:name="_Toc72079930"/>
       <w:bookmarkStart w:id="6" w:name="_Toc40259939"/>
@@ -7369,7 +7363,7 @@
     </w:p>
     <w:p>
       <w:pPr>
-        <w:pStyle w:val="Heading3"/>
+        <w:pStyle w:val="Titre3"/>
       </w:pPr>
       <w:r>
         <w:t>Résumé du cahier des charges</w:t>
@@ -7381,7 +7375,7 @@
     </w:p>
     <w:p>
       <w:pPr>
-        <w:pStyle w:val="NoSpacing"/>
+        <w:pStyle w:val="Sansinterligne"/>
       </w:pPr>
       <w:bookmarkStart w:id="10" w:name="_Toc40259952"/>
       <w:bookmarkStart w:id="11" w:name="_Toc40260219"/>
@@ -7392,16 +7386,11 @@
         <w:t xml:space="preserve">Je dois créer le prototype du jeu du moulin sur PCB en continuant </w:t>
       </w:r>
       <w:r>
-        <w:t xml:space="preserve">et finissant le travail commencer par M. Samuel </w:t>
-      </w:r>
-      <w:proofErr w:type="spellStart"/>
-      <w:r>
-        <w:t>Egl</w:t>
+        <w:t>et finissant le travail commencer par M. Samuel Egl</w:t>
       </w:r>
       <w:r>
         <w:t>i</w:t>
       </w:r>
-      <w:proofErr w:type="spellEnd"/>
       <w:r>
         <w:t xml:space="preserve"> et créer un code pour démontrer le fonctionnement du prototype</w:t>
       </w:r>
@@ -7452,7 +7441,7 @@
     </w:p>
     <w:p>
       <w:pPr>
-        <w:pStyle w:val="NoSpacing"/>
+        <w:pStyle w:val="Sansinterligne"/>
         <w:rPr>
           <w:rFonts w:ascii="Helvetica" w:hAnsi="Helvetica" w:cs="Helvetica"/>
           <w:bCs/>
@@ -7547,7 +7536,7 @@
     </w:p>
     <w:p>
       <w:pPr>
-        <w:pStyle w:val="NoSpacing"/>
+        <w:pStyle w:val="Sansinterligne"/>
         <w:rPr>
           <w:rFonts w:ascii="Helvetica" w:hAnsi="Helvetica" w:cs="Helvetica"/>
           <w:bCs/>
@@ -7685,7 +7674,7 @@
     </w:p>
     <w:p>
       <w:pPr>
-        <w:pStyle w:val="NoSpacing"/>
+        <w:pStyle w:val="Sansinterligne"/>
         <w:rPr>
           <w:rFonts w:ascii="Helvetica" w:hAnsi="Helvetica" w:cs="Helvetica"/>
           <w:bCs/>
@@ -7727,7 +7716,7 @@
     </w:p>
     <w:p>
       <w:pPr>
-        <w:pStyle w:val="NoSpacing"/>
+        <w:pStyle w:val="Sansinterligne"/>
         <w:rPr>
           <w:rFonts w:ascii="Helvetica" w:hAnsi="Helvetica" w:cs="Helvetica"/>
           <w:bCs/>
@@ -7779,7 +7768,7 @@
     </w:p>
     <w:p>
       <w:pPr>
-        <w:pStyle w:val="NoSpacing"/>
+        <w:pStyle w:val="Sansinterligne"/>
         <w:rPr>
           <w:rFonts w:ascii="Helvetica" w:hAnsi="Helvetica" w:cs="Helvetica"/>
           <w:bCs/>
@@ -7893,7 +7882,7 @@
     </w:p>
     <w:p>
       <w:pPr>
-        <w:pStyle w:val="Heading2"/>
+        <w:pStyle w:val="Titre2"/>
       </w:pPr>
       <w:r>
         <w:t xml:space="preserve">Schéma </w:t>
@@ -7912,7 +7901,7 @@
     </w:p>
     <w:p>
       <w:pPr>
-        <w:pStyle w:val="Heading3"/>
+        <w:pStyle w:val="Titre3"/>
       </w:pPr>
       <w:r>
         <w:t>Description des blocs principaux</w:t>
@@ -7960,7 +7949,7 @@
           <v:shape id="_x0000_i1025" type="#_x0000_t75" style="width:281.45pt;height:193.6pt" o:ole="">
             <v:imagedata r:id="rId11" o:title=""/>
           </v:shape>
-          <o:OLEObject Type="Embed" ProgID="Visio.Drawing.15" ShapeID="_x0000_i1025" DrawAspect="Content" ObjectID="_1808754109" r:id="rId12"/>
+          <o:OLEObject Type="Embed" ProgID="Visio.Drawing.15" ShapeID="_x0000_i1025" DrawAspect="Content" ObjectID="_1809264722" r:id="rId12"/>
         </w:object>
       </w:r>
     </w:p>
@@ -8120,7 +8109,7 @@
     </w:p>
     <w:p>
       <w:pPr>
-        <w:pStyle w:val="Heading1"/>
+        <w:pStyle w:val="Titre1"/>
       </w:pPr>
       <w:bookmarkStart w:id="15" w:name="_Toc40259940"/>
       <w:bookmarkStart w:id="16" w:name="_Toc40260207"/>
@@ -8139,7 +8128,7 @@
     </w:p>
     <w:p>
       <w:pPr>
-        <w:pStyle w:val="Heading2"/>
+        <w:pStyle w:val="Titre2"/>
       </w:pPr>
       <w:bookmarkStart w:id="20" w:name="_Toc40259941"/>
       <w:bookmarkStart w:id="21" w:name="_Toc40260208"/>
@@ -8217,7 +8206,7 @@
     </w:p>
     <w:p>
       <w:pPr>
-        <w:pStyle w:val="Heading2"/>
+        <w:pStyle w:val="Titre2"/>
       </w:pPr>
       <w:bookmarkStart w:id="25" w:name="_Toc40259942"/>
       <w:bookmarkStart w:id="26" w:name="_Toc40260209"/>
@@ -8253,7 +8242,7 @@
     </w:p>
     <w:p>
       <w:pPr>
-        <w:pStyle w:val="Heading1"/>
+        <w:pStyle w:val="Titre1"/>
       </w:pPr>
       <w:bookmarkStart w:id="30" w:name="_Toc40259943"/>
       <w:bookmarkStart w:id="31" w:name="_Toc40260210"/>
@@ -8272,7 +8261,7 @@
     </w:p>
     <w:tbl>
       <w:tblPr>
-        <w:tblStyle w:val="TableGrid"/>
+        <w:tblStyle w:val="Grilledutableau"/>
         <w:tblpPr w:leftFromText="141" w:rightFromText="141" w:vertAnchor="text" w:horzAnchor="margin" w:tblpY="42"/>
         <w:tblW w:w="0" w:type="auto"/>
         <w:tblLook w:val="04A0" w:firstRow="1" w:lastRow="0" w:firstColumn="1" w:lastColumn="0" w:noHBand="0" w:noVBand="1"/>
@@ -8342,15 +8331,7 @@
           </w:tcPr>
           <w:p>
             <w:r>
-              <w:t xml:space="preserve">Bourquenoud Alexandre, </w:t>
-            </w:r>
-            <w:proofErr w:type="spellStart"/>
-            <w:r>
-              <w:t>Egli</w:t>
-            </w:r>
-            <w:proofErr w:type="spellEnd"/>
-            <w:r>
-              <w:t xml:space="preserve"> Samuel, Cunha Fabio</w:t>
+              <w:t>Bourquenoud Alexandre, Egli Samuel, Cunha Fabio</w:t>
             </w:r>
           </w:p>
         </w:tc>
@@ -8455,7 +8436,7 @@
     </w:p>
     <w:p>
       <w:pPr>
-        <w:pStyle w:val="Heading1"/>
+        <w:pStyle w:val="Titre1"/>
       </w:pPr>
       <w:bookmarkStart w:id="35" w:name="_Toc40259951"/>
       <w:bookmarkStart w:id="36" w:name="_Toc40260218"/>
@@ -8474,7 +8455,7 @@
     </w:p>
     <w:p>
       <w:pPr>
-        <w:pStyle w:val="Heading2"/>
+        <w:pStyle w:val="Titre2"/>
       </w:pPr>
       <w:bookmarkStart w:id="40" w:name="_Toc72079937"/>
       <w:r>
@@ -8499,11 +8480,17 @@
           <v:shape id="_x0000_i1026" type="#_x0000_t75" style="width:281.45pt;height:193.6pt" o:ole="">
             <v:imagedata r:id="rId11" o:title=""/>
           </v:shape>
-          <o:OLEObject Type="Embed" ProgID="Visio.Drawing.15" ShapeID="_x0000_i1026" DrawAspect="Content" ObjectID="_1808754110" r:id="rId14"/>
+          <o:OLEObject Type="Embed" ProgID="Visio.Drawing.15" ShapeID="_x0000_i1026" DrawAspect="Content" ObjectID="_1809264723" r:id="rId14"/>
         </w:object>
       </w:r>
     </w:p>
     <w:p>
+      <w:pPr>
+        <w:rPr>
+          <w:i/>
+          <w:iCs/>
+        </w:rPr>
+      </w:pPr>
       <w:r>
         <w:rPr>
           <w:i/>
@@ -8513,18 +8500,27 @@
       </w:r>
     </w:p>
     <w:p>
-      <w:pPr>
-        <w:pStyle w:val="Heading2"/>
+      <w:r>
+        <w:t>Je n’ai pas eu besoin de faire de changements au schéma bloque fourni</w:t>
+      </w:r>
+      <w:r>
+        <w:t xml:space="preserve"> car les éléments nécessaire y étaient déjà.</w:t>
+      </w:r>
+    </w:p>
+    <w:p>
+      <w:pPr>
+        <w:pStyle w:val="Titre2"/>
       </w:pPr>
       <w:bookmarkStart w:id="41" w:name="_Toc72079938"/>
       <w:r>
+        <w:lastRenderedPageBreak/>
         <w:t>Description des éléments principaux</w:t>
       </w:r>
       <w:bookmarkEnd w:id="41"/>
     </w:p>
     <w:p>
       <w:pPr>
-        <w:pStyle w:val="Heading3"/>
+        <w:pStyle w:val="Titre3"/>
       </w:pPr>
       <w:r>
         <w:t>Généralité sur le</w:t>
@@ -8600,7 +8596,6 @@
     </w:p>
     <w:p>
       <w:r>
-        <w:lastRenderedPageBreak/>
         <w:t>Pour détecter si la touche est pressée ou non on utilise un autre condensateur de valeur connue (Cs, Condensateur de sampling, ou échantillonnage en français).</w:t>
       </w:r>
     </w:p>
@@ -8610,7 +8605,7 @@
           <w:noProof/>
         </w:rPr>
         <w:drawing>
-          <wp:anchor distT="0" distB="0" distL="114300" distR="114300" simplePos="0" relativeHeight="251671040" behindDoc="0" locked="0" layoutInCell="1" allowOverlap="1" wp14:anchorId="537C37F9" wp14:editId="13B70C71">
+          <wp:anchor distT="0" distB="0" distL="114300" distR="114300" simplePos="0" relativeHeight="251671040" behindDoc="0" locked="0" layoutInCell="1" allowOverlap="1" wp14:anchorId="537C37F9" wp14:editId="39434534">
             <wp:simplePos x="0" y="0"/>
             <wp:positionH relativeFrom="column">
               <wp:posOffset>1187450</wp:posOffset>
@@ -8738,6 +8733,7 @@
     </w:p>
     <w:p>
       <w:r>
+        <w:lastRenderedPageBreak/>
         <w:t>Avec cette formule, on peut voir la relation entre l</w:t>
       </w:r>
       <w:r>
@@ -8746,21 +8742,75 @@
     </w:p>
     <w:p>
       <w:r>
-        <w:t xml:space="preserve">Quand on </w:t>
-      </w:r>
-      <w:r>
-        <w:t xml:space="preserve">referme le circuit et qu’on lie les deux capacités, </w:t>
-      </w:r>
-      <w:r>
-        <w:t xml:space="preserve">on a un schéma qui ressemblerait </w:t>
+        <w:t xml:space="preserve">On a donc </w:t>
+      </w:r>
+      <w:r>
+        <w:t>un schéma équivalent qui ressemble à peu près à ça :</w:t>
+      </w:r>
+    </w:p>
+    <w:p>
+      <w:r>
+        <w:drawing>
+          <wp:inline distT="0" distB="0" distL="0" distR="0" wp14:anchorId="04CF80E7" wp14:editId="07770D96">
+            <wp:extent cx="2667911" cy="5215890"/>
+            <wp:effectExtent l="2223" t="0" r="1587" b="1588"/>
+            <wp:docPr id="1983265472" name="Image 2" descr="Une image contenant texte, croquis, dessin, Dessin d’enfant&#10;&#10;Le contenu généré par l’IA peut être incorrect."/>
+            <wp:cNvGraphicFramePr>
+              <a:graphicFrameLocks xmlns:a="http://schemas.openxmlformats.org/drawingml/2006/main" noChangeAspect="1"/>
+            </wp:cNvGraphicFramePr>
+            <a:graphic xmlns:a="http://schemas.openxmlformats.org/drawingml/2006/main">
+              <a:graphicData uri="http://schemas.openxmlformats.org/drawingml/2006/picture">
+                <pic:pic xmlns:pic="http://schemas.openxmlformats.org/drawingml/2006/picture">
+                  <pic:nvPicPr>
+                    <pic:cNvPr id="1983265472" name="Image 2" descr="Une image contenant texte, croquis, dessin, Dessin d’enfant&#10;&#10;Le contenu généré par l’IA peut être incorrect."/>
+                    <pic:cNvPicPr>
+                      <a:picLocks noChangeAspect="1" noChangeArrowheads="1"/>
+                    </pic:cNvPicPr>
+                  </pic:nvPicPr>
+                  <pic:blipFill>
+                    <a:blip r:embed="rId17" cstate="print">
+                      <a:extLst>
+                        <a:ext uri="{28A0092B-C50C-407E-A947-70E740481C1C}">
+                          <a14:useLocalDpi xmlns:a14="http://schemas.microsoft.com/office/drawing/2010/main" val="0"/>
+                        </a:ext>
+                      </a:extLst>
+                    </a:blip>
+                    <a:srcRect/>
+                    <a:stretch>
+                      <a:fillRect/>
+                    </a:stretch>
+                  </pic:blipFill>
+                  <pic:spPr bwMode="auto">
+                    <a:xfrm rot="16200000">
+                      <a:off x="0" y="0"/>
+                      <a:ext cx="2670506" cy="5220964"/>
+                    </a:xfrm>
+                    <a:prstGeom prst="rect">
+                      <a:avLst/>
+                    </a:prstGeom>
+                    <a:noFill/>
+                    <a:ln>
+                      <a:noFill/>
+                    </a:ln>
+                  </pic:spPr>
+                </pic:pic>
+              </a:graphicData>
+            </a:graphic>
+          </wp:inline>
+        </w:drawing>
+      </w:r>
+    </w:p>
+    <w:p>
+      <w:r>
+        <w:t xml:space="preserve">Ch1 et Ch2 sont les 2 anneaux présent sur l’empreinte du  PCB, </w:t>
       </w:r>
       <w:proofErr w:type="spellStart"/>
       <w:r>
-        <w:t>a</w:t>
+        <w:t>Cpar</w:t>
       </w:r>
       <w:proofErr w:type="spellEnd"/>
       <w:r>
-        <w:t xml:space="preserve"> celui-ci :</w:t>
+        <w:t xml:space="preserve"> est la Capacité parasite et Cs est le condensateur de sampling.</w:t>
       </w:r>
     </w:p>
     <w:p/>
@@ -8786,7 +8836,13 @@
         <w:t xml:space="preserve"> change en fonction de la capacité</w:t>
       </w:r>
       <w:r>
-        <w:t xml:space="preserve"> de la touche qui elle-même change en fonction de si la touche est pressé et aussi de qu’est ce qui presse </w:t>
+        <w:t xml:space="preserve"> de la touche qui elle-même change en fonction de si la touche est </w:t>
+      </w:r>
+      <w:r>
+        <w:t>pressée</w:t>
+      </w:r>
+      <w:r>
+        <w:t xml:space="preserve"> et aussi de qu’est ce qui presse </w:t>
       </w:r>
       <w:r>
         <w:t>sur la touche à cause de la … différente des matériaux.</w:t>
@@ -8800,7 +8856,7 @@
     <w:p/>
     <w:p>
       <w:pPr>
-        <w:pStyle w:val="Heading3"/>
+        <w:pStyle w:val="Titre3"/>
       </w:pPr>
       <w:r>
         <w:t xml:space="preserve">Généralité sur le </w:t>
@@ -8811,7 +8867,7 @@
     </w:p>
     <w:p>
       <w:pPr>
-        <w:pStyle w:val="Heading3"/>
+        <w:pStyle w:val="Titre3"/>
         <w:rPr>
           <w:rFonts w:ascii="Helvetica" w:eastAsiaTheme="minorEastAsia" w:hAnsi="Helvetica" w:cs="Helvetica"/>
           <w:sz w:val="21"/>
@@ -9005,7 +9061,7 @@
                     <pic:cNvPicPr/>
                   </pic:nvPicPr>
                   <pic:blipFill>
-                    <a:blip r:embed="rId17">
+                    <a:blip r:embed="rId18">
                       <a:extLst>
                         <a:ext uri="{28A0092B-C50C-407E-A947-70E740481C1C}">
                           <a14:useLocalDpi xmlns:a14="http://schemas.microsoft.com/office/drawing/2010/main" val="0"/>
@@ -9101,7 +9157,13 @@
         <w:t>donc il est pos</w:t>
       </w:r>
       <w:r>
-        <w:t xml:space="preserve">sible que le fonctionnement correcte de la matrice soit </w:t>
+        <w:t xml:space="preserve">sible que </w:t>
+      </w:r>
+      <w:r>
+        <w:t>le fonctionnement correct</w:t>
+      </w:r>
+      <w:r>
+        <w:t xml:space="preserve"> de la matrice soit </w:t>
       </w:r>
       <w:r>
         <w:t>compromis.</w:t>
@@ -9114,7 +9176,7 @@
     </w:p>
     <w:p>
       <w:pPr>
-        <w:pStyle w:val="Heading2"/>
+        <w:pStyle w:val="Titre2"/>
       </w:pPr>
       <w:r>
         <w:lastRenderedPageBreak/>
@@ -9137,7 +9199,7 @@
     </w:p>
     <w:p>
       <w:pPr>
-        <w:pStyle w:val="Heading3"/>
+        <w:pStyle w:val="Titre3"/>
       </w:pPr>
       <w:r>
         <w:t>Schématique globale</w:t>
@@ -9150,15 +9212,7 @@
         </w:rPr>
       </w:pPr>
       <w:r>
-        <w:t xml:space="preserve">J’ai aussi récupéré une schématique partiellement complète de Monsieur </w:t>
-      </w:r>
-      <w:proofErr w:type="spellStart"/>
-      <w:r>
-        <w:t>Egli</w:t>
-      </w:r>
-      <w:proofErr w:type="spellEnd"/>
-      <w:r>
-        <w:t xml:space="preserve"> </w:t>
+        <w:t xml:space="preserve">J’ai aussi récupéré une schématique partiellement complète de Monsieur Egli </w:t>
       </w:r>
       <w:r>
         <w:t>mais il avait utilis</w:t>
@@ -9173,15 +9227,7 @@
         <w:t xml:space="preserve">disposé les schémas effectués </w:t>
       </w:r>
       <w:r>
-        <w:t xml:space="preserve">par Monsieur </w:t>
-      </w:r>
-      <w:proofErr w:type="spellStart"/>
-      <w:r>
-        <w:t>Egli</w:t>
-      </w:r>
-      <w:proofErr w:type="spellEnd"/>
-      <w:r>
-        <w:t> :</w:t>
+        <w:t>par Monsieur Egli :</w:t>
       </w:r>
       <w:r>
         <w:t xml:space="preserve"> </w:t>
@@ -9207,16 +9253,16 @@
         </w:rPr>
         <w:lastRenderedPageBreak/>
         <w:drawing>
-          <wp:anchor distT="0" distB="0" distL="114300" distR="114300" simplePos="0" relativeHeight="251666944" behindDoc="0" locked="0" layoutInCell="1" allowOverlap="1" wp14:anchorId="6F3C2D81" wp14:editId="2DEDDDD6">
+          <wp:anchor distT="0" distB="0" distL="114300" distR="114300" simplePos="0" relativeHeight="251666944" behindDoc="0" locked="0" layoutInCell="1" allowOverlap="1" wp14:anchorId="6F3C2D81" wp14:editId="347ED503">
             <wp:simplePos x="0" y="0"/>
             <wp:positionH relativeFrom="margin">
               <wp:align>left</wp:align>
             </wp:positionH>
             <wp:positionV relativeFrom="paragraph">
-              <wp:posOffset>1513840</wp:posOffset>
+              <wp:posOffset>1687195</wp:posOffset>
             </wp:positionV>
-            <wp:extent cx="8366760" cy="5855335"/>
-            <wp:effectExtent l="0" t="0" r="0" b="0"/>
+            <wp:extent cx="8162925" cy="5713095"/>
+            <wp:effectExtent l="5715" t="0" r="0" b="0"/>
             <wp:wrapTopAndBottom/>
             <wp:docPr id="2046055027" name="Image 2"/>
             <wp:cNvGraphicFramePr>
@@ -9232,7 +9278,7 @@
                     </pic:cNvPicPr>
                   </pic:nvPicPr>
                   <pic:blipFill>
-                    <a:blip r:embed="rId18">
+                    <a:blip r:embed="rId19">
                       <a:extLst>
                         <a:ext uri="{28A0092B-C50C-407E-A947-70E740481C1C}">
                           <a14:useLocalDpi xmlns:a14="http://schemas.microsoft.com/office/drawing/2010/main" val="0"/>
@@ -9247,7 +9293,7 @@
                   <pic:spPr bwMode="auto">
                     <a:xfrm rot="16200000">
                       <a:off x="0" y="0"/>
-                      <a:ext cx="8366760" cy="5855335"/>
+                      <a:ext cx="8162925" cy="5713095"/>
                     </a:xfrm>
                     <a:prstGeom prst="rect">
                       <a:avLst/>
@@ -9260,6 +9306,12 @@
                 </pic:pic>
               </a:graphicData>
             </a:graphic>
+            <wp14:sizeRelH relativeFrom="margin">
+              <wp14:pctWidth>0</wp14:pctWidth>
+            </wp14:sizeRelH>
+            <wp14:sizeRelV relativeFrom="margin">
+              <wp14:pctHeight>0</wp14:pctHeight>
+            </wp14:sizeRelV>
           </wp:anchor>
         </w:drawing>
       </w:r>
@@ -9296,7 +9348,7 @@
                     </pic:cNvPicPr>
                   </pic:nvPicPr>
                   <pic:blipFill>
-                    <a:blip r:embed="rId19">
+                    <a:blip r:embed="rId20">
                       <a:extLst>
                         <a:ext uri="{28A0092B-C50C-407E-A947-70E740481C1C}">
                           <a14:useLocalDpi xmlns:a14="http://schemas.microsoft.com/office/drawing/2010/main" val="0"/>
@@ -9331,29 +9383,476 @@
     <w:p/>
     <w:p>
       <w:r>
+        <w:rPr>
+          <w:noProof/>
+        </w:rPr>
         <w:lastRenderedPageBreak/>
+        <w:drawing>
+          <wp:anchor distT="0" distB="0" distL="114300" distR="114300" simplePos="0" relativeHeight="251677184" behindDoc="0" locked="0" layoutInCell="1" allowOverlap="1" wp14:anchorId="4A9D4754" wp14:editId="528FDB70">
+            <wp:simplePos x="0" y="0"/>
+            <wp:positionH relativeFrom="margin">
+              <wp:align>center</wp:align>
+            </wp:positionH>
+            <wp:positionV relativeFrom="paragraph">
+              <wp:posOffset>1429385</wp:posOffset>
+            </wp:positionV>
+            <wp:extent cx="8220075" cy="6233795"/>
+            <wp:effectExtent l="2540" t="0" r="0" b="0"/>
+            <wp:wrapTopAndBottom/>
+            <wp:docPr id="1735032631" name="Image 4"/>
+            <wp:cNvGraphicFramePr>
+              <a:graphicFrameLocks xmlns:a="http://schemas.openxmlformats.org/drawingml/2006/main" noChangeAspect="1"/>
+            </wp:cNvGraphicFramePr>
+            <a:graphic xmlns:a="http://schemas.openxmlformats.org/drawingml/2006/main">
+              <a:graphicData uri="http://schemas.openxmlformats.org/drawingml/2006/picture">
+                <pic:pic xmlns:pic="http://schemas.openxmlformats.org/drawingml/2006/picture">
+                  <pic:nvPicPr>
+                    <pic:cNvPr id="0" name="Picture 11"/>
+                    <pic:cNvPicPr>
+                      <a:picLocks noChangeAspect="1" noChangeArrowheads="1"/>
+                    </pic:cNvPicPr>
+                  </pic:nvPicPr>
+                  <pic:blipFill>
+                    <a:blip r:embed="rId21">
+                      <a:extLst>
+                        <a:ext uri="{28A0092B-C50C-407E-A947-70E740481C1C}">
+                          <a14:useLocalDpi xmlns:a14="http://schemas.microsoft.com/office/drawing/2010/main" val="0"/>
+                        </a:ext>
+                      </a:extLst>
+                    </a:blip>
+                    <a:srcRect/>
+                    <a:stretch>
+                      <a:fillRect/>
+                    </a:stretch>
+                  </pic:blipFill>
+                  <pic:spPr bwMode="auto">
+                    <a:xfrm rot="16200000">
+                      <a:off x="0" y="0"/>
+                      <a:ext cx="8220075" cy="6233795"/>
+                    </a:xfrm>
+                    <a:prstGeom prst="rect">
+                      <a:avLst/>
+                    </a:prstGeom>
+                    <a:noFill/>
+                    <a:ln>
+                      <a:noFill/>
+                    </a:ln>
+                  </pic:spPr>
+                </pic:pic>
+              </a:graphicData>
+            </a:graphic>
+          </wp:anchor>
+        </w:drawing>
+      </w:r>
+      <w:r>
         <w:t>Voici ci-après les schémas après mes changements avec des commentaires sur la raison des changements.</w:t>
+      </w:r>
+      <w:r>
+        <w:t xml:space="preserve"> </w:t>
+      </w:r>
+    </w:p>
+    <w:p/>
+    <w:p>
+      <w:r>
+        <w:rPr>
+          <w:noProof/>
+        </w:rPr>
+        <w:lastRenderedPageBreak/>
+        <w:drawing>
+          <wp:anchor distT="0" distB="0" distL="114300" distR="114300" simplePos="0" relativeHeight="251678208" behindDoc="0" locked="0" layoutInCell="1" allowOverlap="1" wp14:anchorId="6DBD5229" wp14:editId="30E17004">
+            <wp:simplePos x="0" y="0"/>
+            <wp:positionH relativeFrom="margin">
+              <wp:align>center</wp:align>
+            </wp:positionH>
+            <wp:positionV relativeFrom="paragraph">
+              <wp:posOffset>0</wp:posOffset>
+            </wp:positionV>
+            <wp:extent cx="5057775" cy="8524240"/>
+            <wp:effectExtent l="0" t="0" r="0" b="0"/>
+            <wp:wrapTopAndBottom/>
+            <wp:docPr id="1408337120" name="Image 5"/>
+            <wp:cNvGraphicFramePr>
+              <a:graphicFrameLocks xmlns:a="http://schemas.openxmlformats.org/drawingml/2006/main" noChangeAspect="1"/>
+            </wp:cNvGraphicFramePr>
+            <a:graphic xmlns:a="http://schemas.openxmlformats.org/drawingml/2006/main">
+              <a:graphicData uri="http://schemas.openxmlformats.org/drawingml/2006/picture">
+                <pic:pic xmlns:pic="http://schemas.openxmlformats.org/drawingml/2006/picture">
+                  <pic:nvPicPr>
+                    <pic:cNvPr id="0" name="Picture 12"/>
+                    <pic:cNvPicPr>
+                      <a:picLocks noChangeAspect="1" noChangeArrowheads="1"/>
+                    </pic:cNvPicPr>
+                  </pic:nvPicPr>
+                  <pic:blipFill>
+                    <a:blip r:embed="rId22">
+                      <a:extLst>
+                        <a:ext uri="{28A0092B-C50C-407E-A947-70E740481C1C}">
+                          <a14:useLocalDpi xmlns:a14="http://schemas.microsoft.com/office/drawing/2010/main" val="0"/>
+                        </a:ext>
+                      </a:extLst>
+                    </a:blip>
+                    <a:srcRect/>
+                    <a:stretch>
+                      <a:fillRect/>
+                    </a:stretch>
+                  </pic:blipFill>
+                  <pic:spPr bwMode="auto">
+                    <a:xfrm>
+                      <a:off x="0" y="0"/>
+                      <a:ext cx="5057775" cy="8524240"/>
+                    </a:xfrm>
+                    <a:prstGeom prst="rect">
+                      <a:avLst/>
+                    </a:prstGeom>
+                    <a:noFill/>
+                    <a:ln>
+                      <a:noFill/>
+                    </a:ln>
+                  </pic:spPr>
+                </pic:pic>
+              </a:graphicData>
+            </a:graphic>
+            <wp14:sizeRelH relativeFrom="margin">
+              <wp14:pctWidth>0</wp14:pctWidth>
+            </wp14:sizeRelH>
+            <wp14:sizeRelV relativeFrom="margin">
+              <wp14:pctHeight>0</wp14:pctHeight>
+            </wp14:sizeRelV>
+          </wp:anchor>
+        </w:drawing>
       </w:r>
     </w:p>
     <w:p>
-      <w:pPr>
-        <w:pStyle w:val="Heading3"/>
-      </w:pPr>
-      <w:r>
-        <w:t xml:space="preserve">Dimensionnement </w:t>
+      <w:r>
+        <w:rPr>
+          <w:noProof/>
+        </w:rPr>
+        <w:lastRenderedPageBreak/>
+        <w:drawing>
+          <wp:anchor distT="0" distB="0" distL="114300" distR="114300" simplePos="0" relativeHeight="251679232" behindDoc="0" locked="0" layoutInCell="1" allowOverlap="1" wp14:anchorId="0CC4F698" wp14:editId="7A29AA8A">
+            <wp:simplePos x="0" y="0"/>
+            <wp:positionH relativeFrom="margin">
+              <wp:align>center</wp:align>
+            </wp:positionH>
+            <wp:positionV relativeFrom="paragraph">
+              <wp:posOffset>323850</wp:posOffset>
+            </wp:positionV>
+            <wp:extent cx="6091555" cy="8239125"/>
+            <wp:effectExtent l="0" t="0" r="0" b="9525"/>
+            <wp:wrapTopAndBottom/>
+            <wp:docPr id="26616586" name="Image 6"/>
+            <wp:cNvGraphicFramePr>
+              <a:graphicFrameLocks xmlns:a="http://schemas.openxmlformats.org/drawingml/2006/main" noChangeAspect="1"/>
+            </wp:cNvGraphicFramePr>
+            <a:graphic xmlns:a="http://schemas.openxmlformats.org/drawingml/2006/main">
+              <a:graphicData uri="http://schemas.openxmlformats.org/drawingml/2006/picture">
+                <pic:pic xmlns:pic="http://schemas.openxmlformats.org/drawingml/2006/picture">
+                  <pic:nvPicPr>
+                    <pic:cNvPr id="0" name="Picture 13"/>
+                    <pic:cNvPicPr>
+                      <a:picLocks noChangeAspect="1" noChangeArrowheads="1"/>
+                    </pic:cNvPicPr>
+                  </pic:nvPicPr>
+                  <pic:blipFill>
+                    <a:blip r:embed="rId23">
+                      <a:extLst>
+                        <a:ext uri="{28A0092B-C50C-407E-A947-70E740481C1C}">
+                          <a14:useLocalDpi xmlns:a14="http://schemas.microsoft.com/office/drawing/2010/main" val="0"/>
+                        </a:ext>
+                      </a:extLst>
+                    </a:blip>
+                    <a:srcRect/>
+                    <a:stretch>
+                      <a:fillRect/>
+                    </a:stretch>
+                  </pic:blipFill>
+                  <pic:spPr bwMode="auto">
+                    <a:xfrm>
+                      <a:off x="0" y="0"/>
+                      <a:ext cx="6091555" cy="8239125"/>
+                    </a:xfrm>
+                    <a:prstGeom prst="rect">
+                      <a:avLst/>
+                    </a:prstGeom>
+                    <a:noFill/>
+                    <a:ln>
+                      <a:noFill/>
+                    </a:ln>
+                  </pic:spPr>
+                </pic:pic>
+              </a:graphicData>
+            </a:graphic>
+            <wp14:sizeRelH relativeFrom="margin">
+              <wp14:pctWidth>0</wp14:pctWidth>
+            </wp14:sizeRelH>
+            <wp14:sizeRelV relativeFrom="margin">
+              <wp14:pctHeight>0</wp14:pctHeight>
+            </wp14:sizeRelV>
+          </wp:anchor>
+        </w:drawing>
+      </w:r>
+    </w:p>
+    <w:p/>
+    <w:p>
+      <w:pPr>
+        <w:pStyle w:val="Titre3"/>
+      </w:pPr>
+      <w:r>
+        <w:lastRenderedPageBreak/>
+        <w:t>Changements Apportés au schéma de base</w:t>
       </w:r>
     </w:p>
     <w:p>
-      <w:pPr>
-        <w:pStyle w:val="Heading4"/>
-      </w:pPr>
-      <w:r>
-        <w:t>Estimation du courant de consommation du système</w:t>
+      <w:r>
+        <w:t xml:space="preserve">On peut voir que sur la première page, j’ai </w:t>
+      </w:r>
+      <w:r>
+        <w:t>rassemblé</w:t>
+      </w:r>
+      <w:r>
+        <w:t xml:space="preserve"> les parties en groupes qui sont les même que dans le schéma bloc plus </w:t>
+      </w:r>
+      <w:r>
+        <w:t xml:space="preserve">le connecteur TC2030 pour programmer le STM32L072CZU6 qui contrôlera la matrice de </w:t>
+      </w:r>
+      <w:proofErr w:type="spellStart"/>
+      <w:r>
+        <w:t>LEDs</w:t>
+      </w:r>
+      <w:proofErr w:type="spellEnd"/>
+      <w:r>
+        <w:t xml:space="preserve"> et de touches</w:t>
+      </w:r>
+      <w:r>
+        <w:t xml:space="preserve"> et que j’ai séparé les deux matrices sur deux pages différentes.</w:t>
       </w:r>
     </w:p>
     <w:p>
-      <w:pPr>
-        <w:pStyle w:val="Heading4"/>
+      <w:r>
+        <w:drawing>
+          <wp:anchor distT="0" distB="0" distL="114300" distR="114300" simplePos="0" relativeHeight="251680256" behindDoc="0" locked="0" layoutInCell="1" allowOverlap="1" wp14:anchorId="12A072D6" wp14:editId="17FD657A">
+            <wp:simplePos x="0" y="0"/>
+            <wp:positionH relativeFrom="margin">
+              <wp:align>left</wp:align>
+            </wp:positionH>
+            <wp:positionV relativeFrom="paragraph">
+              <wp:posOffset>1110615</wp:posOffset>
+            </wp:positionV>
+            <wp:extent cx="5180965" cy="5114925"/>
+            <wp:effectExtent l="0" t="0" r="635" b="9525"/>
+            <wp:wrapTopAndBottom/>
+            <wp:docPr id="1155500475" name="Image 1" descr="Une image contenant texte, capture d’écran, Police, nombre&#10;&#10;Le contenu généré par l’IA peut être incorrect."/>
+            <wp:cNvGraphicFramePr>
+              <a:graphicFrameLocks xmlns:a="http://schemas.openxmlformats.org/drawingml/2006/main" noChangeAspect="1"/>
+            </wp:cNvGraphicFramePr>
+            <a:graphic xmlns:a="http://schemas.openxmlformats.org/drawingml/2006/main">
+              <a:graphicData uri="http://schemas.openxmlformats.org/drawingml/2006/picture">
+                <pic:pic xmlns:pic="http://schemas.openxmlformats.org/drawingml/2006/picture">
+                  <pic:nvPicPr>
+                    <pic:cNvPr id="1155500475" name="Image 1" descr="Une image contenant texte, capture d’écran, Police, nombre&#10;&#10;Le contenu généré par l’IA peut être incorrect."/>
+                    <pic:cNvPicPr/>
+                  </pic:nvPicPr>
+                  <pic:blipFill rotWithShape="1">
+                    <a:blip r:embed="rId24">
+                      <a:extLst>
+                        <a:ext uri="{28A0092B-C50C-407E-A947-70E740481C1C}">
+                          <a14:useLocalDpi xmlns:a14="http://schemas.microsoft.com/office/drawing/2010/main" val="0"/>
+                        </a:ext>
+                      </a:extLst>
+                    </a:blip>
+                    <a:srcRect l="1903" t="6720" r="3979" b="5236"/>
+                    <a:stretch/>
+                  </pic:blipFill>
+                  <pic:spPr bwMode="auto">
+                    <a:xfrm>
+                      <a:off x="0" y="0"/>
+                      <a:ext cx="5180965" cy="5114925"/>
+                    </a:xfrm>
+                    <a:prstGeom prst="rect">
+                      <a:avLst/>
+                    </a:prstGeom>
+                    <a:ln>
+                      <a:noFill/>
+                    </a:ln>
+                    <a:extLst>
+                      <a:ext uri="{53640926-AAD7-44D8-BBD7-CCE9431645EC}">
+                        <a14:shadowObscured xmlns:a14="http://schemas.microsoft.com/office/drawing/2010/main"/>
+                      </a:ext>
+                    </a:extLst>
+                  </pic:spPr>
+                </pic:pic>
+              </a:graphicData>
+            </a:graphic>
+          </wp:anchor>
+        </w:drawing>
+      </w:r>
+      <w:r>
+        <w:rPr>
+          <w:b/>
+          <w:bCs/>
+        </w:rPr>
+        <w:t>Groupe 1 : Microcontrôleur</w:t>
+      </w:r>
+      <w:r>
+        <w:rPr>
+          <w:b/>
+          <w:bCs/>
+        </w:rPr>
+        <w:t xml:space="preserve">. </w:t>
+      </w:r>
+      <w:r>
+        <w:t xml:space="preserve">Dans ce groupe, j’ai ajouté </w:t>
+      </w:r>
+      <w:r>
+        <w:t>changer les condensateurs de découplage pour que ce soit conforme au</w:t>
+      </w:r>
+      <w:r>
+        <w:t>x</w:t>
+      </w:r>
+      <w:r>
+        <w:t xml:space="preserve"> instructions demandées par STMicro</w:t>
+      </w:r>
+      <w:r>
+        <w:t xml:space="preserve">electronics car </w:t>
+      </w:r>
+      <w:r>
+        <w:t xml:space="preserve">le MCU imposé dans mon cahier des charges n’était pas le même que celui </w:t>
+      </w:r>
+      <w:r>
+        <w:t xml:space="preserve">que M. Egli à utilisé dans son prototype. J’ai aussi ajouté toutes les connexions </w:t>
+      </w:r>
+      <w:r>
+        <w:t>des deux matrices</w:t>
+      </w:r>
+      <w:r>
+        <w:t xml:space="preserve">. </w:t>
+      </w:r>
+      <w:r>
+        <w:t xml:space="preserve">J’ai </w:t>
+      </w:r>
+      <w:r>
+        <w:t>contrôlé</w:t>
+      </w:r>
+      <w:r>
+        <w:t xml:space="preserve"> </w:t>
+      </w:r>
+      <w:r>
+        <w:t>quel</w:t>
+      </w:r>
+      <w:r>
+        <w:t>le</w:t>
+      </w:r>
+      <w:r>
+        <w:t>s pins</w:t>
+      </w:r>
+      <w:r>
+        <w:t xml:space="preserve"> sont valables à être utilisé </w:t>
+      </w:r>
+      <w:r>
+        <w:t xml:space="preserve">à l’aide </w:t>
+      </w:r>
+      <w:r>
+        <w:t>du logiciel STM</w:t>
+      </w:r>
+      <w:r>
+        <w:t>32CubeIDE</w:t>
+      </w:r>
+      <w:r>
+        <w:t xml:space="preserve">. Voici le paramétrage que j’ai utilisé </w:t>
+      </w:r>
+      <w:r>
+        <w:t xml:space="preserve">pour voir si on avait assez de pins pour le </w:t>
+      </w:r>
+      <w:r>
+        <w:t xml:space="preserve">jeu et pour voir </w:t>
+      </w:r>
+      <w:r>
+        <w:t>quels pins</w:t>
+      </w:r>
+      <w:r>
+        <w:t xml:space="preserve"> étaient </w:t>
+      </w:r>
+      <w:r>
+        <w:t xml:space="preserve">disponible. </w:t>
+      </w:r>
+    </w:p>
+    <w:p>
+      <w:r>
+        <w:t>On pe</w:t>
+      </w:r>
+      <w:r>
+        <w:t xml:space="preserve">ut voir </w:t>
+      </w:r>
+      <w:r>
+        <w:t xml:space="preserve">que les pins utilisés dans le schéma sont </w:t>
+      </w:r>
+      <w:r>
+        <w:t>différent</w:t>
+      </w:r>
+      <w:r>
+        <w:t>e</w:t>
+      </w:r>
+      <w:r>
+        <w:t>s</w:t>
+      </w:r>
+      <w:r>
+        <w:t>.</w:t>
+      </w:r>
+      <w:r>
+        <w:t xml:space="preserve">  </w:t>
+      </w:r>
+      <w:r>
+        <w:t>C</w:t>
+      </w:r>
+      <w:r>
+        <w:t xml:space="preserve">’est </w:t>
+      </w:r>
+      <w:r>
+        <w:t>parce-que j’ai utilisé la méthode du pin-</w:t>
+      </w:r>
+      <w:proofErr w:type="spellStart"/>
+      <w:r>
+        <w:t>swapping</w:t>
+      </w:r>
+      <w:proofErr w:type="spellEnd"/>
+      <w:r>
+        <w:t xml:space="preserve"> sur </w:t>
+      </w:r>
+      <w:proofErr w:type="spellStart"/>
+      <w:r>
+        <w:t>Altium</w:t>
+      </w:r>
+      <w:proofErr w:type="spellEnd"/>
+      <w:r>
+        <w:t xml:space="preserve"> </w:t>
+      </w:r>
+      <w:r>
+        <w:t xml:space="preserve">qui facilite le routage en me permettant de changer </w:t>
+      </w:r>
+    </w:p>
+    <w:p/>
+    <w:p/>
+    <w:p/>
+    <w:p>
+      <w:pPr>
+        <w:pStyle w:val="Titre3"/>
+      </w:pPr>
+      <w:r>
+        <w:lastRenderedPageBreak/>
+        <w:t xml:space="preserve">Dimensionnement </w:t>
+      </w:r>
+    </w:p>
+    <w:p>
+      <w:pPr>
+        <w:pStyle w:val="Titre4"/>
+      </w:pPr>
+      <w:r>
+        <w:t>Estimation du courant de consommation du système</w:t>
+      </w:r>
+    </w:p>
+    <w:p>
+      <w:pPr>
+        <w:pStyle w:val="Titre4"/>
       </w:pPr>
       <w:r>
         <w:t>Régulateur de tension</w:t>
@@ -9365,7 +9864,7 @@
           <w:noProof/>
         </w:rPr>
         <w:drawing>
-          <wp:anchor distT="0" distB="0" distL="114300" distR="114300" simplePos="0" relativeHeight="251676160" behindDoc="0" locked="0" layoutInCell="1" allowOverlap="1" wp14:anchorId="3D24E313" wp14:editId="6DF164D6">
+          <wp:anchor distT="0" distB="0" distL="114300" distR="114300" simplePos="0" relativeHeight="251676160" behindDoc="0" locked="0" layoutInCell="1" allowOverlap="1" wp14:anchorId="3D24E313" wp14:editId="05151A6F">
             <wp:simplePos x="0" y="0"/>
             <wp:positionH relativeFrom="margin">
               <wp:posOffset>1304290</wp:posOffset>
@@ -9390,7 +9889,7 @@
                     </pic:cNvPicPr>
                   </pic:nvPicPr>
                   <pic:blipFill rotWithShape="1">
-                    <a:blip r:embed="rId20" cstate="print">
+                    <a:blip r:embed="rId25" cstate="print">
                       <a:extLst>
                         <a:ext uri="{28A0092B-C50C-407E-A947-70E740481C1C}">
                           <a14:useLocalDpi xmlns:a14="http://schemas.microsoft.com/office/drawing/2010/main" val="0"/>
@@ -9453,45 +9952,45 @@
       <w:r>
         <w:t>ce qui nous donne un courant max de 105mA (</w:t>
       </w:r>
-      <w:hyperlink r:id="rId21" w:history="1">
-        <w:r>
-          <w:rPr>
-            <w:rStyle w:val="Hyperlink"/>
+      <w:hyperlink r:id="rId26" w:history="1">
+        <w:r>
+          <w:rPr>
+            <w:rStyle w:val="Lienhypertexte"/>
           </w:rPr>
           <w:t>Datasheet - STM32L072x8 STM32L072xB STM32L072xZ - Ultra-</w:t>
         </w:r>
         <w:proofErr w:type="spellStart"/>
         <w:r>
           <w:rPr>
-            <w:rStyle w:val="Hyperlink"/>
+            <w:rStyle w:val="Lienhypertexte"/>
           </w:rPr>
           <w:t>low</w:t>
         </w:r>
         <w:proofErr w:type="spellEnd"/>
         <w:r>
           <w:rPr>
-            <w:rStyle w:val="Hyperlink"/>
+            <w:rStyle w:val="Lienhypertexte"/>
           </w:rPr>
           <w:t>-power 32-bit MCU Arm®-</w:t>
         </w:r>
         <w:proofErr w:type="spellStart"/>
         <w:r>
           <w:rPr>
-            <w:rStyle w:val="Hyperlink"/>
+            <w:rStyle w:val="Lienhypertexte"/>
           </w:rPr>
           <w:t>based</w:t>
         </w:r>
         <w:proofErr w:type="spellEnd"/>
         <w:r>
           <w:rPr>
-            <w:rStyle w:val="Hyperlink"/>
+            <w:rStyle w:val="Lienhypertexte"/>
           </w:rPr>
           <w:t xml:space="preserve"> Cortex®-M0+, up to 192KB Flash, 20KB SRAM, 6KB EEPROM, USB, ADC, </w:t>
         </w:r>
         <w:proofErr w:type="spellStart"/>
         <w:r>
           <w:rPr>
-            <w:rStyle w:val="Hyperlink"/>
+            <w:rStyle w:val="Lienhypertexte"/>
           </w:rPr>
           <w:t>DACs</w:t>
         </w:r>
@@ -9546,9 +10045,9 @@
     <w:p/>
     <w:p>
       <w:pPr>
-        <w:pStyle w:val="Heading4"/>
+        <w:pStyle w:val="Titre4"/>
         <w:rPr>
-          <w:rStyle w:val="Heading4Char"/>
+          <w:rStyle w:val="Titre4Car"/>
           <w:b/>
           <w:bCs/>
           <w:i/>
@@ -9561,9 +10060,9 @@
     </w:p>
     <w:p>
       <w:pPr>
-        <w:pStyle w:val="Heading4"/>
+        <w:pStyle w:val="Titre4"/>
         <w:rPr>
-          <w:rStyle w:val="Heading4Char"/>
+          <w:rStyle w:val="Titre4Car"/>
           <w:b/>
           <w:bCs/>
           <w:i/>
@@ -9572,7 +10071,7 @@
       </w:pPr>
       <w:r>
         <w:rPr>
-          <w:rStyle w:val="Heading4Char"/>
+          <w:rStyle w:val="Titre4Car"/>
           <w:b/>
           <w:bCs/>
           <w:i/>
@@ -9612,49 +10111,49 @@
       </w:r>
       <w:r>
         <w:rPr>
-          <w:rStyle w:val="Hyperlink"/>
+          <w:rStyle w:val="Lienhypertexte"/>
         </w:rPr>
         <w:t>Getting</w:t>
       </w:r>
       <w:proofErr w:type="spellEnd"/>
       <w:r>
         <w:rPr>
-          <w:rStyle w:val="Hyperlink"/>
+          <w:rStyle w:val="Lienhypertexte"/>
         </w:rPr>
         <w:t xml:space="preserve"> </w:t>
       </w:r>
       <w:proofErr w:type="spellStart"/>
       <w:r>
         <w:rPr>
-          <w:rStyle w:val="Hyperlink"/>
+          <w:rStyle w:val="Lienhypertexte"/>
         </w:rPr>
         <w:t>started</w:t>
       </w:r>
       <w:proofErr w:type="spellEnd"/>
       <w:r>
         <w:rPr>
-          <w:rStyle w:val="Hyperlink"/>
+          <w:rStyle w:val="Lienhypertexte"/>
         </w:rPr>
         <w:t xml:space="preserve"> </w:t>
       </w:r>
       <w:proofErr w:type="spellStart"/>
       <w:r>
         <w:rPr>
-          <w:rStyle w:val="Hyperlink"/>
+          <w:rStyle w:val="Lienhypertexte"/>
         </w:rPr>
         <w:t>with</w:t>
       </w:r>
       <w:proofErr w:type="spellEnd"/>
       <w:r>
         <w:rPr>
-          <w:rStyle w:val="Hyperlink"/>
+          <w:rStyle w:val="Lienhypertexte"/>
         </w:rPr>
         <w:t xml:space="preserve"> STM32L0xx hardware </w:t>
       </w:r>
       <w:proofErr w:type="spellStart"/>
       <w:r>
         <w:rPr>
-          <w:rStyle w:val="Hyperlink"/>
+          <w:rStyle w:val="Lienhypertexte"/>
         </w:rPr>
         <w:t>development</w:t>
       </w:r>
@@ -9699,7 +10198,7 @@
                     <pic:cNvPicPr/>
                   </pic:nvPicPr>
                   <pic:blipFill>
-                    <a:blip r:embed="rId22">
+                    <a:blip r:embed="rId27">
                       <a:extLst>
                         <a:ext uri="{28A0092B-C50C-407E-A947-70E740481C1C}">
                           <a14:useLocalDpi xmlns:a14="http://schemas.microsoft.com/office/drawing/2010/main" val="0"/>
@@ -9728,7 +10227,7 @@
     </w:p>
     <w:p>
       <w:pPr>
-        <w:pStyle w:val="Heading5"/>
+        <w:pStyle w:val="Titre5"/>
       </w:pPr>
       <w:r>
         <w:t>Port mapping</w:t>
@@ -9751,7 +10250,7 @@
     </w:p>
     <w:p>
       <w:pPr>
-        <w:pStyle w:val="Heading4"/>
+        <w:pStyle w:val="Titre4"/>
       </w:pPr>
       <w:r>
         <w:lastRenderedPageBreak/>
@@ -9764,7 +10263,7 @@
           <w:noProof/>
         </w:rPr>
         <w:drawing>
-          <wp:anchor distT="0" distB="0" distL="114300" distR="114300" simplePos="0" relativeHeight="251675136" behindDoc="0" locked="0" layoutInCell="1" allowOverlap="1" wp14:anchorId="650B7E38" wp14:editId="10F6FA6A">
+          <wp:anchor distT="0" distB="0" distL="114300" distR="114300" simplePos="0" relativeHeight="251675136" behindDoc="0" locked="0" layoutInCell="1" allowOverlap="1" wp14:anchorId="650B7E38" wp14:editId="0A3DEF61">
             <wp:simplePos x="0" y="0"/>
             <wp:positionH relativeFrom="column">
               <wp:posOffset>1766570</wp:posOffset>
@@ -9789,7 +10288,7 @@
                     </pic:cNvPicPr>
                   </pic:nvPicPr>
                   <pic:blipFill rotWithShape="1">
-                    <a:blip r:embed="rId23" cstate="print">
+                    <a:blip r:embed="rId28" cstate="print">
                       <a:extLst>
                         <a:ext uri="{28A0092B-C50C-407E-A947-70E740481C1C}">
                           <a14:useLocalDpi xmlns:a14="http://schemas.microsoft.com/office/drawing/2010/main" val="0"/>
@@ -9851,7 +10350,7 @@
                     <pic:cNvPicPr/>
                   </pic:nvPicPr>
                   <pic:blipFill>
-                    <a:blip r:embed="rId24">
+                    <a:blip r:embed="rId29">
                       <a:extLst>
                         <a:ext uri="{28A0092B-C50C-407E-A947-70E740481C1C}">
                           <a14:useLocalDpi xmlns:a14="http://schemas.microsoft.com/office/drawing/2010/main" val="0"/>
@@ -9897,38 +10396,38 @@
       <w:r>
         <w:t>le papier de ONSEMI sur la sélection des MOSFET pour la protection de polarisation inverse (</w:t>
       </w:r>
-      <w:hyperlink r:id="rId25" w:history="1">
-        <w:r>
-          <w:rPr>
-            <w:rStyle w:val="Hyperlink"/>
+      <w:hyperlink r:id="rId30" w:history="1">
+        <w:r>
+          <w:rPr>
+            <w:rStyle w:val="Lienhypertexte"/>
           </w:rPr>
           <w:t xml:space="preserve">AND90146 - MOSFET </w:t>
         </w:r>
         <w:proofErr w:type="spellStart"/>
         <w:r>
           <w:rPr>
-            <w:rStyle w:val="Hyperlink"/>
+            <w:rStyle w:val="Lienhypertexte"/>
           </w:rPr>
           <w:t>Selection</w:t>
         </w:r>
         <w:proofErr w:type="spellEnd"/>
         <w:r>
           <w:rPr>
-            <w:rStyle w:val="Hyperlink"/>
+            <w:rStyle w:val="Lienhypertexte"/>
           </w:rPr>
           <w:t xml:space="preserve"> for Reverse </w:t>
         </w:r>
         <w:proofErr w:type="spellStart"/>
         <w:r>
           <w:rPr>
-            <w:rStyle w:val="Hyperlink"/>
+            <w:rStyle w:val="Lienhypertexte"/>
           </w:rPr>
           <w:t>Polarity</w:t>
         </w:r>
         <w:proofErr w:type="spellEnd"/>
         <w:r>
           <w:rPr>
-            <w:rStyle w:val="Hyperlink"/>
+            <w:rStyle w:val="Lienhypertexte"/>
           </w:rPr>
           <w:t xml:space="preserve"> Protection</w:t>
         </w:r>
@@ -10012,7 +10511,7 @@
     </w:p>
     <w:p>
       <w:pPr>
-        <w:pStyle w:val="Heading2"/>
+        <w:pStyle w:val="Titre2"/>
       </w:pPr>
       <w:bookmarkStart w:id="43" w:name="_Toc72079940"/>
       <w:r>
@@ -10023,7 +10522,7 @@
     </w:p>
     <w:p>
       <w:pPr>
-        <w:pStyle w:val="Heading3"/>
+        <w:pStyle w:val="Titre3"/>
       </w:pPr>
       <w:r>
         <w:t>Protocole de mise en service</w:t>
@@ -10031,7 +10530,7 @@
     </w:p>
     <w:tbl>
       <w:tblPr>
-        <w:tblStyle w:val="TableGrid"/>
+        <w:tblStyle w:val="Grilledutableau"/>
         <w:tblW w:w="0" w:type="auto"/>
         <w:tblLook w:val="04A0" w:firstRow="1" w:lastRow="0" w:firstColumn="1" w:lastColumn="0" w:noHBand="0" w:noVBand="1"/>
       </w:tblPr>
@@ -10917,7 +11416,7 @@
     <w:p/>
     <w:p>
       <w:pPr>
-        <w:pStyle w:val="Heading3"/>
+        <w:pStyle w:val="Titre3"/>
       </w:pPr>
       <w:r>
         <w:t>Mesure1</w:t>
@@ -10925,7 +11424,7 @@
     </w:p>
     <w:p>
       <w:pPr>
-        <w:pStyle w:val="Heading4"/>
+        <w:pStyle w:val="Titre4"/>
       </w:pPr>
       <w:r>
         <w:t>But de la mesure</w:t>
@@ -10933,7 +11432,7 @@
     </w:p>
     <w:p>
       <w:pPr>
-        <w:pStyle w:val="Heading4"/>
+        <w:pStyle w:val="Titre4"/>
       </w:pPr>
       <w:r>
         <w:t>Schéma de mesure</w:t>
@@ -10941,7 +11440,7 @@
     </w:p>
     <w:p>
       <w:pPr>
-        <w:pStyle w:val="Heading4"/>
+        <w:pStyle w:val="Titre4"/>
       </w:pPr>
       <w:r>
         <w:t>Liste des composants</w:t>
@@ -10949,7 +11448,7 @@
     </w:p>
     <w:p>
       <w:pPr>
-        <w:pStyle w:val="Heading4"/>
+        <w:pStyle w:val="Titre4"/>
       </w:pPr>
       <w:r>
         <w:t>Liste des instruments et leurs réglages</w:t>
@@ -10957,7 +11456,7 @@
     </w:p>
     <w:p>
       <w:pPr>
-        <w:pStyle w:val="Heading4"/>
+        <w:pStyle w:val="Titre4"/>
       </w:pPr>
       <w:r>
         <w:t>Tableaux des valeurs mesurées</w:t>
@@ -10965,7 +11464,7 @@
     </w:p>
     <w:p>
       <w:pPr>
-        <w:pStyle w:val="Heading3"/>
+        <w:pStyle w:val="Titre3"/>
       </w:pPr>
       <w:r>
         <w:t>Mesure2</w:t>
@@ -10973,7 +11472,7 @@
     </w:p>
     <w:p>
       <w:pPr>
-        <w:pStyle w:val="Heading4"/>
+        <w:pStyle w:val="Titre4"/>
       </w:pPr>
       <w:r>
         <w:t>But de la mesure</w:t>
@@ -10981,7 +11480,7 @@
     </w:p>
     <w:p>
       <w:pPr>
-        <w:pStyle w:val="Heading4"/>
+        <w:pStyle w:val="Titre4"/>
       </w:pPr>
       <w:r>
         <w:t>Schéma de mesure</w:t>
@@ -10989,7 +11488,7 @@
     </w:p>
     <w:p>
       <w:pPr>
-        <w:pStyle w:val="Heading4"/>
+        <w:pStyle w:val="Titre4"/>
       </w:pPr>
       <w:r>
         <w:t xml:space="preserve">Liste des </w:t>
@@ -11000,7 +11499,7 @@
     </w:p>
     <w:p>
       <w:pPr>
-        <w:pStyle w:val="Heading4"/>
+        <w:pStyle w:val="Titre4"/>
       </w:pPr>
       <w:r>
         <w:t>Liste des i</w:t>
@@ -11020,7 +11519,7 @@
     </w:p>
     <w:p>
       <w:pPr>
-        <w:pStyle w:val="Heading4"/>
+        <w:pStyle w:val="Titre4"/>
       </w:pPr>
       <w:r>
         <w:t xml:space="preserve">Tableaux </w:t>
@@ -11041,7 +11540,7 @@
     <w:p/>
     <w:p>
       <w:pPr>
-        <w:pStyle w:val="Heading2"/>
+        <w:pStyle w:val="Titre2"/>
       </w:pPr>
       <w:bookmarkStart w:id="44" w:name="_Toc72079941"/>
       <w:r>
@@ -11052,7 +11551,7 @@
     </w:p>
     <w:p>
       <w:pPr>
-        <w:pStyle w:val="Heading2"/>
+        <w:pStyle w:val="Titre2"/>
       </w:pPr>
       <w:bookmarkStart w:id="45" w:name="_Toc40259971"/>
       <w:bookmarkStart w:id="46" w:name="_Toc40260233"/>
@@ -11072,7 +11571,7 @@
     </w:p>
     <w:p>
       <w:pPr>
-        <w:pStyle w:val="Heading3"/>
+        <w:pStyle w:val="Titre3"/>
       </w:pPr>
       <w:r>
         <w:t>Contraintes (Rules Check)</w:t>
@@ -11080,7 +11579,7 @@
     </w:p>
     <w:p>
       <w:pPr>
-        <w:pStyle w:val="Heading4"/>
+        <w:pStyle w:val="Titre4"/>
       </w:pPr>
       <w:r>
         <w:t>Largeurs des p</w:t>
@@ -11091,7 +11590,7 @@
     </w:p>
     <w:p>
       <w:pPr>
-        <w:pStyle w:val="Heading4"/>
+        <w:pStyle w:val="Titre4"/>
       </w:pPr>
       <w:r>
         <w:t xml:space="preserve">Diamètres des </w:t>
@@ -11107,7 +11606,7 @@
     </w:p>
     <w:p>
       <w:pPr>
-        <w:pStyle w:val="Heading3"/>
+        <w:pStyle w:val="Titre3"/>
       </w:pPr>
       <w:r>
         <w:t>Empreintes spécifiques</w:t>
@@ -11115,7 +11614,7 @@
     </w:p>
     <w:p>
       <w:pPr>
-        <w:pStyle w:val="Heading4"/>
+        <w:pStyle w:val="Titre4"/>
       </w:pPr>
       <w:r>
         <w:t>Régulateur de tension</w:t>
@@ -11123,7 +11622,7 @@
     </w:p>
     <w:p>
       <w:pPr>
-        <w:pStyle w:val="Heading4"/>
+        <w:pStyle w:val="Titre4"/>
       </w:pPr>
       <w:r>
         <w:t>Microcontrôleur</w:t>
@@ -11132,7 +11631,7 @@
     <w:p/>
     <w:p>
       <w:pPr>
-        <w:pStyle w:val="Heading2"/>
+        <w:pStyle w:val="Titre2"/>
       </w:pPr>
       <w:bookmarkStart w:id="50" w:name="_Toc40259977"/>
       <w:bookmarkStart w:id="51" w:name="_Toc40260239"/>
@@ -11152,7 +11651,7 @@
     </w:p>
     <w:p>
       <w:pPr>
-        <w:pStyle w:val="Heading3"/>
+        <w:pStyle w:val="Titre3"/>
       </w:pPr>
       <w:r>
         <w:t>Machine des états</w:t>
@@ -11160,7 +11659,7 @@
     </w:p>
     <w:p>
       <w:pPr>
-        <w:pStyle w:val="Heading3"/>
+        <w:pStyle w:val="Titre3"/>
       </w:pPr>
       <w:proofErr w:type="spellStart"/>
       <w:r>
@@ -11170,7 +11669,7 @@
     </w:p>
     <w:p>
       <w:pPr>
-        <w:pStyle w:val="Heading3"/>
+        <w:pStyle w:val="Titre3"/>
       </w:pPr>
       <w:proofErr w:type="spellStart"/>
       <w:r>
@@ -11180,7 +11679,7 @@
     </w:p>
     <w:p>
       <w:pPr>
-        <w:pStyle w:val="Heading2"/>
+        <w:pStyle w:val="Titre2"/>
       </w:pPr>
       <w:bookmarkStart w:id="55" w:name="_Toc72079944"/>
       <w:r>
@@ -11190,7 +11689,7 @@
     </w:p>
     <w:p>
       <w:pPr>
-        <w:pStyle w:val="Heading3"/>
+        <w:pStyle w:val="Titre3"/>
       </w:pPr>
       <w:r>
         <w:t>Machine des états</w:t>
@@ -11198,7 +11697,7 @@
     </w:p>
     <w:p>
       <w:pPr>
-        <w:pStyle w:val="Heading3"/>
+        <w:pStyle w:val="Titre3"/>
       </w:pPr>
       <w:proofErr w:type="spellStart"/>
       <w:r>
@@ -11208,7 +11707,7 @@
     </w:p>
     <w:p>
       <w:pPr>
-        <w:pStyle w:val="Heading2"/>
+        <w:pStyle w:val="Titre2"/>
       </w:pPr>
       <w:bookmarkStart w:id="56" w:name="_Toc72079945"/>
       <w:r>
@@ -11221,7 +11720,7 @@
     </w:p>
     <w:p>
       <w:pPr>
-        <w:pStyle w:val="Heading3"/>
+        <w:pStyle w:val="Titre3"/>
       </w:pPr>
       <w:r>
         <w:t>Rédaction du protocole de mise en service de post-production</w:t>
@@ -11229,7 +11728,7 @@
     </w:p>
     <w:p>
       <w:pPr>
-        <w:pStyle w:val="Heading3"/>
+        <w:pStyle w:val="Titre3"/>
       </w:pPr>
       <w:r>
         <w:t>Rédaction du mode d’emploi utilisateur</w:t>
@@ -11237,7 +11736,7 @@
     </w:p>
     <w:p>
       <w:pPr>
-        <w:pStyle w:val="Heading2"/>
+        <w:pStyle w:val="Titre2"/>
       </w:pPr>
       <w:bookmarkStart w:id="57" w:name="_Toc72079946"/>
       <w:r>
@@ -11255,7 +11754,7 @@
     </w:p>
     <w:p>
       <w:pPr>
-        <w:pStyle w:val="Heading1"/>
+        <w:pStyle w:val="Titre1"/>
       </w:pPr>
       <w:bookmarkStart w:id="58" w:name="_Toc40259980"/>
       <w:bookmarkStart w:id="59" w:name="_Toc40260242"/>
@@ -11274,7 +11773,7 @@
     </w:p>
     <w:p>
       <w:pPr>
-        <w:pStyle w:val="Heading2"/>
+        <w:pStyle w:val="Titre2"/>
       </w:pPr>
       <w:bookmarkStart w:id="63" w:name="_Toc72079948"/>
       <w:r>
@@ -11298,7 +11797,7 @@
     </w:p>
     <w:p>
       <w:pPr>
-        <w:pStyle w:val="Heading2"/>
+        <w:pStyle w:val="Titre2"/>
       </w:pPr>
       <w:bookmarkStart w:id="64" w:name="_Toc72079949"/>
       <w:r>
@@ -11308,7 +11807,7 @@
     </w:p>
     <w:p>
       <w:pPr>
-        <w:pStyle w:val="Heading2"/>
+        <w:pStyle w:val="Titre2"/>
       </w:pPr>
       <w:bookmarkStart w:id="65" w:name="_Toc72079950"/>
       <w:r>
@@ -11323,7 +11822,7 @@
     </w:p>
     <w:p>
       <w:pPr>
-        <w:pStyle w:val="Heading2"/>
+        <w:pStyle w:val="Titre2"/>
       </w:pPr>
       <w:bookmarkStart w:id="66" w:name="_Toc72079951"/>
       <w:r>
@@ -11341,7 +11840,7 @@
     </w:p>
     <w:p>
       <w:pPr>
-        <w:pStyle w:val="Heading1"/>
+        <w:pStyle w:val="Titre1"/>
       </w:pPr>
       <w:bookmarkStart w:id="67" w:name="_Toc40259984"/>
       <w:bookmarkStart w:id="68" w:name="_Toc40260246"/>
@@ -11360,7 +11859,7 @@
     </w:p>
     <w:p>
       <w:pPr>
-        <w:pStyle w:val="Heading2"/>
+        <w:pStyle w:val="Titre2"/>
       </w:pPr>
       <w:bookmarkStart w:id="72" w:name="_Toc72079953"/>
       <w:r>
@@ -11370,7 +11869,7 @@
     </w:p>
     <w:p>
       <w:pPr>
-        <w:pStyle w:val="Heading2"/>
+        <w:pStyle w:val="Titre2"/>
       </w:pPr>
       <w:bookmarkStart w:id="73" w:name="_Toc72079954"/>
       <w:r>
@@ -11389,7 +11888,7 @@
     </w:p>
     <w:p>
       <w:pPr>
-        <w:pStyle w:val="Heading2"/>
+        <w:pStyle w:val="Titre2"/>
       </w:pPr>
       <w:bookmarkStart w:id="74" w:name="_Toc72079955"/>
       <w:r>
@@ -11402,7 +11901,7 @@
     </w:p>
     <w:tbl>
       <w:tblPr>
-        <w:tblStyle w:val="TableGrid"/>
+        <w:tblStyle w:val="Grilledutableau"/>
         <w:tblW w:w="9072" w:type="dxa"/>
         <w:tblInd w:w="-5" w:type="dxa"/>
         <w:tblLook w:val="04A0" w:firstRow="1" w:lastRow="0" w:firstColumn="1" w:lastColumn="0" w:noHBand="0" w:noVBand="1"/>
@@ -11563,13 +12062,13 @@
                           <pic:cNvPicPr/>
                         </pic:nvPicPr>
                         <pic:blipFill>
-                          <a:blip r:embed="rId26" cstate="print">
+                          <a:blip r:embed="rId31" cstate="print">
                             <a:extLst>
                               <a:ext uri="{28A0092B-C50C-407E-A947-70E740481C1C}">
                                 <a14:useLocalDpi xmlns:a14="http://schemas.microsoft.com/office/drawing/2010/main" val="0"/>
                               </a:ext>
                               <a:ext uri="{96DAC541-7B7A-43D3-8B79-37D633B846F1}">
-                                <asvg:svgBlip xmlns:asvg="http://schemas.microsoft.com/office/drawing/2016/SVG/main" r:embed="rId27"/>
+                                <asvg:svgBlip xmlns:asvg="http://schemas.microsoft.com/office/drawing/2016/SVG/main" r:embed="rId32"/>
                               </a:ext>
                             </a:extLst>
                           </a:blip>
@@ -11897,13 +12396,13 @@
                           <pic:cNvPicPr/>
                         </pic:nvPicPr>
                         <pic:blipFill>
-                          <a:blip r:embed="rId26" cstate="print">
+                          <a:blip r:embed="rId31" cstate="print">
                             <a:extLst>
                               <a:ext uri="{28A0092B-C50C-407E-A947-70E740481C1C}">
                                 <a14:useLocalDpi xmlns:a14="http://schemas.microsoft.com/office/drawing/2010/main" val="0"/>
                               </a:ext>
                               <a:ext uri="{96DAC541-7B7A-43D3-8B79-37D633B846F1}">
-                                <asvg:svgBlip xmlns:asvg="http://schemas.microsoft.com/office/drawing/2016/SVG/main" r:embed="rId27"/>
+                                <asvg:svgBlip xmlns:asvg="http://schemas.microsoft.com/office/drawing/2016/SVG/main" r:embed="rId32"/>
                               </a:ext>
                             </a:extLst>
                           </a:blip>
@@ -12025,13 +12524,13 @@
                           <pic:cNvPicPr/>
                         </pic:nvPicPr>
                         <pic:blipFill>
-                          <a:blip r:embed="rId26" cstate="print">
+                          <a:blip r:embed="rId31" cstate="print">
                             <a:extLst>
                               <a:ext uri="{28A0092B-C50C-407E-A947-70E740481C1C}">
                                 <a14:useLocalDpi xmlns:a14="http://schemas.microsoft.com/office/drawing/2010/main" val="0"/>
                               </a:ext>
                               <a:ext uri="{96DAC541-7B7A-43D3-8B79-37D633B846F1}">
-                                <asvg:svgBlip xmlns:asvg="http://schemas.microsoft.com/office/drawing/2016/SVG/main" r:embed="rId27"/>
+                                <asvg:svgBlip xmlns:asvg="http://schemas.microsoft.com/office/drawing/2016/SVG/main" r:embed="rId32"/>
                               </a:ext>
                             </a:extLst>
                           </a:blip>
@@ -13161,13 +13660,13 @@
                           <pic:cNvPicPr/>
                         </pic:nvPicPr>
                         <pic:blipFill>
-                          <a:blip r:embed="rId26" cstate="print">
+                          <a:blip r:embed="rId31" cstate="print">
                             <a:extLst>
                               <a:ext uri="{28A0092B-C50C-407E-A947-70E740481C1C}">
                                 <a14:useLocalDpi xmlns:a14="http://schemas.microsoft.com/office/drawing/2010/main" val="0"/>
                               </a:ext>
                               <a:ext uri="{96DAC541-7B7A-43D3-8B79-37D633B846F1}">
-                                <asvg:svgBlip xmlns:asvg="http://schemas.microsoft.com/office/drawing/2016/SVG/main" r:embed="rId27"/>
+                                <asvg:svgBlip xmlns:asvg="http://schemas.microsoft.com/office/drawing/2016/SVG/main" r:embed="rId32"/>
                               </a:ext>
                             </a:extLst>
                           </a:blip>
@@ -13327,7 +13826,7 @@
     <w:p/>
     <w:p>
       <w:pPr>
-        <w:pStyle w:val="Heading2"/>
+        <w:pStyle w:val="Titre2"/>
       </w:pPr>
       <w:bookmarkStart w:id="75" w:name="_Toc72079956"/>
       <w:r>
@@ -13337,7 +13836,7 @@
     </w:p>
     <w:p>
       <w:pPr>
-        <w:pStyle w:val="Heading2"/>
+        <w:pStyle w:val="Titre2"/>
       </w:pPr>
       <w:bookmarkStart w:id="76" w:name="_Toc40259987"/>
       <w:bookmarkStart w:id="77" w:name="_Toc40260249"/>
@@ -13355,7 +13854,7 @@
     </w:p>
     <w:p>
       <w:pPr>
-        <w:pStyle w:val="Heading3"/>
+        <w:pStyle w:val="Titre3"/>
       </w:pPr>
       <w:r>
         <w:t>Signatures</w:t>
@@ -13364,7 +13863,7 @@
     <w:p/>
     <w:tbl>
       <w:tblPr>
-        <w:tblStyle w:val="TableGrid"/>
+        <w:tblStyle w:val="Grilledutableau"/>
         <w:tblpPr w:leftFromText="141" w:rightFromText="141" w:vertAnchor="text" w:horzAnchor="margin" w:tblpY="190"/>
         <w:tblW w:w="0" w:type="auto"/>
         <w:tblBorders>
@@ -13473,7 +13972,7 @@
     <w:p/>
     <w:p>
       <w:pPr>
-        <w:pStyle w:val="Heading3"/>
+        <w:pStyle w:val="Titre3"/>
       </w:pPr>
       <w:bookmarkStart w:id="81" w:name="_Toc40259989"/>
       <w:bookmarkStart w:id="82" w:name="_Toc40260251"/>
@@ -13489,16 +13988,16 @@
     </w:p>
     <w:p>
       <w:pPr>
-        <w:pStyle w:val="ListParagraph"/>
+        <w:pStyle w:val="Paragraphedeliste"/>
         <w:numPr>
           <w:ilvl w:val="0"/>
           <w:numId w:val="30"/>
         </w:numPr>
       </w:pPr>
-      <w:hyperlink r:id="rId28" w:history="1">
-        <w:r>
-          <w:rPr>
-            <w:rStyle w:val="Hyperlink"/>
+      <w:hyperlink r:id="rId33" w:history="1">
+        <w:r>
+          <w:rPr>
+            <w:rStyle w:val="Lienhypertexte"/>
           </w:rPr>
           <w:t>https://www.fr.ch/emf</w:t>
         </w:r>
@@ -13509,7 +14008,7 @@
     </w:p>
     <w:p>
       <w:pPr>
-        <w:pStyle w:val="Heading3"/>
+        <w:pStyle w:val="Titre3"/>
       </w:pPr>
       <w:bookmarkStart w:id="85" w:name="_Toc40259988"/>
       <w:bookmarkStart w:id="86" w:name="_Toc40260250"/>
@@ -13522,7 +14021,7 @@
     <w:p/>
     <w:tbl>
       <w:tblPr>
-        <w:tblStyle w:val="TableGrid"/>
+        <w:tblStyle w:val="Grilledutableau"/>
         <w:tblW w:w="0" w:type="auto"/>
         <w:tblLook w:val="04A0" w:firstRow="1" w:lastRow="0" w:firstColumn="1" w:lastColumn="0" w:noHBand="0" w:noVBand="1"/>
       </w:tblPr>
@@ -13648,7 +14147,7 @@
     <w:p/>
     <w:p>
       <w:pPr>
-        <w:pStyle w:val="Heading3"/>
+        <w:pStyle w:val="Titre3"/>
       </w:pPr>
       <w:r>
         <w:t>Annexes</w:t>
@@ -13660,8 +14159,8 @@
     </w:p>
     <w:p/>
     <w:sectPr>
-      <w:headerReference w:type="default" r:id="rId29"/>
-      <w:footerReference w:type="default" r:id="rId30"/>
+      <w:headerReference w:type="default" r:id="rId34"/>
+      <w:footerReference w:type="default" r:id="rId35"/>
       <w:pgSz w:w="11906" w:h="16838"/>
       <w:pgMar w:top="1417" w:right="1417" w:bottom="1417" w:left="1417" w:header="708" w:footer="708" w:gutter="0"/>
       <w:pgNumType w:start="0"/>
@@ -13708,11 +14207,10 @@
         <w:docPartUnique/>
       </w:docPartObj>
     </w:sdtPr>
-    <w:sdtEndPr/>
     <w:sdtContent>
       <w:p>
         <w:pPr>
-          <w:pStyle w:val="Footer"/>
+          <w:pStyle w:val="Pieddepage"/>
           <w:shd w:val="clear" w:color="auto" w:fill="D9D9D9" w:themeFill="background1" w:themeFillShade="D9"/>
         </w:pPr>
         <w:fldSimple w:instr=" FILENAME   \* MERGEFORMAT ">
@@ -13848,7 +14346,7 @@
   </w:sdt>
   <w:p>
     <w:pPr>
-      <w:pStyle w:val="Footer"/>
+      <w:pStyle w:val="Pieddepage"/>
     </w:pPr>
   </w:p>
 </w:ftr>
@@ -13883,7 +14381,7 @@
 <w:hdr xmlns:wpc="http://schemas.microsoft.com/office/word/2010/wordprocessingCanvas" xmlns:cx="http://schemas.microsoft.com/office/drawing/2014/chartex" xmlns:cx1="http://schemas.microsoft.com/office/drawing/2015/9/8/chartex" xmlns:cx2="http://schemas.microsoft.com/office/drawing/2015/10/21/chartex" xmlns:cx3="http://schemas.microsoft.com/office/drawing/2016/5/9/chartex" xmlns:cx4="http://schemas.microsoft.com/office/drawing/2016/5/10/chartex" xmlns:cx5="http://schemas.microsoft.com/office/drawing/2016/5/11/chartex" xmlns:cx6="http://schemas.microsoft.com/office/drawing/2016/5/12/chartex" xmlns:cx7="http://schemas.microsoft.com/office/drawing/2016/5/13/chartex" xmlns:cx8="http://schemas.microsoft.com/office/drawing/2016/5/14/chartex" xmlns:mc="http://schemas.openxmlformats.org/markup-compatibility/2006" xmlns:aink="http://schemas.microsoft.com/office/drawing/2016/ink" xmlns:am3d="http://schemas.microsoft.com/office/drawing/2017/model3d" xmlns:o="urn:schemas-microsoft-com:office:office" xmlns:oel="http://schemas.microsoft.com/office/2019/extlst" xmlns:r="http://schemas.openxmlformats.org/officeDocument/2006/relationships" xmlns:m="http://schemas.openxmlformats.org/officeDocument/2006/math" xmlns:v="urn:schemas-microsoft-com:vml" xmlns:wp14="http://schemas.microsoft.com/office/word/2010/wordprocessingDrawing" xmlns:wp="http://schemas.openxmlformats.org/drawingml/2006/wordprocessingDrawing" xmlns:w10="urn:schemas-microsoft-com:office:word" xmlns:w="http://schemas.openxmlformats.org/wordprocessingml/2006/main" xmlns:w14="http://schemas.microsoft.com/office/word/2010/wordml" xmlns:w15="http://schemas.microsoft.com/office/word/2012/wordml" xmlns:w16cex="http://schemas.microsoft.com/office/word/2018/wordml/cex" xmlns:w16cid="http://schemas.microsoft.com/office/word/2016/wordml/cid" xmlns:w16="http://schemas.microsoft.com/office/word/2018/wordml" xmlns:w16du="http://schemas.microsoft.com/office/word/2023/wordml/word16du" xmlns:w16sdtdh="http://schemas.microsoft.com/office/word/2020/wordml/sdtdatahash" xmlns:w16sdtfl="http://schemas.microsoft.com/office/word/2024/wordml/sdtformatlock" xmlns:w16se="http://schemas.microsoft.com/office/word/2015/wordml/symex" xmlns:wpg="http://schemas.microsoft.com/office/word/2010/wordprocessingGroup" xmlns:wpi="http://schemas.microsoft.com/office/word/2010/wordprocessingInk" xmlns:wne="http://schemas.microsoft.com/office/word/2006/wordml" xmlns:wps="http://schemas.microsoft.com/office/word/2010/wordprocessingShape" mc:Ignorable="w14 w15 w16se w16cid w16 w16cex w16sdtdh w16sdtfl w16du wp14">
   <w:p>
     <w:pPr>
-      <w:pStyle w:val="Header"/>
+      <w:pStyle w:val="En-tte"/>
       <w:shd w:val="clear" w:color="auto" w:fill="D9D9D9" w:themeFill="background1" w:themeFillShade="D9"/>
     </w:pPr>
     <w:r>
@@ -14243,7 +14741,7 @@
     <w:lvl w:ilvl="0">
       <w:start w:val="1"/>
       <w:numFmt w:val="decimal"/>
-      <w:pStyle w:val="Heading1"/>
+      <w:pStyle w:val="Titre1"/>
       <w:lvlText w:val="%1"/>
       <w:lvlJc w:val="left"/>
       <w:pPr>
@@ -14253,7 +14751,7 @@
     <w:lvl w:ilvl="1">
       <w:start w:val="1"/>
       <w:numFmt w:val="decimal"/>
-      <w:pStyle w:val="Heading2"/>
+      <w:pStyle w:val="Titre2"/>
       <w:lvlText w:val="%1.%2"/>
       <w:lvlJc w:val="left"/>
       <w:pPr>
@@ -14263,7 +14761,7 @@
     <w:lvl w:ilvl="2">
       <w:start w:val="1"/>
       <w:numFmt w:val="decimal"/>
-      <w:pStyle w:val="Heading3"/>
+      <w:pStyle w:val="Titre3"/>
       <w:lvlText w:val="%1.%2.%3"/>
       <w:lvlJc w:val="left"/>
       <w:pPr>
@@ -14273,7 +14771,7 @@
     <w:lvl w:ilvl="3">
       <w:start w:val="1"/>
       <w:numFmt w:val="decimal"/>
-      <w:pStyle w:val="Heading4"/>
+      <w:pStyle w:val="Titre4"/>
       <w:lvlText w:val="%1.%2.%3.%4"/>
       <w:lvlJc w:val="left"/>
       <w:pPr>
@@ -14283,7 +14781,7 @@
     <w:lvl w:ilvl="4">
       <w:start w:val="1"/>
       <w:numFmt w:val="decimal"/>
-      <w:pStyle w:val="Heading5"/>
+      <w:pStyle w:val="Titre5"/>
       <w:lvlText w:val="%1.%2.%3.%4.%5"/>
       <w:lvlJc w:val="left"/>
       <w:pPr>
@@ -14293,7 +14791,7 @@
     <w:lvl w:ilvl="5">
       <w:start w:val="1"/>
       <w:numFmt w:val="decimal"/>
-      <w:pStyle w:val="Heading6"/>
+      <w:pStyle w:val="Titre6"/>
       <w:lvlText w:val="%1.%2.%3.%4.%5.%6"/>
       <w:lvlJc w:val="left"/>
       <w:pPr>
@@ -14303,7 +14801,7 @@
     <w:lvl w:ilvl="6">
       <w:start w:val="1"/>
       <w:numFmt w:val="decimal"/>
-      <w:pStyle w:val="Heading7"/>
+      <w:pStyle w:val="Titre7"/>
       <w:lvlText w:val="%1.%2.%3.%4.%5.%6.%7"/>
       <w:lvlJc w:val="left"/>
       <w:pPr>
@@ -14313,7 +14811,7 @@
     <w:lvl w:ilvl="7">
       <w:start w:val="1"/>
       <w:numFmt w:val="decimal"/>
-      <w:pStyle w:val="Heading8"/>
+      <w:pStyle w:val="Titre8"/>
       <w:lvlText w:val="%1.%2.%3.%4.%5.%6.%7.%8"/>
       <w:lvlJc w:val="left"/>
       <w:pPr>
@@ -14323,7 +14821,7 @@
     <w:lvl w:ilvl="8">
       <w:start w:val="1"/>
       <w:numFmt w:val="decimal"/>
-      <w:pStyle w:val="Heading9"/>
+      <w:pStyle w:val="Titre9"/>
       <w:lvlText w:val="%1.%2.%3.%4.%5.%6.%7.%8.%9"/>
       <w:lvlJc w:val="left"/>
       <w:pPr>
@@ -15502,11 +16000,11 @@
     <w:qFormat/>
     <w:rsid w:val="001A4373"/>
   </w:style>
-  <w:style w:type="paragraph" w:styleId="Heading1">
+  <w:style w:type="paragraph" w:styleId="Titre1">
     <w:name w:val="heading 1"/>
     <w:basedOn w:val="Normal"/>
     <w:next w:val="Normal"/>
-    <w:link w:val="Heading1Char"/>
+    <w:link w:val="Titre1Car"/>
     <w:uiPriority w:val="9"/>
     <w:qFormat/>
     <w:rsid w:val="001A4373"/>
@@ -15532,11 +16030,11 @@
       <w:szCs w:val="36"/>
     </w:rPr>
   </w:style>
-  <w:style w:type="paragraph" w:styleId="Heading2">
+  <w:style w:type="paragraph" w:styleId="Titre2">
     <w:name w:val="heading 2"/>
     <w:basedOn w:val="Normal"/>
     <w:next w:val="Normal"/>
-    <w:link w:val="Heading2Char"/>
+    <w:link w:val="Titre2Car"/>
     <w:uiPriority w:val="9"/>
     <w:unhideWhenUsed/>
     <w:qFormat/>
@@ -15561,11 +16059,11 @@
       <w:szCs w:val="28"/>
     </w:rPr>
   </w:style>
-  <w:style w:type="paragraph" w:styleId="Heading3">
+  <w:style w:type="paragraph" w:styleId="Titre3">
     <w:name w:val="heading 3"/>
     <w:basedOn w:val="Normal"/>
     <w:next w:val="Normal"/>
-    <w:link w:val="Heading3Char"/>
+    <w:link w:val="Titre3Car"/>
     <w:uiPriority w:val="9"/>
     <w:unhideWhenUsed/>
     <w:qFormat/>
@@ -15587,11 +16085,11 @@
       <w:color w:val="000000" w:themeColor="text1"/>
     </w:rPr>
   </w:style>
-  <w:style w:type="paragraph" w:styleId="Heading4">
+  <w:style w:type="paragraph" w:styleId="Titre4">
     <w:name w:val="heading 4"/>
     <w:basedOn w:val="Normal"/>
     <w:next w:val="Normal"/>
-    <w:link w:val="Heading4Char"/>
+    <w:link w:val="Titre4Car"/>
     <w:uiPriority w:val="9"/>
     <w:unhideWhenUsed/>
     <w:qFormat/>
@@ -15616,11 +16114,11 @@
       <w:color w:val="000000" w:themeColor="text1"/>
     </w:rPr>
   </w:style>
-  <w:style w:type="paragraph" w:styleId="Heading5">
+  <w:style w:type="paragraph" w:styleId="Titre5">
     <w:name w:val="heading 5"/>
     <w:basedOn w:val="Normal"/>
     <w:next w:val="Normal"/>
-    <w:link w:val="Heading5Char"/>
+    <w:link w:val="Titre5Car"/>
     <w:uiPriority w:val="9"/>
     <w:unhideWhenUsed/>
     <w:qFormat/>
@@ -15640,11 +16138,11 @@
       <w:color w:val="323E4F" w:themeColor="text2" w:themeShade="BF"/>
     </w:rPr>
   </w:style>
-  <w:style w:type="paragraph" w:styleId="Heading6">
+  <w:style w:type="paragraph" w:styleId="Titre6">
     <w:name w:val="heading 6"/>
     <w:basedOn w:val="Normal"/>
     <w:next w:val="Normal"/>
-    <w:link w:val="Heading6Char"/>
+    <w:link w:val="Titre6Car"/>
     <w:uiPriority w:val="9"/>
     <w:semiHidden/>
     <w:unhideWhenUsed/>
@@ -15667,11 +16165,11 @@
       <w:color w:val="323E4F" w:themeColor="text2" w:themeShade="BF"/>
     </w:rPr>
   </w:style>
-  <w:style w:type="paragraph" w:styleId="Heading7">
+  <w:style w:type="paragraph" w:styleId="Titre7">
     <w:name w:val="heading 7"/>
     <w:basedOn w:val="Normal"/>
     <w:next w:val="Normal"/>
-    <w:link w:val="Heading7Char"/>
+    <w:link w:val="Titre7Car"/>
     <w:uiPriority w:val="9"/>
     <w:semiHidden/>
     <w:unhideWhenUsed/>
@@ -15694,11 +16192,11 @@
       <w:color w:val="404040" w:themeColor="text1" w:themeTint="BF"/>
     </w:rPr>
   </w:style>
-  <w:style w:type="paragraph" w:styleId="Heading8">
+  <w:style w:type="paragraph" w:styleId="Titre8">
     <w:name w:val="heading 8"/>
     <w:basedOn w:val="Normal"/>
     <w:next w:val="Normal"/>
-    <w:link w:val="Heading8Char"/>
+    <w:link w:val="Titre8Car"/>
     <w:uiPriority w:val="9"/>
     <w:semiHidden/>
     <w:unhideWhenUsed/>
@@ -15721,11 +16219,11 @@
       <w:szCs w:val="20"/>
     </w:rPr>
   </w:style>
-  <w:style w:type="paragraph" w:styleId="Heading9">
+  <w:style w:type="paragraph" w:styleId="Titre9">
     <w:name w:val="heading 9"/>
     <w:basedOn w:val="Normal"/>
     <w:next w:val="Normal"/>
-    <w:link w:val="Heading9Char"/>
+    <w:link w:val="Titre9Car"/>
     <w:uiPriority w:val="9"/>
     <w:semiHidden/>
     <w:unhideWhenUsed/>
@@ -15750,13 +16248,12 @@
       <w:szCs w:val="20"/>
     </w:rPr>
   </w:style>
-  <w:style w:type="character" w:default="1" w:styleId="DefaultParagraphFont">
+  <w:style w:type="character" w:default="1" w:styleId="Policepardfaut">
     <w:name w:val="Default Paragraph Font"/>
     <w:uiPriority w:val="1"/>
-    <w:semiHidden/>
     <w:unhideWhenUsed/>
   </w:style>
-  <w:style w:type="table" w:default="1" w:styleId="TableNormal">
+  <w:style w:type="table" w:default="1" w:styleId="TableauNormal">
     <w:name w:val="Normal Table"/>
     <w:uiPriority w:val="99"/>
     <w:semiHidden/>
@@ -15771,15 +16268,15 @@
       </w:tblCellMar>
     </w:tblPr>
   </w:style>
-  <w:style w:type="numbering" w:default="1" w:styleId="NoList">
+  <w:style w:type="numbering" w:default="1" w:styleId="Aucuneliste">
     <w:name w:val="No List"/>
     <w:uiPriority w:val="99"/>
     <w:semiHidden/>
     <w:unhideWhenUsed/>
   </w:style>
-  <w:style w:type="paragraph" w:styleId="NoSpacing">
+  <w:style w:type="paragraph" w:styleId="Sansinterligne">
     <w:name w:val="No Spacing"/>
-    <w:link w:val="NoSpacingChar"/>
+    <w:link w:val="SansinterligneCar"/>
     <w:uiPriority w:val="1"/>
     <w:qFormat/>
     <w:rsid w:val="001A4373"/>
@@ -15787,17 +16284,17 @@
       <w:spacing w:after="0" w:line="240" w:lineRule="auto"/>
     </w:pPr>
   </w:style>
-  <w:style w:type="character" w:customStyle="1" w:styleId="NoSpacingChar">
-    <w:name w:val="No Spacing Char"/>
-    <w:basedOn w:val="DefaultParagraphFont"/>
-    <w:link w:val="NoSpacing"/>
+  <w:style w:type="character" w:customStyle="1" w:styleId="SansinterligneCar">
+    <w:name w:val="Sans interligne Car"/>
+    <w:basedOn w:val="Policepardfaut"/>
+    <w:link w:val="Sansinterligne"/>
     <w:uiPriority w:val="1"/>
     <w:rsid w:val="00077D68"/>
   </w:style>
-  <w:style w:type="character" w:customStyle="1" w:styleId="Heading1Char">
-    <w:name w:val="Heading 1 Char"/>
-    <w:basedOn w:val="DefaultParagraphFont"/>
-    <w:link w:val="Heading1"/>
+  <w:style w:type="character" w:customStyle="1" w:styleId="Titre1Car">
+    <w:name w:val="Titre 1 Car"/>
+    <w:basedOn w:val="Policepardfaut"/>
+    <w:link w:val="Titre1"/>
     <w:uiPriority w:val="9"/>
     <w:rsid w:val="001A4373"/>
     <w:rPr>
@@ -15810,10 +16307,10 @@
       <w:szCs w:val="36"/>
     </w:rPr>
   </w:style>
-  <w:style w:type="character" w:customStyle="1" w:styleId="Heading2Char">
-    <w:name w:val="Heading 2 Char"/>
-    <w:basedOn w:val="DefaultParagraphFont"/>
-    <w:link w:val="Heading2"/>
+  <w:style w:type="character" w:customStyle="1" w:styleId="Titre2Car">
+    <w:name w:val="Titre 2 Car"/>
+    <w:basedOn w:val="Policepardfaut"/>
+    <w:link w:val="Titre2"/>
     <w:uiPriority w:val="9"/>
     <w:rsid w:val="001A4373"/>
     <w:rPr>
@@ -15826,7 +16323,7 @@
       <w:szCs w:val="28"/>
     </w:rPr>
   </w:style>
-  <w:style w:type="paragraph" w:styleId="ListParagraph">
+  <w:style w:type="paragraph" w:styleId="Paragraphedeliste">
     <w:name w:val="List Paragraph"/>
     <w:basedOn w:val="Normal"/>
     <w:uiPriority w:val="34"/>
@@ -15837,10 +16334,10 @@
       <w:contextualSpacing/>
     </w:pPr>
   </w:style>
-  <w:style w:type="character" w:customStyle="1" w:styleId="Heading3Char">
-    <w:name w:val="Heading 3 Char"/>
-    <w:basedOn w:val="DefaultParagraphFont"/>
-    <w:link w:val="Heading3"/>
+  <w:style w:type="character" w:customStyle="1" w:styleId="Titre3Car">
+    <w:name w:val="Titre 3 Car"/>
+    <w:basedOn w:val="Policepardfaut"/>
+    <w:link w:val="Titre3"/>
     <w:uiPriority w:val="9"/>
     <w:rsid w:val="001A4373"/>
     <w:rPr>
@@ -15850,9 +16347,9 @@
       <w:color w:val="000000" w:themeColor="text1"/>
     </w:rPr>
   </w:style>
-  <w:style w:type="table" w:styleId="TableGrid">
+  <w:style w:type="table" w:styleId="Grilledutableau">
     <w:name w:val="Table Grid"/>
-    <w:basedOn w:val="TableNormal"/>
+    <w:basedOn w:val="TableauNormal"/>
     <w:uiPriority w:val="39"/>
     <w:rsid w:val="00380541"/>
     <w:pPr>
@@ -15869,10 +16366,10 @@
       </w:tblBorders>
     </w:tblPr>
   </w:style>
-  <w:style w:type="paragraph" w:styleId="Header">
+  <w:style w:type="paragraph" w:styleId="En-tte">
     <w:name w:val="header"/>
     <w:basedOn w:val="Normal"/>
-    <w:link w:val="HeaderChar"/>
+    <w:link w:val="En-tteCar"/>
     <w:uiPriority w:val="99"/>
     <w:unhideWhenUsed/>
     <w:rsid w:val="00293323"/>
@@ -15884,17 +16381,17 @@
       <w:spacing w:after="0" w:line="240" w:lineRule="auto"/>
     </w:pPr>
   </w:style>
-  <w:style w:type="character" w:customStyle="1" w:styleId="HeaderChar">
-    <w:name w:val="Header Char"/>
-    <w:basedOn w:val="DefaultParagraphFont"/>
-    <w:link w:val="Header"/>
+  <w:style w:type="character" w:customStyle="1" w:styleId="En-tteCar">
+    <w:name w:val="En-tête Car"/>
+    <w:basedOn w:val="Policepardfaut"/>
+    <w:link w:val="En-tte"/>
     <w:uiPriority w:val="99"/>
     <w:rsid w:val="00293323"/>
   </w:style>
-  <w:style w:type="paragraph" w:styleId="Footer">
+  <w:style w:type="paragraph" w:styleId="Pieddepage">
     <w:name w:val="footer"/>
     <w:basedOn w:val="Normal"/>
-    <w:link w:val="FooterChar"/>
+    <w:link w:val="PieddepageCar"/>
     <w:uiPriority w:val="99"/>
     <w:unhideWhenUsed/>
     <w:rsid w:val="00293323"/>
@@ -15906,14 +16403,14 @@
       <w:spacing w:after="0" w:line="240" w:lineRule="auto"/>
     </w:pPr>
   </w:style>
-  <w:style w:type="character" w:customStyle="1" w:styleId="FooterChar">
-    <w:name w:val="Footer Char"/>
-    <w:basedOn w:val="DefaultParagraphFont"/>
-    <w:link w:val="Footer"/>
+  <w:style w:type="character" w:customStyle="1" w:styleId="PieddepageCar">
+    <w:name w:val="Pied de page Car"/>
+    <w:basedOn w:val="Policepardfaut"/>
+    <w:link w:val="Pieddepage"/>
     <w:uiPriority w:val="99"/>
     <w:rsid w:val="00293323"/>
   </w:style>
-  <w:style w:type="paragraph" w:styleId="Caption">
+  <w:style w:type="paragraph" w:styleId="Lgende">
     <w:name w:val="caption"/>
     <w:basedOn w:val="Normal"/>
     <w:next w:val="Normal"/>
@@ -15932,7 +16429,7 @@
       <w:szCs w:val="18"/>
     </w:rPr>
   </w:style>
-  <w:style w:type="paragraph" w:styleId="TableofFigures">
+  <w:style w:type="paragraph" w:styleId="Tabledesillustrations">
     <w:name w:val="table of figures"/>
     <w:basedOn w:val="Normal"/>
     <w:next w:val="Normal"/>
@@ -15943,9 +16440,9 @@
       <w:spacing w:after="0"/>
     </w:pPr>
   </w:style>
-  <w:style w:type="character" w:styleId="Hyperlink">
+  <w:style w:type="character" w:styleId="Lienhypertexte">
     <w:name w:val="Hyperlink"/>
-    <w:basedOn w:val="DefaultParagraphFont"/>
+    <w:basedOn w:val="Policepardfaut"/>
     <w:uiPriority w:val="99"/>
     <w:unhideWhenUsed/>
     <w:rsid w:val="003656EE"/>
@@ -15954,9 +16451,9 @@
       <w:u w:val="single"/>
     </w:rPr>
   </w:style>
-  <w:style w:type="character" w:styleId="FollowedHyperlink">
+  <w:style w:type="character" w:styleId="Lienhypertextesuivivisit">
     <w:name w:val="FollowedHyperlink"/>
-    <w:basedOn w:val="DefaultParagraphFont"/>
+    <w:basedOn w:val="Policepardfaut"/>
     <w:uiPriority w:val="99"/>
     <w:semiHidden/>
     <w:unhideWhenUsed/>
@@ -15966,10 +16463,10 @@
       <w:u w:val="single"/>
     </w:rPr>
   </w:style>
-  <w:style w:type="character" w:customStyle="1" w:styleId="Heading4Char">
-    <w:name w:val="Heading 4 Char"/>
-    <w:basedOn w:val="DefaultParagraphFont"/>
-    <w:link w:val="Heading4"/>
+  <w:style w:type="character" w:customStyle="1" w:styleId="Titre4Car">
+    <w:name w:val="Titre 4 Car"/>
+    <w:basedOn w:val="Policepardfaut"/>
+    <w:link w:val="Titre4"/>
     <w:uiPriority w:val="9"/>
     <w:rsid w:val="001A4373"/>
     <w:rPr>
@@ -15981,10 +16478,10 @@
       <w:color w:val="000000" w:themeColor="text1"/>
     </w:rPr>
   </w:style>
-  <w:style w:type="paragraph" w:styleId="BalloonText">
+  <w:style w:type="paragraph" w:styleId="Textedebulles">
     <w:name w:val="Balloon Text"/>
     <w:basedOn w:val="Normal"/>
-    <w:link w:val="BalloonTextChar"/>
+    <w:link w:val="TextedebullesCar"/>
     <w:uiPriority w:val="99"/>
     <w:semiHidden/>
     <w:unhideWhenUsed/>
@@ -15998,10 +16495,10 @@
       <w:szCs w:val="16"/>
     </w:rPr>
   </w:style>
-  <w:style w:type="character" w:customStyle="1" w:styleId="BalloonTextChar">
-    <w:name w:val="Balloon Text Char"/>
-    <w:basedOn w:val="DefaultParagraphFont"/>
-    <w:link w:val="BalloonText"/>
+  <w:style w:type="character" w:customStyle="1" w:styleId="TextedebullesCar">
+    <w:name w:val="Texte de bulles Car"/>
+    <w:basedOn w:val="Policepardfaut"/>
+    <w:link w:val="Textedebulles"/>
     <w:uiPriority w:val="99"/>
     <w:semiHidden/>
     <w:rsid w:val="00D3229B"/>
@@ -16011,10 +16508,10 @@
       <w:szCs w:val="16"/>
     </w:rPr>
   </w:style>
-  <w:style w:type="paragraph" w:styleId="DocumentMap">
+  <w:style w:type="paragraph" w:styleId="Explorateurdedocuments">
     <w:name w:val="Document Map"/>
     <w:basedOn w:val="Normal"/>
-    <w:link w:val="DocumentMapChar"/>
+    <w:link w:val="ExplorateurdedocumentsCar"/>
     <w:uiPriority w:val="99"/>
     <w:semiHidden/>
     <w:unhideWhenUsed/>
@@ -16028,10 +16525,10 @@
       <w:szCs w:val="16"/>
     </w:rPr>
   </w:style>
-  <w:style w:type="character" w:customStyle="1" w:styleId="DocumentMapChar">
-    <w:name w:val="Document Map Char"/>
-    <w:basedOn w:val="DefaultParagraphFont"/>
-    <w:link w:val="DocumentMap"/>
+  <w:style w:type="character" w:customStyle="1" w:styleId="ExplorateurdedocumentsCar">
+    <w:name w:val="Explorateur de documents Car"/>
+    <w:basedOn w:val="Policepardfaut"/>
+    <w:link w:val="Explorateurdedocuments"/>
     <w:uiPriority w:val="99"/>
     <w:semiHidden/>
     <w:rsid w:val="00D3229B"/>
@@ -16041,9 +16538,9 @@
       <w:szCs w:val="16"/>
     </w:rPr>
   </w:style>
-  <w:style w:type="paragraph" w:styleId="TOCHeading">
+  <w:style w:type="paragraph" w:styleId="En-ttedetabledesmatires">
     <w:name w:val="TOC Heading"/>
-    <w:basedOn w:val="Heading1"/>
+    <w:basedOn w:val="Titre1"/>
     <w:next w:val="Normal"/>
     <w:uiPriority w:val="39"/>
     <w:unhideWhenUsed/>
@@ -16053,9 +16550,9 @@
       <w:outlineLvl w:val="9"/>
     </w:pPr>
   </w:style>
-  <w:style w:type="paragraph" w:styleId="TOC2">
+  <w:style w:type="paragraph" w:styleId="TM2">
     <w:name w:val="toc 2"/>
-    <w:basedOn w:val="TOC1"/>
+    <w:basedOn w:val="TM1"/>
     <w:next w:val="Normal"/>
     <w:autoRedefine/>
     <w:uiPriority w:val="39"/>
@@ -16072,7 +16569,7 @@
       <w:smallCaps/>
     </w:rPr>
   </w:style>
-  <w:style w:type="paragraph" w:styleId="TOC1">
+  <w:style w:type="paragraph" w:styleId="TM1">
     <w:name w:val="toc 1"/>
     <w:basedOn w:val="Normal"/>
     <w:next w:val="Normal"/>
@@ -16092,9 +16589,9 @@
       <w:szCs w:val="20"/>
     </w:rPr>
   </w:style>
-  <w:style w:type="paragraph" w:styleId="TOC3">
+  <w:style w:type="paragraph" w:styleId="TM3">
     <w:name w:val="toc 3"/>
-    <w:basedOn w:val="TOC1"/>
+    <w:basedOn w:val="TM1"/>
     <w:next w:val="Normal"/>
     <w:autoRedefine/>
     <w:uiPriority w:val="39"/>
@@ -16112,7 +16609,7 @@
       <w:caps w:val="0"/>
     </w:rPr>
   </w:style>
-  <w:style w:type="paragraph" w:styleId="TOC4">
+  <w:style w:type="paragraph" w:styleId="TM4">
     <w:name w:val="toc 4"/>
     <w:basedOn w:val="Normal"/>
     <w:next w:val="Normal"/>
@@ -16130,7 +16627,7 @@
       <w:szCs w:val="18"/>
     </w:rPr>
   </w:style>
-  <w:style w:type="paragraph" w:styleId="TOC5">
+  <w:style w:type="paragraph" w:styleId="TM5">
     <w:name w:val="toc 5"/>
     <w:basedOn w:val="Normal"/>
     <w:next w:val="Normal"/>
@@ -16162,7 +16659,7 @@
       <w:ind w:left="220" w:hanging="220"/>
     </w:pPr>
   </w:style>
-  <w:style w:type="paragraph" w:styleId="TOC6">
+  <w:style w:type="paragraph" w:styleId="TM6">
     <w:name w:val="toc 6"/>
     <w:basedOn w:val="Normal"/>
     <w:next w:val="Normal"/>
@@ -16180,7 +16677,7 @@
       <w:szCs w:val="18"/>
     </w:rPr>
   </w:style>
-  <w:style w:type="paragraph" w:styleId="TOC7">
+  <w:style w:type="paragraph" w:styleId="TM7">
     <w:name w:val="toc 7"/>
     <w:basedOn w:val="Normal"/>
     <w:next w:val="Normal"/>
@@ -16198,7 +16695,7 @@
       <w:szCs w:val="18"/>
     </w:rPr>
   </w:style>
-  <w:style w:type="paragraph" w:styleId="TOC8">
+  <w:style w:type="paragraph" w:styleId="TM8">
     <w:name w:val="toc 8"/>
     <w:basedOn w:val="Normal"/>
     <w:next w:val="Normal"/>
@@ -16216,7 +16713,7 @@
       <w:szCs w:val="18"/>
     </w:rPr>
   </w:style>
-  <w:style w:type="paragraph" w:styleId="TOC9">
+  <w:style w:type="paragraph" w:styleId="TM9">
     <w:name w:val="toc 9"/>
     <w:basedOn w:val="Normal"/>
     <w:next w:val="Normal"/>
@@ -16234,10 +16731,10 @@
       <w:szCs w:val="18"/>
     </w:rPr>
   </w:style>
-  <w:style w:type="character" w:customStyle="1" w:styleId="Heading5Char">
-    <w:name w:val="Heading 5 Char"/>
-    <w:basedOn w:val="DefaultParagraphFont"/>
-    <w:link w:val="Heading5"/>
+  <w:style w:type="character" w:customStyle="1" w:styleId="Titre5Car">
+    <w:name w:val="Titre 5 Car"/>
+    <w:basedOn w:val="Policepardfaut"/>
+    <w:link w:val="Titre5"/>
     <w:uiPriority w:val="9"/>
     <w:rsid w:val="001A4373"/>
     <w:rPr>
@@ -16245,10 +16742,10 @@
       <w:color w:val="323E4F" w:themeColor="text2" w:themeShade="BF"/>
     </w:rPr>
   </w:style>
-  <w:style w:type="character" w:customStyle="1" w:styleId="Heading6Char">
-    <w:name w:val="Heading 6 Char"/>
-    <w:basedOn w:val="DefaultParagraphFont"/>
-    <w:link w:val="Heading6"/>
+  <w:style w:type="character" w:customStyle="1" w:styleId="Titre6Car">
+    <w:name w:val="Titre 6 Car"/>
+    <w:basedOn w:val="Policepardfaut"/>
+    <w:link w:val="Titre6"/>
     <w:uiPriority w:val="9"/>
     <w:semiHidden/>
     <w:rsid w:val="001A4373"/>
@@ -16259,10 +16756,10 @@
       <w:color w:val="323E4F" w:themeColor="text2" w:themeShade="BF"/>
     </w:rPr>
   </w:style>
-  <w:style w:type="character" w:customStyle="1" w:styleId="Heading7Char">
-    <w:name w:val="Heading 7 Char"/>
-    <w:basedOn w:val="DefaultParagraphFont"/>
-    <w:link w:val="Heading7"/>
+  <w:style w:type="character" w:customStyle="1" w:styleId="Titre7Car">
+    <w:name w:val="Titre 7 Car"/>
+    <w:basedOn w:val="Policepardfaut"/>
+    <w:link w:val="Titre7"/>
     <w:uiPriority w:val="9"/>
     <w:semiHidden/>
     <w:rsid w:val="001A4373"/>
@@ -16273,10 +16770,10 @@
       <w:color w:val="404040" w:themeColor="text1" w:themeTint="BF"/>
     </w:rPr>
   </w:style>
-  <w:style w:type="character" w:customStyle="1" w:styleId="Heading8Char">
-    <w:name w:val="Heading 8 Char"/>
-    <w:basedOn w:val="DefaultParagraphFont"/>
-    <w:link w:val="Heading8"/>
+  <w:style w:type="character" w:customStyle="1" w:styleId="Titre8Car">
+    <w:name w:val="Titre 8 Car"/>
+    <w:basedOn w:val="Policepardfaut"/>
+    <w:link w:val="Titre8"/>
     <w:uiPriority w:val="9"/>
     <w:semiHidden/>
     <w:rsid w:val="001A4373"/>
@@ -16287,10 +16784,10 @@
       <w:szCs w:val="20"/>
     </w:rPr>
   </w:style>
-  <w:style w:type="character" w:customStyle="1" w:styleId="Heading9Char">
-    <w:name w:val="Heading 9 Char"/>
-    <w:basedOn w:val="DefaultParagraphFont"/>
-    <w:link w:val="Heading9"/>
+  <w:style w:type="character" w:customStyle="1" w:styleId="Titre9Car">
+    <w:name w:val="Titre 9 Car"/>
+    <w:basedOn w:val="Policepardfaut"/>
+    <w:link w:val="Titre9"/>
     <w:uiPriority w:val="9"/>
     <w:semiHidden/>
     <w:rsid w:val="001A4373"/>
@@ -16303,11 +16800,11 @@
       <w:szCs w:val="20"/>
     </w:rPr>
   </w:style>
-  <w:style w:type="paragraph" w:styleId="Title">
+  <w:style w:type="paragraph" w:styleId="Titre">
     <w:name w:val="Title"/>
     <w:basedOn w:val="Normal"/>
     <w:next w:val="Normal"/>
-    <w:link w:val="TitleChar"/>
+    <w:link w:val="TitreCar"/>
     <w:uiPriority w:val="10"/>
     <w:qFormat/>
     <w:rsid w:val="001A4373"/>
@@ -16322,10 +16819,10 @@
       <w:szCs w:val="56"/>
     </w:rPr>
   </w:style>
-  <w:style w:type="character" w:customStyle="1" w:styleId="TitleChar">
-    <w:name w:val="Title Char"/>
-    <w:basedOn w:val="DefaultParagraphFont"/>
-    <w:link w:val="Title"/>
+  <w:style w:type="character" w:customStyle="1" w:styleId="TitreCar">
+    <w:name w:val="Titre Car"/>
+    <w:basedOn w:val="Policepardfaut"/>
+    <w:link w:val="Titre"/>
     <w:uiPriority w:val="10"/>
     <w:rsid w:val="001A4373"/>
     <w:rPr>
@@ -16335,11 +16832,11 @@
       <w:szCs w:val="56"/>
     </w:rPr>
   </w:style>
-  <w:style w:type="paragraph" w:styleId="Subtitle">
+  <w:style w:type="paragraph" w:styleId="Sous-titre">
     <w:name w:val="Subtitle"/>
     <w:basedOn w:val="Normal"/>
     <w:next w:val="Normal"/>
-    <w:link w:val="SubtitleChar"/>
+    <w:link w:val="Sous-titreCar"/>
     <w:uiPriority w:val="11"/>
     <w:qFormat/>
     <w:rsid w:val="001A4373"/>
@@ -16353,10 +16850,10 @@
       <w:spacing w:val="10"/>
     </w:rPr>
   </w:style>
-  <w:style w:type="character" w:customStyle="1" w:styleId="SubtitleChar">
-    <w:name w:val="Subtitle Char"/>
-    <w:basedOn w:val="DefaultParagraphFont"/>
-    <w:link w:val="Subtitle"/>
+  <w:style w:type="character" w:customStyle="1" w:styleId="Sous-titreCar">
+    <w:name w:val="Sous-titre Car"/>
+    <w:basedOn w:val="Policepardfaut"/>
+    <w:link w:val="Sous-titre"/>
     <w:uiPriority w:val="11"/>
     <w:rsid w:val="001A4373"/>
     <w:rPr>
@@ -16364,9 +16861,9 @@
       <w:spacing w:val="10"/>
     </w:rPr>
   </w:style>
-  <w:style w:type="character" w:styleId="Strong">
+  <w:style w:type="character" w:styleId="lev">
     <w:name w:val="Strong"/>
-    <w:basedOn w:val="DefaultParagraphFont"/>
+    <w:basedOn w:val="Policepardfaut"/>
     <w:uiPriority w:val="22"/>
     <w:qFormat/>
     <w:rsid w:val="001A4373"/>
@@ -16376,9 +16873,9 @@
       <w:color w:val="000000" w:themeColor="text1"/>
     </w:rPr>
   </w:style>
-  <w:style w:type="character" w:styleId="Emphasis">
+  <w:style w:type="character" w:styleId="Accentuation">
     <w:name w:val="Emphasis"/>
-    <w:basedOn w:val="DefaultParagraphFont"/>
+    <w:basedOn w:val="Policepardfaut"/>
     <w:uiPriority w:val="20"/>
     <w:qFormat/>
     <w:rsid w:val="001A4373"/>
@@ -16388,11 +16885,11 @@
       <w:color w:val="auto"/>
     </w:rPr>
   </w:style>
-  <w:style w:type="paragraph" w:styleId="Quote">
+  <w:style w:type="paragraph" w:styleId="Citation">
     <w:name w:val="Quote"/>
     <w:basedOn w:val="Normal"/>
     <w:next w:val="Normal"/>
-    <w:link w:val="QuoteChar"/>
+    <w:link w:val="CitationCar"/>
     <w:uiPriority w:val="29"/>
     <w:qFormat/>
     <w:rsid w:val="001A4373"/>
@@ -16406,10 +16903,10 @@
       <w:color w:val="000000" w:themeColor="text1"/>
     </w:rPr>
   </w:style>
-  <w:style w:type="character" w:customStyle="1" w:styleId="QuoteChar">
-    <w:name w:val="Quote Char"/>
-    <w:basedOn w:val="DefaultParagraphFont"/>
-    <w:link w:val="Quote"/>
+  <w:style w:type="character" w:customStyle="1" w:styleId="CitationCar">
+    <w:name w:val="Citation Car"/>
+    <w:basedOn w:val="Policepardfaut"/>
+    <w:link w:val="Citation"/>
     <w:uiPriority w:val="29"/>
     <w:rsid w:val="001A4373"/>
     <w:rPr>
@@ -16418,11 +16915,11 @@
       <w:color w:val="000000" w:themeColor="text1"/>
     </w:rPr>
   </w:style>
-  <w:style w:type="paragraph" w:styleId="IntenseQuote">
+  <w:style w:type="paragraph" w:styleId="Citationintense">
     <w:name w:val="Intense Quote"/>
     <w:basedOn w:val="Normal"/>
     <w:next w:val="Normal"/>
-    <w:link w:val="IntenseQuoteChar"/>
+    <w:link w:val="CitationintenseCar"/>
     <w:uiPriority w:val="30"/>
     <w:qFormat/>
     <w:rsid w:val="001A4373"/>
@@ -16440,10 +16937,10 @@
       <w:color w:val="000000" w:themeColor="text1"/>
     </w:rPr>
   </w:style>
-  <w:style w:type="character" w:customStyle="1" w:styleId="IntenseQuoteChar">
-    <w:name w:val="Intense Quote Char"/>
-    <w:basedOn w:val="DefaultParagraphFont"/>
-    <w:link w:val="IntenseQuote"/>
+  <w:style w:type="character" w:customStyle="1" w:styleId="CitationintenseCar">
+    <w:name w:val="Citation intense Car"/>
+    <w:basedOn w:val="Policepardfaut"/>
+    <w:link w:val="Citationintense"/>
     <w:uiPriority w:val="30"/>
     <w:rsid w:val="001A4373"/>
     <w:rPr>
@@ -16451,9 +16948,9 @@
       <w:shd w:val="clear" w:color="auto" w:fill="F2F2F2" w:themeFill="background1" w:themeFillShade="F2"/>
     </w:rPr>
   </w:style>
-  <w:style w:type="character" w:styleId="SubtleEmphasis">
+  <w:style w:type="character" w:styleId="Accentuationlgre">
     <w:name w:val="Subtle Emphasis"/>
-    <w:basedOn w:val="DefaultParagraphFont"/>
+    <w:basedOn w:val="Policepardfaut"/>
     <w:uiPriority w:val="19"/>
     <w:qFormat/>
     <w:rsid w:val="001A4373"/>
@@ -16463,9 +16960,9 @@
       <w:color w:val="404040" w:themeColor="text1" w:themeTint="BF"/>
     </w:rPr>
   </w:style>
-  <w:style w:type="character" w:styleId="IntenseEmphasis">
+  <w:style w:type="character" w:styleId="Accentuationintense">
     <w:name w:val="Intense Emphasis"/>
-    <w:basedOn w:val="DefaultParagraphFont"/>
+    <w:basedOn w:val="Policepardfaut"/>
     <w:uiPriority w:val="21"/>
     <w:qFormat/>
     <w:rsid w:val="001A4373"/>
@@ -16477,9 +16974,9 @@
       <w:caps/>
     </w:rPr>
   </w:style>
-  <w:style w:type="character" w:styleId="SubtleReference">
+  <w:style w:type="character" w:styleId="Rfrencelgre">
     <w:name w:val="Subtle Reference"/>
-    <w:basedOn w:val="DefaultParagraphFont"/>
+    <w:basedOn w:val="Policepardfaut"/>
     <w:uiPriority w:val="31"/>
     <w:qFormat/>
     <w:rsid w:val="001A4373"/>
@@ -16489,9 +16986,9 @@
       <w:u w:val="single" w:color="7F7F7F" w:themeColor="text1" w:themeTint="80"/>
     </w:rPr>
   </w:style>
-  <w:style w:type="character" w:styleId="IntenseReference">
+  <w:style w:type="character" w:styleId="Rfrenceintense">
     <w:name w:val="Intense Reference"/>
-    <w:basedOn w:val="DefaultParagraphFont"/>
+    <w:basedOn w:val="Policepardfaut"/>
     <w:uiPriority w:val="32"/>
     <w:qFormat/>
     <w:rsid w:val="001A4373"/>
@@ -16502,9 +16999,9 @@
       <w:u w:val="single"/>
     </w:rPr>
   </w:style>
-  <w:style w:type="character" w:styleId="BookTitle">
+  <w:style w:type="character" w:styleId="Titredulivre">
     <w:name w:val="Book Title"/>
-    <w:basedOn w:val="DefaultParagraphFont"/>
+    <w:basedOn w:val="Policepardfaut"/>
     <w:uiPriority w:val="33"/>
     <w:qFormat/>
     <w:rsid w:val="001A4373"/>
@@ -16515,9 +17012,9 @@
       <w:spacing w:val="5"/>
     </w:rPr>
   </w:style>
-  <w:style w:type="character" w:styleId="PlaceholderText">
+  <w:style w:type="character" w:styleId="Textedelespacerserv">
     <w:name w:val="Placeholder Text"/>
-    <w:basedOn w:val="DefaultParagraphFont"/>
+    <w:basedOn w:val="Policepardfaut"/>
     <w:uiPriority w:val="99"/>
     <w:semiHidden/>
     <w:rsid w:val="00A762CE"/>
@@ -16525,9 +17022,9 @@
       <w:color w:val="808080"/>
     </w:rPr>
   </w:style>
-  <w:style w:type="character" w:customStyle="1" w:styleId="Textedelespacerserv">
+  <w:style w:type="character" w:customStyle="1" w:styleId="Textedelespacerserv0">
     <w:name w:val="Texte de l’espace réservé"/>
-    <w:basedOn w:val="DefaultParagraphFont"/>
+    <w:basedOn w:val="Policepardfaut"/>
     <w:uiPriority w:val="99"/>
     <w:semiHidden/>
     <w:rsid w:val="005B534A"/>
@@ -16535,9 +17032,9 @@
       <w:color w:val="808080"/>
     </w:rPr>
   </w:style>
-  <w:style w:type="character" w:styleId="CommentReference">
+  <w:style w:type="character" w:styleId="Marquedecommentaire">
     <w:name w:val="annotation reference"/>
-    <w:basedOn w:val="DefaultParagraphFont"/>
+    <w:basedOn w:val="Policepardfaut"/>
     <w:uiPriority w:val="99"/>
     <w:semiHidden/>
     <w:unhideWhenUsed/>
@@ -16547,10 +17044,10 @@
       <w:szCs w:val="16"/>
     </w:rPr>
   </w:style>
-  <w:style w:type="paragraph" w:styleId="CommentText">
+  <w:style w:type="paragraph" w:styleId="Commentaire">
     <w:name w:val="annotation text"/>
     <w:basedOn w:val="Normal"/>
-    <w:link w:val="CommentTextChar"/>
+    <w:link w:val="CommentaireCar"/>
     <w:uiPriority w:val="99"/>
     <w:semiHidden/>
     <w:unhideWhenUsed/>
@@ -16563,10 +17060,10 @@
       <w:szCs w:val="20"/>
     </w:rPr>
   </w:style>
-  <w:style w:type="character" w:customStyle="1" w:styleId="CommentTextChar">
-    <w:name w:val="Comment Text Char"/>
-    <w:basedOn w:val="DefaultParagraphFont"/>
-    <w:link w:val="CommentText"/>
+  <w:style w:type="character" w:customStyle="1" w:styleId="CommentaireCar">
+    <w:name w:val="Commentaire Car"/>
+    <w:basedOn w:val="Policepardfaut"/>
+    <w:link w:val="Commentaire"/>
     <w:uiPriority w:val="99"/>
     <w:semiHidden/>
     <w:rsid w:val="0092670C"/>
@@ -16575,11 +17072,11 @@
       <w:szCs w:val="20"/>
     </w:rPr>
   </w:style>
-  <w:style w:type="paragraph" w:styleId="CommentSubject">
+  <w:style w:type="paragraph" w:styleId="Objetducommentaire">
     <w:name w:val="annotation subject"/>
-    <w:basedOn w:val="CommentText"/>
-    <w:next w:val="CommentText"/>
-    <w:link w:val="CommentSubjectChar"/>
+    <w:basedOn w:val="Commentaire"/>
+    <w:next w:val="Commentaire"/>
+    <w:link w:val="ObjetducommentaireCar"/>
     <w:uiPriority w:val="99"/>
     <w:semiHidden/>
     <w:unhideWhenUsed/>
@@ -16589,10 +17086,10 @@
       <w:bCs/>
     </w:rPr>
   </w:style>
-  <w:style w:type="character" w:customStyle="1" w:styleId="CommentSubjectChar">
-    <w:name w:val="Comment Subject Char"/>
-    <w:basedOn w:val="CommentTextChar"/>
-    <w:link w:val="CommentSubject"/>
+  <w:style w:type="character" w:customStyle="1" w:styleId="ObjetducommentaireCar">
+    <w:name w:val="Objet du commentaire Car"/>
+    <w:basedOn w:val="CommentaireCar"/>
+    <w:link w:val="Objetducommentaire"/>
     <w:uiPriority w:val="99"/>
     <w:semiHidden/>
     <w:rsid w:val="0092670C"/>
@@ -16603,7 +17100,7 @@
       <w:szCs w:val="20"/>
     </w:rPr>
   </w:style>
-  <w:style w:type="paragraph" w:styleId="Revision">
+  <w:style w:type="paragraph" w:styleId="Rvision">
     <w:name w:val="Revision"/>
     <w:hidden/>
     <w:uiPriority w:val="99"/>
@@ -16613,9 +17110,9 @@
       <w:spacing w:after="0" w:line="240" w:lineRule="auto"/>
     </w:pPr>
   </w:style>
-  <w:style w:type="table" w:styleId="GridTable1Light-Accent6">
+  <w:style w:type="table" w:styleId="TableauGrille1Clair-Accentuation6">
     <w:name w:val="Grid Table 1 Light Accent 6"/>
-    <w:basedOn w:val="TableNormal"/>
+    <w:basedOn w:val="TableauNormal"/>
     <w:uiPriority w:val="46"/>
     <w:rsid w:val="00391FA2"/>
     <w:pPr>
@@ -16673,9 +17170,9 @@
       </w:rPr>
     </w:tblStylePr>
   </w:style>
-  <w:style w:type="character" w:styleId="UnresolvedMention">
+  <w:style w:type="character" w:styleId="Mentionnonrsolue">
     <w:name w:val="Unresolved Mention"/>
-    <w:basedOn w:val="DefaultParagraphFont"/>
+    <w:basedOn w:val="Policepardfaut"/>
     <w:uiPriority w:val="99"/>
     <w:semiHidden/>
     <w:unhideWhenUsed/>

</xml_diff>

<commit_message>
début de la programmation sur le STM32
tests pour apprendre le fonctionnement de l'IDE de STM32
</commit_message>
<xml_diff>
--- a/jeu_du_moulin_boura/rpt/jeu-du-moulin-bourquenouda-rpt-development.docx
+++ b/jeu_du_moulin_boura/rpt/jeu-du-moulin-bourquenouda-rpt-development.docx
@@ -3738,6 +3738,7 @@
                                     <w:dataBinding w:prefixMappings="xmlns:ns0='http://purl.org/dc/elements/1.1/' xmlns:ns1='http://schemas.openxmlformats.org/package/2006/metadata/core-properties' " w:xpath="/ns1:coreProperties[1]/ns0:title[1]" w:storeItemID="{6C3C8BC8-F283-45AE-878A-BAB7291924A1}"/>
                                     <w:text/>
                                   </w:sdtPr>
+                                  <w:sdtEndPr/>
                                   <w:sdtContent>
                                     <w:r>
                                       <w:rPr>
@@ -3871,6 +3872,7 @@
                               <w:dataBinding w:prefixMappings="xmlns:ns0='http://purl.org/dc/elements/1.1/' xmlns:ns1='http://schemas.openxmlformats.org/package/2006/metadata/core-properties' " w:xpath="/ns1:coreProperties[1]/ns0:title[1]" w:storeItemID="{6C3C8BC8-F283-45AE-878A-BAB7291924A1}"/>
                               <w:text/>
                             </w:sdtPr>
+                            <w:sdtEndPr/>
                             <w:sdtContent>
                               <w:r>
                                 <w:rPr>
@@ -4113,7 +4115,6 @@
                                   </w:rPr>
                                   <w:t xml:space="preserve">, </w:t>
                                 </w:r>
-                                <w:proofErr w:type="spellStart"/>
                                 <w:r>
                                   <w:rPr>
                                     <w:rFonts w:cstheme="minorHAnsi"/>
@@ -4122,7 +4123,6 @@
                                   </w:rPr>
                                   <w:t>Beruf</w:t>
                                 </w:r>
-                                <w:proofErr w:type="spellEnd"/>
                               </w:p>
                             </w:txbxContent>
                           </wps:txbx>
@@ -4172,7 +4172,6 @@
                             </w:rPr>
                             <w:t xml:space="preserve">, </w:t>
                           </w:r>
-                          <w:proofErr w:type="spellStart"/>
                           <w:r>
                             <w:rPr>
                               <w:rFonts w:cstheme="minorHAnsi"/>
@@ -4181,7 +4180,6 @@
                             </w:rPr>
                             <w:t>Beruf</w:t>
                           </w:r>
-                          <w:proofErr w:type="spellEnd"/>
                         </w:p>
                       </w:txbxContent>
                     </v:textbox>
@@ -4277,6 +4275,7 @@
                                     <w:dataBinding w:prefixMappings="xmlns:ns0='http://purl.org/dc/elements/1.1/' xmlns:ns1='http://schemas.openxmlformats.org/package/2006/metadata/core-properties' " w:xpath="/ns1:coreProperties[1]/ns0:creator[1]" w:storeItemID="{6C3C8BC8-F283-45AE-878A-BAB7291924A1}"/>
                                     <w:text/>
                                   </w:sdtPr>
+                                  <w:sdtEndPr/>
                                   <w:sdtContent>
                                     <w:r>
                                       <w:rPr>
@@ -4331,6 +4330,7 @@
                                     <w:dataBinding w:prefixMappings="xmlns:ns0='http://schemas.openxmlformats.org/officeDocument/2006/extended-properties' " w:xpath="/ns0:Properties[1]/ns0:Company[1]" w:storeItemID="{6668398D-A668-4E3E-A5EB-62B293D839F1}"/>
                                     <w:text/>
                                   </w:sdtPr>
+                                  <w:sdtEndPr/>
                                   <w:sdtContent>
                                     <w:r>
                                       <w:rPr>
@@ -4421,6 +4421,7 @@
                               <w:dataBinding w:prefixMappings="xmlns:ns0='http://purl.org/dc/elements/1.1/' xmlns:ns1='http://schemas.openxmlformats.org/package/2006/metadata/core-properties' " w:xpath="/ns1:coreProperties[1]/ns0:creator[1]" w:storeItemID="{6C3C8BC8-F283-45AE-878A-BAB7291924A1}"/>
                               <w:text/>
                             </w:sdtPr>
+                            <w:sdtEndPr/>
                             <w:sdtContent>
                               <w:r>
                                 <w:rPr>
@@ -4475,6 +4476,7 @@
                               <w:dataBinding w:prefixMappings="xmlns:ns0='http://schemas.openxmlformats.org/officeDocument/2006/extended-properties' " w:xpath="/ns0:Properties[1]/ns0:Company[1]" w:storeItemID="{6668398D-A668-4E3E-A5EB-62B293D839F1}"/>
                               <w:text/>
                             </w:sdtPr>
+                            <w:sdtEndPr/>
                             <w:sdtContent>
                               <w:r>
                                 <w:rPr>
@@ -7304,11 +7306,11 @@
         <w:lastRenderedPageBreak/>
         <w:t>Information</w:t>
       </w:r>
+      <w:bookmarkEnd w:id="3"/>
+      <w:bookmarkEnd w:id="4"/>
       <w:bookmarkEnd w:id="2"/>
       <w:bookmarkEnd w:id="1"/>
       <w:bookmarkEnd w:id="0"/>
-      <w:bookmarkEnd w:id="3"/>
-      <w:bookmarkEnd w:id="4"/>
     </w:p>
     <w:p>
       <w:pPr>
@@ -7398,29 +7400,13 @@
         <w:t xml:space="preserve"> en l</w:t>
       </w:r>
       <w:r>
-        <w:t xml:space="preserve">isant les touches et en allumant les </w:t>
-      </w:r>
-      <w:proofErr w:type="spellStart"/>
-      <w:r>
-        <w:t>LEDs</w:t>
-      </w:r>
-      <w:proofErr w:type="spellEnd"/>
-      <w:r>
-        <w:t xml:space="preserve"> en fonction des</w:t>
+        <w:t>isant les touches et en allumant les LEDs en fonction des</w:t>
       </w:r>
       <w:r>
         <w:t xml:space="preserve"> touches.</w:t>
       </w:r>
       <w:r>
-        <w:t xml:space="preserve"> La programmation de l’</w:t>
-      </w:r>
-      <w:proofErr w:type="spellStart"/>
-      <w:r>
-        <w:t>uC</w:t>
-      </w:r>
-      <w:proofErr w:type="spellEnd"/>
-      <w:r>
-        <w:t xml:space="preserve"> </w:t>
+        <w:t xml:space="preserve"> La programmation de l’uC </w:t>
       </w:r>
       <w:r>
         <w:t>se</w:t>
@@ -7530,43 +7516,7 @@
           <w:bCs/>
           <w:shd w:val="clear" w:color="auto" w:fill="FFFFFF"/>
         </w:rPr>
-        <w:t>pin de l’</w:t>
-      </w:r>
-      <w:proofErr w:type="spellStart"/>
-      <w:r>
-        <w:rPr>
-          <w:rFonts w:asciiTheme="majorHAnsi" w:hAnsiTheme="majorHAnsi" w:cstheme="majorHAnsi"/>
-          <w:bCs/>
-          <w:shd w:val="clear" w:color="auto" w:fill="FFFFFF"/>
-        </w:rPr>
-        <w:t>uC</w:t>
-      </w:r>
-      <w:proofErr w:type="spellEnd"/>
-      <w:r>
-        <w:rPr>
-          <w:rFonts w:asciiTheme="majorHAnsi" w:hAnsiTheme="majorHAnsi" w:cstheme="majorHAnsi"/>
-          <w:bCs/>
-          <w:shd w:val="clear" w:color="auto" w:fill="FFFFFF"/>
-        </w:rPr>
-        <w:t xml:space="preserve"> pour maitriser chaque touches et </w:t>
-      </w:r>
-      <w:proofErr w:type="spellStart"/>
-      <w:r>
-        <w:rPr>
-          <w:rFonts w:asciiTheme="majorHAnsi" w:hAnsiTheme="majorHAnsi" w:cstheme="majorHAnsi"/>
-          <w:bCs/>
-          <w:shd w:val="clear" w:color="auto" w:fill="FFFFFF"/>
-        </w:rPr>
-        <w:t>LEDs</w:t>
-      </w:r>
-      <w:proofErr w:type="spellEnd"/>
-      <w:r>
-        <w:rPr>
-          <w:rFonts w:asciiTheme="majorHAnsi" w:hAnsiTheme="majorHAnsi" w:cstheme="majorHAnsi"/>
-          <w:bCs/>
-          <w:shd w:val="clear" w:color="auto" w:fill="FFFFFF"/>
-        </w:rPr>
-        <w:t xml:space="preserve"> une part une, Je devrai utiliser 2 </w:t>
+        <w:t xml:space="preserve">pin de l’uC pour maitriser chaque touches et LEDs une part une, Je devrai utiliser 2 </w:t>
       </w:r>
       <w:r>
         <w:rPr>
@@ -7598,25 +7548,7 @@
           <w:bCs/>
           <w:shd w:val="clear" w:color="auto" w:fill="FFFFFF"/>
         </w:rPr>
-        <w:t xml:space="preserve">(un pour les </w:t>
-      </w:r>
-      <w:proofErr w:type="spellStart"/>
-      <w:r>
-        <w:rPr>
-          <w:rFonts w:asciiTheme="majorHAnsi" w:hAnsiTheme="majorHAnsi" w:cstheme="majorHAnsi"/>
-          <w:bCs/>
-          <w:shd w:val="clear" w:color="auto" w:fill="FFFFFF"/>
-        </w:rPr>
-        <w:t>LEDs</w:t>
-      </w:r>
-      <w:proofErr w:type="spellEnd"/>
-      <w:r>
-        <w:rPr>
-          <w:rFonts w:asciiTheme="majorHAnsi" w:hAnsiTheme="majorHAnsi" w:cstheme="majorHAnsi"/>
-          <w:bCs/>
-          <w:shd w:val="clear" w:color="auto" w:fill="FFFFFF"/>
-        </w:rPr>
-        <w:t xml:space="preserve"> et un pour les touches capacitives).</w:t>
+        <w:t>(un pour les LEDs et un pour les touches capacitives).</w:t>
       </w:r>
     </w:p>
     <w:p>
@@ -7742,25 +7674,7 @@
           <w:bCs/>
           <w:shd w:val="clear" w:color="auto" w:fill="FFFFFF"/>
         </w:rPr>
-        <w:t xml:space="preserve">du circuit de contrôle des touches et des </w:t>
-      </w:r>
-      <w:proofErr w:type="spellStart"/>
-      <w:r>
-        <w:rPr>
-          <w:rFonts w:asciiTheme="majorHAnsi" w:hAnsiTheme="majorHAnsi" w:cstheme="majorHAnsi"/>
-          <w:bCs/>
-          <w:shd w:val="clear" w:color="auto" w:fill="FFFFFF"/>
-        </w:rPr>
-        <w:t>LEDs</w:t>
-      </w:r>
-      <w:proofErr w:type="spellEnd"/>
-      <w:r>
-        <w:rPr>
-          <w:rFonts w:asciiTheme="majorHAnsi" w:hAnsiTheme="majorHAnsi" w:cstheme="majorHAnsi"/>
-          <w:bCs/>
-          <w:shd w:val="clear" w:color="auto" w:fill="FFFFFF"/>
-        </w:rPr>
-        <w:t xml:space="preserve"> sera placé sur la face BOTTOM au centre de la plaque pour</w:t>
+        <w:t>du circuit de contrôle des touches et des LEDs sera placé sur la face BOTTOM au centre de la plaque pour</w:t>
       </w:r>
       <w:r>
         <w:rPr>
@@ -7856,7 +7770,7 @@
           <v:shape id="_x0000_i1025" type="#_x0000_t75" style="width:281.45pt;height:193.6pt" o:ole="">
             <v:imagedata r:id="rId11" o:title=""/>
           </v:shape>
-          <o:OLEObject Type="Embed" ProgID="Visio.Drawing.15" ShapeID="_x0000_i1025" DrawAspect="Content" ObjectID="_1809347567" r:id="rId12"/>
+          <o:OLEObject Type="Embed" ProgID="Visio.Drawing.15" ShapeID="_x0000_i1025" DrawAspect="Content" ObjectID="_1809418533" r:id="rId12"/>
         </w:object>
       </w:r>
     </w:p>
@@ -7977,29 +7891,12 @@
           <w:b/>
           <w:bCs/>
         </w:rPr>
-        <w:t xml:space="preserve">3 : </w:t>
-      </w:r>
-      <w:proofErr w:type="spellStart"/>
-      <w:r>
-        <w:rPr>
-          <w:b/>
-          <w:bCs/>
-        </w:rPr>
-        <w:t>LEDs</w:t>
-      </w:r>
-      <w:proofErr w:type="spellEnd"/>
-    </w:p>
-    <w:p>
-      <w:r>
-        <w:t xml:space="preserve">Ces </w:t>
-      </w:r>
-      <w:proofErr w:type="spellStart"/>
-      <w:r>
-        <w:t>LEDs</w:t>
-      </w:r>
-      <w:proofErr w:type="spellEnd"/>
-      <w:r>
-        <w:t xml:space="preserve"> indiqueront le positionnement et l’équipe du joueurs. Elles seront </w:t>
+        <w:t>3 : LEDs</w:t>
+      </w:r>
+    </w:p>
+    <w:p>
+      <w:r>
+        <w:t xml:space="preserve">Ces LEDs indiqueront le positionnement et l’équipe du joueurs. Elles seront </w:t>
       </w:r>
       <w:r>
         <w:t>contrôlées par l’IC et à l’aide des touches capacitives</w:t>
@@ -8289,15 +8186,7 @@
               <w:t>Changement de boitier d</w:t>
             </w:r>
             <w:r>
-              <w:t>e l’</w:t>
-            </w:r>
-            <w:proofErr w:type="spellStart"/>
-            <w:r>
-              <w:t>uC</w:t>
-            </w:r>
-            <w:proofErr w:type="spellEnd"/>
-            <w:r>
-              <w:t xml:space="preserve"> </w:t>
+              <w:t xml:space="preserve">e l’uC </w:t>
             </w:r>
           </w:p>
         </w:tc>
@@ -8307,15 +8196,7 @@
           </w:tcPr>
           <w:p>
             <w:r>
-              <w:t xml:space="preserve">Pour avoir plus de place pendant le </w:t>
-            </w:r>
-            <w:proofErr w:type="spellStart"/>
-            <w:r>
-              <w:t>layout</w:t>
-            </w:r>
-            <w:proofErr w:type="spellEnd"/>
-            <w:r>
-              <w:t>.</w:t>
+              <w:t>Pour avoir plus de place pendant le layout.</w:t>
             </w:r>
           </w:p>
         </w:tc>
@@ -8431,7 +8312,7 @@
           <v:shape id="_x0000_i1026" type="#_x0000_t75" style="width:281.45pt;height:193.6pt" o:ole="">
             <v:imagedata r:id="rId11" o:title=""/>
           </v:shape>
-          <o:OLEObject Type="Embed" ProgID="Visio.Drawing.15" ShapeID="_x0000_i1026" DrawAspect="Content" ObjectID="_1809347568" r:id="rId14"/>
+          <o:OLEObject Type="Embed" ProgID="Visio.Drawing.15" ShapeID="_x0000_i1026" DrawAspect="Content" ObjectID="_1809418534" r:id="rId14"/>
         </w:object>
       </w:r>
     </w:p>
@@ -8756,15 +8637,7 @@
     </w:p>
     <w:p>
       <w:r>
-        <w:t xml:space="preserve">Ch1 et Ch2 sont les 2 anneaux présent sur l’empreinte du  PCB, </w:t>
-      </w:r>
-      <w:proofErr w:type="spellStart"/>
-      <w:r>
-        <w:t>Cpar</w:t>
-      </w:r>
-      <w:proofErr w:type="spellEnd"/>
-      <w:r>
-        <w:t xml:space="preserve"> est la Capacité parasite et Cs est le condensateur de sampling.</w:t>
+        <w:t>Ch1 et Ch2 sont les 2 anneaux présent sur l’empreinte du  PCB, Cpar est la Capacité parasite et Cs est le condensateur de sampling.</w:t>
       </w:r>
     </w:p>
     <w:p/>
@@ -8773,11 +8646,7 @@
         <w:t>Et</w:t>
       </w:r>
       <w:r>
-        <w:t xml:space="preserve"> on pourra donc voir que la tension </w:t>
-      </w:r>
-      <w:proofErr w:type="spellStart"/>
-      <w:r>
-        <w:t>U</w:t>
+        <w:t xml:space="preserve"> on pourra donc voir que la tension U</w:t>
       </w:r>
       <w:r>
         <w:rPr>
@@ -8785,7 +8654,6 @@
         </w:rPr>
         <w:t>Cs</w:t>
       </w:r>
-      <w:proofErr w:type="spellEnd"/>
       <w:r>
         <w:t xml:space="preserve"> change en fonction de la capacité</w:t>
       </w:r>
@@ -8830,6 +8698,9 @@
     </w:p>
     <w:p>
       <w:r>
+        <w:rPr>
+          <w:noProof/>
+        </w:rPr>
         <w:lastRenderedPageBreak/>
         <w:drawing>
           <wp:anchor distT="0" distB="0" distL="114300" distR="114300" simplePos="0" relativeHeight="251681280" behindDoc="0" locked="0" layoutInCell="1" allowOverlap="1" wp14:anchorId="3CE4D8DE" wp14:editId="02D53DB6">
@@ -9003,13 +8874,8 @@
       <w:r>
         <w:t xml:space="preserve"> </w:t>
       </w:r>
-      <w:proofErr w:type="spellStart"/>
-      <w:r>
-        <w:t>M.Egli</w:t>
-      </w:r>
-      <w:proofErr w:type="spellEnd"/>
-      <w:r>
-        <w:t xml:space="preserve"> utilisait ce MCU dans la programmation, ce qui convenait</w:t>
+      <w:r>
+        <w:t>M.Egli utilisait ce MCU dans la programmation, ce qui convenait</w:t>
       </w:r>
       <w:r>
         <w:t>.</w:t>
@@ -9021,13 +8887,8 @@
         <w:t>Q</w:t>
       </w:r>
       <w:r>
-        <w:t xml:space="preserve">uand j’effectuais la recherche des composants pour la commande, je n’ai pas pu trouver le modèle utiliser dans le code de </w:t>
-      </w:r>
-      <w:proofErr w:type="spellStart"/>
-      <w:r>
-        <w:t>M.Egli</w:t>
-      </w:r>
-      <w:proofErr w:type="spellEnd"/>
+        <w:t>uand j’effectuais la recherche des composants pour la commande, je n’ai pas pu trouver le modèle utiliser dans le code de M.Egli</w:t>
+      </w:r>
       <w:r>
         <w:t xml:space="preserve"> alors j’ai choisi d’utiliser un modèle similaire après avoir vérifié la compatibilité ce qui nous a conduit au </w:t>
       </w:r>
@@ -9092,50 +8953,16 @@
         <w:t xml:space="preserve">. Sur le MCU on a </w:t>
       </w:r>
       <w:r>
-        <w:t xml:space="preserve">6 groupes de </w:t>
-      </w:r>
-      <w:proofErr w:type="spellStart"/>
-      <w:r>
-        <w:t>touch</w:t>
-      </w:r>
-      <w:proofErr w:type="spellEnd"/>
-      <w:r>
-        <w:t xml:space="preserve"> </w:t>
-      </w:r>
-      <w:proofErr w:type="spellStart"/>
-      <w:r>
-        <w:t>sensing</w:t>
-      </w:r>
-      <w:proofErr w:type="spellEnd"/>
+        <w:t>6 groupes de touch sensing</w:t>
+      </w:r>
       <w:r>
         <w:t xml:space="preserve"> avec deux ou trois touches par groupes</w:t>
       </w:r>
       <w:r>
-        <w:t xml:space="preserve">. J’ai donc employé 4 groupes de </w:t>
-      </w:r>
-      <w:proofErr w:type="spellStart"/>
-      <w:r>
-        <w:t>touch</w:t>
-      </w:r>
-      <w:proofErr w:type="spellEnd"/>
-      <w:r>
-        <w:t xml:space="preserve"> </w:t>
-      </w:r>
-      <w:proofErr w:type="spellStart"/>
-      <w:r>
-        <w:t>sensing</w:t>
-      </w:r>
-      <w:proofErr w:type="spellEnd"/>
-      <w:r>
-        <w:t xml:space="preserve"> pour les touches capacitives. Le PCB a une LED par touche donc on a aussi 24 </w:t>
-      </w:r>
-      <w:proofErr w:type="spellStart"/>
-      <w:r>
-        <w:t>LEDs</w:t>
-      </w:r>
-      <w:proofErr w:type="spellEnd"/>
-      <w:r>
-        <w:t xml:space="preserve"> qui seront organisé en matrice de la même manière que </w:t>
+        <w:t>. J’ai donc employé 4 groupes de touch sensing</w:t>
+      </w:r>
+      <w:r>
+        <w:t xml:space="preserve"> pour les touches capacitives. Le PCB a une LED par touche donc on a aussi 24 LEDs qui seront organisé en matrice de la même manière que </w:t>
       </w:r>
     </w:p>
     <w:p>
@@ -9150,15 +8977,7 @@
       </w:pPr>
       <w:r>
         <w:lastRenderedPageBreak/>
-        <w:t xml:space="preserve">Généralité sur les </w:t>
-      </w:r>
-      <w:proofErr w:type="spellStart"/>
-      <w:r>
-        <w:t>LEDs</w:t>
-      </w:r>
-      <w:proofErr w:type="spellEnd"/>
-      <w:r>
-        <w:t xml:space="preserve"> </w:t>
+        <w:t xml:space="preserve">Généralité sur les LEDs </w:t>
       </w:r>
       <w:r>
         <w:rPr>
@@ -9181,13 +9000,8 @@
         <w:t xml:space="preserve"> sont</w:t>
       </w:r>
       <w:r>
-        <w:t xml:space="preserve"> des </w:t>
-      </w:r>
-      <w:proofErr w:type="spellStart"/>
-      <w:r>
-        <w:t>LEDs</w:t>
-      </w:r>
-      <w:proofErr w:type="spellEnd"/>
+        <w:t xml:space="preserve"> des LEDs</w:t>
+      </w:r>
       <w:r>
         <w:t xml:space="preserve"> bicolore</w:t>
       </w:r>
@@ -9198,13 +9012,8 @@
         <w:t xml:space="preserve"> de couleur rouge et vert</w:t>
       </w:r>
       <w:r>
-        <w:t xml:space="preserve"> produites par </w:t>
-      </w:r>
-      <w:proofErr w:type="spellStart"/>
-      <w:r>
-        <w:t>Kigbright</w:t>
-      </w:r>
-      <w:proofErr w:type="spellEnd"/>
+        <w:t xml:space="preserve"> produites par Kigbright</w:t>
+      </w:r>
       <w:r>
         <w:t xml:space="preserve">. Elles sont </w:t>
       </w:r>
@@ -9224,15 +9033,7 @@
         <w:t xml:space="preserve"> est en possession de la case -&gt; Rouge pour un joueur, vert pour l’autre et orange/rien quand la case est vide.</w:t>
       </w:r>
       <w:r>
-        <w:t xml:space="preserve"> Éteindre les </w:t>
-      </w:r>
-      <w:proofErr w:type="spellStart"/>
-      <w:r>
-        <w:t>LEDs</w:t>
-      </w:r>
-      <w:proofErr w:type="spellEnd"/>
-      <w:r>
-        <w:t xml:space="preserve"> quand la case est inoccupé</w:t>
+        <w:t xml:space="preserve"> Éteindre les LEDs quand la case est inoccupé</w:t>
       </w:r>
       <w:r>
         <w:t>e</w:t>
@@ -9277,29 +9078,13 @@
         <w:t xml:space="preserve"> tandis que la LED verte consomme </w:t>
       </w:r>
       <w:r>
-        <w:t xml:space="preserve">20mA à 2.1V </w:t>
-      </w:r>
-      <w:proofErr w:type="spellStart"/>
-      <w:r>
-        <w:t>typ</w:t>
-      </w:r>
-      <w:proofErr w:type="spellEnd"/>
-      <w:r>
-        <w:t>.</w:t>
+        <w:t>20mA à 2.1V typ.</w:t>
       </w:r>
       <w:r>
         <w:t xml:space="preserve"> Avec le même maximum de 2.5V.</w:t>
       </w:r>
       <w:r>
-        <w:t xml:space="preserve"> voici le </w:t>
-      </w:r>
-      <w:proofErr w:type="spellStart"/>
-      <w:r>
-        <w:t>Pinout</w:t>
-      </w:r>
-      <w:proofErr w:type="spellEnd"/>
-      <w:r>
-        <w:t xml:space="preserve"> du composant</w:t>
+        <w:t xml:space="preserve"> voici le Pinout du composant</w:t>
       </w:r>
       <w:r>
         <w:t xml:space="preserve"> prit dans le datasheet.</w:t>
@@ -9361,13 +9146,8 @@
         </w:drawing>
       </w:r>
       <w:r>
-        <w:t xml:space="preserve">Idéalement, pas plus que deux </w:t>
-      </w:r>
-      <w:proofErr w:type="spellStart"/>
-      <w:r>
-        <w:t>LEDs</w:t>
-      </w:r>
-      <w:proofErr w:type="spellEnd"/>
+        <w:t>Idéalement, pas plus que deux LEDs</w:t>
+      </w:r>
       <w:r>
         <w:t xml:space="preserve"> (donc un de ces composant)</w:t>
       </w:r>
@@ -9381,15 +9161,7 @@
         <w:t xml:space="preserve">Je vais utiliser un code que j’ai écris </w:t>
       </w:r>
       <w:r>
-        <w:t xml:space="preserve">il y a un moment pour gérer les </w:t>
-      </w:r>
-      <w:proofErr w:type="spellStart"/>
-      <w:r>
-        <w:t>LEDs</w:t>
-      </w:r>
-      <w:proofErr w:type="spellEnd"/>
-      <w:r>
-        <w:t xml:space="preserve"> </w:t>
+        <w:t xml:space="preserve">il y a un moment pour gérer les LEDs </w:t>
       </w:r>
       <w:r>
         <w:t>de façon</w:t>
@@ -9401,15 +9173,7 @@
         <w:t>ait</w:t>
       </w:r>
       <w:r>
-        <w:t xml:space="preserve"> l’impression que toutes les </w:t>
-      </w:r>
-      <w:proofErr w:type="spellStart"/>
-      <w:r>
-        <w:t>LEDs</w:t>
-      </w:r>
-      <w:proofErr w:type="spellEnd"/>
-      <w:r>
-        <w:t xml:space="preserve"> allumé le soit en même temps.</w:t>
+        <w:t xml:space="preserve"> l’impression que toutes les LEDs allumé le soit en même temps.</w:t>
       </w:r>
       <w:r>
         <w:t xml:space="preserve"> Pour ce faire je dois simplement </w:t>
@@ -9886,15 +9650,7 @@
         <w:t xml:space="preserve"> les parties en groupes qui sont les même que dans le schéma bloc plus </w:t>
       </w:r>
       <w:r>
-        <w:t xml:space="preserve">le connecteur TC2030 pour programmer le STM32L072CZU6 qui contrôlera la matrice de </w:t>
-      </w:r>
-      <w:proofErr w:type="spellStart"/>
-      <w:r>
-        <w:t>LEDs</w:t>
-      </w:r>
-      <w:proofErr w:type="spellEnd"/>
-      <w:r>
-        <w:t xml:space="preserve"> et de touches</w:t>
+        <w:t>le connecteur TC2030 pour programmer le STM32L072CZU6 qui contrôlera la matrice de LEDs et de touches</w:t>
       </w:r>
       <w:r>
         <w:t xml:space="preserve"> et que j’ai séparé les deux matrices sur deux pages différentes.</w:t>
@@ -9980,168 +9736,155 @@
         <w:t>Dans ce groupe, j’ai ajouté</w:t>
       </w:r>
       <w:r>
+        <w:t xml:space="preserve"> toutes les connexions des deux matrices</w:t>
+      </w:r>
+      <w:r>
+        <w:t xml:space="preserve"> et</w:t>
+      </w:r>
+      <w:r>
         <w:t xml:space="preserve"> </w:t>
       </w:r>
       <w:r>
-        <w:t>toutes les connexions des deux matrices</w:t>
-      </w:r>
-      <w:r>
-        <w:t xml:space="preserve"> et</w:t>
+        <w:t>les condensateurs de découplage</w:t>
+      </w:r>
+      <w:r>
+        <w:t>.</w:t>
       </w:r>
       <w:r>
         <w:t xml:space="preserve"> </w:t>
       </w:r>
       <w:r>
-        <w:t>les condensateurs de découplage</w:t>
+        <w:t>J’ai été porté à faire des modifications dans la partie découplage pour être</w:t>
+      </w:r>
+      <w:r>
+        <w:t xml:space="preserve"> conforme au</w:t>
+      </w:r>
+      <w:r>
+        <w:t>x</w:t>
+      </w:r>
+      <w:r>
+        <w:t xml:space="preserve"> instructions demandées par STMicro</w:t>
+      </w:r>
+      <w:r>
+        <w:t xml:space="preserve">electronics car </w:t>
+      </w:r>
+      <w:r>
+        <w:t xml:space="preserve">le MCU imposé dans mon cahier des charges n’était pas le même que celui </w:t>
+      </w:r>
+      <w:r>
+        <w:t xml:space="preserve">que M. Egli </w:t>
+      </w:r>
+      <w:r>
+        <w:t>a</w:t>
+      </w:r>
+      <w:r>
+        <w:t xml:space="preserve"> utilis</w:t>
+      </w:r>
+      <w:r>
+        <w:t>é</w:t>
+      </w:r>
+      <w:r>
+        <w:t xml:space="preserve"> dans </w:t>
+      </w:r>
+      <w:r>
+        <w:t xml:space="preserve">le schéma de </w:t>
+      </w:r>
+      <w:r>
+        <w:t>son prototype</w:t>
+      </w:r>
+      <w:r>
+        <w:t xml:space="preserve">. </w:t>
+      </w:r>
+      <w:r>
+        <w:t xml:space="preserve">J’ai </w:t>
+      </w:r>
+      <w:r>
+        <w:t>contrôlé</w:t>
+      </w:r>
+      <w:r>
+        <w:t xml:space="preserve"> </w:t>
+      </w:r>
+      <w:r>
+        <w:t>quel</w:t>
+      </w:r>
+      <w:r>
+        <w:t>le</w:t>
+      </w:r>
+      <w:r>
+        <w:t>s pins</w:t>
+      </w:r>
+      <w:r>
+        <w:t xml:space="preserve"> sont valables à être utilisé </w:t>
+      </w:r>
+      <w:r>
+        <w:t xml:space="preserve">à l’aide </w:t>
+      </w:r>
+      <w:r>
+        <w:t>du logiciel STM</w:t>
+      </w:r>
+      <w:r>
+        <w:t>32CubeIDE</w:t>
+      </w:r>
+      <w:r>
+        <w:t xml:space="preserve">. Voici le paramétrage que j’ai utilisé </w:t>
+      </w:r>
+      <w:r>
+        <w:t xml:space="preserve">pour voir si on avait assez de pins pour le </w:t>
+      </w:r>
+      <w:r>
+        <w:t xml:space="preserve">jeu et pour voir </w:t>
+      </w:r>
+      <w:r>
+        <w:t>quels pins</w:t>
+      </w:r>
+      <w:r>
+        <w:t xml:space="preserve"> étaient </w:t>
+      </w:r>
+      <w:r>
+        <w:t xml:space="preserve">disponible. </w:t>
+      </w:r>
+    </w:p>
+    <w:p>
+      <w:r>
+        <w:t>On pe</w:t>
+      </w:r>
+      <w:r>
+        <w:t xml:space="preserve">ut voir </w:t>
+      </w:r>
+      <w:r>
+        <w:t xml:space="preserve">que les pins utilisés dans le schéma sont </w:t>
+      </w:r>
+      <w:r>
+        <w:t>différent</w:t>
+      </w:r>
+      <w:r>
+        <w:t>e</w:t>
+      </w:r>
+      <w:r>
+        <w:t>s</w:t>
       </w:r>
       <w:r>
         <w:t>.</w:t>
       </w:r>
       <w:r>
+        <w:t xml:space="preserve">  </w:t>
+      </w:r>
+      <w:r>
+        <w:t>C</w:t>
+      </w:r>
+      <w:r>
+        <w:t xml:space="preserve">’est </w:t>
+      </w:r>
+      <w:r>
+        <w:t>parce-que j’ai utilisé la méthode du pin-swapping</w:t>
+      </w:r>
+      <w:r>
+        <w:t xml:space="preserve"> sur Altium</w:t>
+      </w:r>
+      <w:r>
         <w:t xml:space="preserve"> </w:t>
       </w:r>
       <w:r>
-        <w:t>J’ai été porté à faire des modifications dans la partie découplage pour être</w:t>
-      </w:r>
-      <w:r>
-        <w:t xml:space="preserve"> conforme au</w:t>
-      </w:r>
-      <w:r>
-        <w:t>x</w:t>
-      </w:r>
-      <w:r>
-        <w:t xml:space="preserve"> instructions demandées par STMicro</w:t>
-      </w:r>
-      <w:r>
-        <w:t xml:space="preserve">electronics car </w:t>
-      </w:r>
-      <w:r>
-        <w:t xml:space="preserve">le MCU imposé dans mon cahier des charges n’était pas le même que celui </w:t>
-      </w:r>
-      <w:r>
-        <w:t xml:space="preserve">que M. Egli </w:t>
-      </w:r>
-      <w:r>
-        <w:t>a</w:t>
-      </w:r>
-      <w:r>
-        <w:t xml:space="preserve"> utilis</w:t>
-      </w:r>
-      <w:r>
-        <w:t>é</w:t>
-      </w:r>
-      <w:r>
-        <w:t xml:space="preserve"> dans </w:t>
-      </w:r>
-      <w:r>
-        <w:t xml:space="preserve">le schéma de </w:t>
-      </w:r>
-      <w:r>
-        <w:t>son prototype</w:t>
-      </w:r>
-      <w:r>
-        <w:t xml:space="preserve">. </w:t>
-      </w:r>
-      <w:r>
-        <w:t xml:space="preserve">J’ai </w:t>
-      </w:r>
-      <w:r>
-        <w:t>contrôlé</w:t>
-      </w:r>
-      <w:r>
-        <w:t xml:space="preserve"> </w:t>
-      </w:r>
-      <w:r>
-        <w:t>quel</w:t>
-      </w:r>
-      <w:r>
-        <w:t>le</w:t>
-      </w:r>
-      <w:r>
-        <w:t>s pins</w:t>
-      </w:r>
-      <w:r>
-        <w:t xml:space="preserve"> sont valables à être utilisé </w:t>
-      </w:r>
-      <w:r>
-        <w:t xml:space="preserve">à l’aide </w:t>
-      </w:r>
-      <w:r>
-        <w:t>du logiciel STM</w:t>
-      </w:r>
-      <w:r>
-        <w:t>32CubeIDE</w:t>
-      </w:r>
-      <w:r>
-        <w:t xml:space="preserve">. Voici le paramétrage que j’ai utilisé </w:t>
-      </w:r>
-      <w:r>
-        <w:t xml:space="preserve">pour voir si on avait assez de pins pour le </w:t>
-      </w:r>
-      <w:r>
-        <w:t xml:space="preserve">jeu et pour voir </w:t>
-      </w:r>
-      <w:r>
-        <w:t>quels pins</w:t>
-      </w:r>
-      <w:r>
-        <w:t xml:space="preserve"> étaient </w:t>
-      </w:r>
-      <w:r>
-        <w:t xml:space="preserve">disponible. </w:t>
-      </w:r>
-    </w:p>
-    <w:p>
-      <w:r>
-        <w:t>On pe</w:t>
-      </w:r>
-      <w:r>
-        <w:t xml:space="preserve">ut voir </w:t>
-      </w:r>
-      <w:r>
-        <w:t xml:space="preserve">que les pins utilisés dans le schéma sont </w:t>
-      </w:r>
-      <w:r>
-        <w:t>différent</w:t>
-      </w:r>
-      <w:r>
-        <w:t>e</w:t>
-      </w:r>
-      <w:r>
-        <w:t>s</w:t>
-      </w:r>
-      <w:r>
-        <w:t>.</w:t>
-      </w:r>
-      <w:r>
-        <w:t xml:space="preserve">  </w:t>
-      </w:r>
-      <w:r>
-        <w:t>C</w:t>
-      </w:r>
-      <w:r>
-        <w:t xml:space="preserve">’est </w:t>
-      </w:r>
-      <w:r>
-        <w:t>parce-que j’ai utilisé la méthode du pin-</w:t>
-      </w:r>
-      <w:proofErr w:type="spellStart"/>
-      <w:r>
-        <w:t>swapping</w:t>
-      </w:r>
-      <w:proofErr w:type="spellEnd"/>
-      <w:r>
-        <w:t xml:space="preserve"> sur </w:t>
-      </w:r>
-      <w:proofErr w:type="spellStart"/>
-      <w:r>
-        <w:t>Altium</w:t>
-      </w:r>
-      <w:proofErr w:type="spellEnd"/>
-      <w:r>
-        <w:t xml:space="preserve"> </w:t>
-      </w:r>
-      <w:r>
         <w:t xml:space="preserve">qui facilite le routage en me permettant de changer </w:t>
       </w:r>
       <w:r>
@@ -10151,15 +9894,7 @@
         <w:t>des touches peuvent être interchangé car ce sera juste a la programmation qu</w:t>
       </w:r>
       <w:r>
-        <w:t xml:space="preserve">’il faudra faire attention à quelle pin contrôle quoi. C’est pareil pour les </w:t>
-      </w:r>
-      <w:proofErr w:type="spellStart"/>
-      <w:r>
-        <w:t>LEDs</w:t>
-      </w:r>
-      <w:proofErr w:type="spellEnd"/>
-      <w:r>
-        <w:t xml:space="preserve">, ce sera qu’au moment de la programmation que </w:t>
+        <w:t xml:space="preserve">’il faudra faire attention à quelle pin contrôle quoi. C’est pareil pour les LEDs, ce sera qu’au moment de la programmation que </w:t>
       </w:r>
       <w:r>
         <w:t>savoir quelle pin contrôle les colonnes ou les lignes de la matrice.</w:t>
@@ -10286,13 +10021,8 @@
         <w:t xml:space="preserve">B et C) </w:t>
       </w:r>
       <w:r>
-        <w:t>de pin-</w:t>
-      </w:r>
-      <w:proofErr w:type="spellStart"/>
-      <w:r>
-        <w:t>swapping</w:t>
-      </w:r>
-      <w:proofErr w:type="spellEnd"/>
+        <w:t>de pin-swapping</w:t>
+      </w:r>
       <w:r>
         <w:t xml:space="preserve">. Le groupe A sert pour les </w:t>
       </w:r>
@@ -10303,33 +10033,23 @@
         <w:t xml:space="preserve">, le </w:t>
       </w:r>
       <w:r>
-        <w:t xml:space="preserve">groupe B sert au contrôle de la matrice de </w:t>
-      </w:r>
-      <w:proofErr w:type="spellStart"/>
-      <w:r>
-        <w:t>LEDs</w:t>
-      </w:r>
-      <w:proofErr w:type="spellEnd"/>
-      <w:r>
-        <w:t xml:space="preserve"> et le groupe C est pour les condensateurs de sampling</w:t>
-      </w:r>
-      <w:r>
-        <w:t xml:space="preserve"> et les point de test. C</w:t>
-      </w:r>
-      <w:r>
-        <w:t xml:space="preserve">omme je l’avais dit avant, </w:t>
-      </w:r>
-      <w:r>
-        <w:t xml:space="preserve">tous </w:t>
+        <w:t>groupe B sert au contrôle de la matrice de LEDs et le groupe C est pour les condensateurs de sampling</w:t>
+      </w:r>
+      <w:r>
+        <w:t xml:space="preserve"> et les point de test. Comme je l’avais dit avant, tou</w:t>
+      </w:r>
+      <w:r>
+        <w:t>te</w:t>
+      </w:r>
+      <w:r>
+        <w:t xml:space="preserve">s </w:t>
       </w:r>
       <w:r>
         <w:t xml:space="preserve">les pins de </w:t>
       </w:r>
-      <w:proofErr w:type="spellStart"/>
-      <w:r>
-        <w:t>chaques</w:t>
-      </w:r>
-      <w:proofErr w:type="spellEnd"/>
+      <w:r>
+        <w:t>chaque</w:t>
+      </w:r>
       <w:r>
         <w:t xml:space="preserve"> groupes sont</w:t>
       </w:r>
@@ -10361,19 +10081,17 @@
         <w:t xml:space="preserve"> </w:t>
       </w:r>
       <w:r>
-        <w:t xml:space="preserve"> Voici la fenêtre de pin-</w:t>
-      </w:r>
-      <w:proofErr w:type="spellStart"/>
-      <w:r>
-        <w:t>swapping</w:t>
-      </w:r>
-      <w:proofErr w:type="spellEnd"/>
+        <w:t xml:space="preserve"> Voici la fenêtre de pin-swapping</w:t>
+      </w:r>
       <w:r>
         <w:t> :</w:t>
       </w:r>
     </w:p>
     <w:p>
       <w:r>
+        <w:rPr>
+          <w:noProof/>
+        </w:rPr>
         <w:drawing>
           <wp:inline distT="0" distB="0" distL="0" distR="0" wp14:anchorId="5CE0F662" wp14:editId="4EDCA143">
             <wp:extent cx="5760720" cy="3251835"/>
@@ -10521,37 +10239,7 @@
           <w:b/>
           <w:bCs/>
         </w:rPr>
-        <w:t xml:space="preserve">Groupe </w:t>
-      </w:r>
-      <w:r>
-        <w:rPr>
-          <w:b/>
-          <w:bCs/>
-        </w:rPr>
-        <w:t>4</w:t>
-      </w:r>
-      <w:r>
-        <w:rPr>
-          <w:b/>
-          <w:bCs/>
-        </w:rPr>
-        <w:t xml:space="preserve"> : Matrice de </w:t>
-      </w:r>
-      <w:proofErr w:type="spellStart"/>
-      <w:r>
-        <w:rPr>
-          <w:b/>
-          <w:bCs/>
-        </w:rPr>
-        <w:t>LEDs</w:t>
-      </w:r>
-      <w:proofErr w:type="spellEnd"/>
-      <w:r>
-        <w:rPr>
-          <w:b/>
-          <w:bCs/>
-        </w:rPr>
-        <w:t>.</w:t>
+        <w:t>Groupe 4 : Matrice de LEDs.</w:t>
       </w:r>
       <w:r>
         <w:rPr>
@@ -10561,32 +10249,150 @@
         <w:t xml:space="preserve"> </w:t>
       </w:r>
       <w:r>
-        <w:t xml:space="preserve">Là aussi, j’ai simplement terminé la matrice de </w:t>
-      </w:r>
-      <w:proofErr w:type="spellStart"/>
-      <w:r>
-        <w:t>LEDs</w:t>
-      </w:r>
-      <w:proofErr w:type="spellEnd"/>
-      <w:r>
-        <w:t>.</w:t>
+        <w:t>Là aussi, j’ai simplement terminé la matrice de LEDs.</w:t>
+      </w:r>
+    </w:p>
+    <w:p>
+      <w:r>
+        <w:rPr>
+          <w:b/>
+          <w:bCs/>
+        </w:rPr>
+        <w:t xml:space="preserve">Groupe 5 : Alimentation. </w:t>
+      </w:r>
+      <w:r>
+        <w:t xml:space="preserve">Cette partie </w:t>
+      </w:r>
+      <w:r>
+        <w:t xml:space="preserve">était dans le schéma bloc mais absente dans le </w:t>
+      </w:r>
+      <w:r>
+        <w:t xml:space="preserve">prototype de M.Egli et j’ai donc du la créer entièrement. En lisant le cahier </w:t>
+      </w:r>
+      <w:r>
+        <w:t>des charges</w:t>
+      </w:r>
+      <w:r>
+        <w:t xml:space="preserve"> on m’a dit qu’il fallait un</w:t>
+      </w:r>
+      <w:r>
+        <w:t xml:space="preserve">e tension d’alimentation de 5V réguler à 3.3V pour le MCU. J’ai donc </w:t>
+      </w:r>
+      <w:r>
+        <w:t>cherché</w:t>
+      </w:r>
+      <w:r>
+        <w:t xml:space="preserve"> un régulateur qui serait utilisable </w:t>
+      </w:r>
+      <w:r>
+        <w:t xml:space="preserve">et ensuite j’ai recherché des circuits de protection </w:t>
+      </w:r>
+      <w:r>
+        <w:t>à la polarisation inversé.</w:t>
+      </w:r>
+      <w:r>
+        <w:t xml:space="preserve"> Un papier</w:t>
+      </w:r>
+      <w:r>
+        <w:t xml:space="preserve"> du fabricant Onsemi</w:t>
+      </w:r>
+      <w:r>
+        <w:t xml:space="preserve"> m’a été recommandé par mon frère au sujet des différent types de protection et je l’ai utilisé pour créer et dimensionné mo</w:t>
+      </w:r>
+      <w:r>
+        <w:t>n circuit de protection. Il est composé d’une diode zener, d’une résistance et d’un MOSFET canal P. Le fonctionnement est décrit dans l’article (</w:t>
+      </w:r>
+      <w:hyperlink r:id="rId27" w:history="1">
+        <w:r>
+          <w:rPr>
+            <w:rStyle w:val="Lienhypertexte"/>
+          </w:rPr>
+          <w:t>AND90146 - MOSFET Selection for Reverse Polarity Protection</w:t>
+        </w:r>
+      </w:hyperlink>
+      <w:r>
+        <w:t xml:space="preserve">) </w:t>
+      </w:r>
+      <w:r>
+        <w:t xml:space="preserve">mais globalement, en fonctionnement normale, </w:t>
+      </w:r>
+      <w:r>
+        <w:t>Le MOSFET est polarisé</w:t>
+      </w:r>
+      <w:r>
+        <w:t xml:space="preserve"> par une tension imposé</w:t>
+      </w:r>
+      <w:r>
+        <w:t>e</w:t>
+      </w:r>
+      <w:r>
+        <w:t xml:space="preserve"> par la tension zener de la diode </w:t>
+      </w:r>
+      <w:r>
+        <w:t>et le courant traversant la diode est lui-même limité par la résistance</w:t>
+      </w:r>
+      <w:r>
+        <w:t xml:space="preserve">. En quand la polarité est inversée, la tension G-S du MOSFET </w:t>
+      </w:r>
+      <w:r>
+        <w:t>serait</w:t>
+      </w:r>
+      <w:r>
+        <w:t xml:space="preserve"> bloqué à </w:t>
+      </w:r>
+      <w:r>
+        <w:t>~0.7V ce qui empêche le MOSFET de conduire</w:t>
+      </w:r>
+      <w:r>
+        <w:t xml:space="preserve"> et amène l</w:t>
+      </w:r>
+      <w:r>
+        <w:t xml:space="preserve">a </w:t>
+      </w:r>
+      <w:r>
+        <w:t xml:space="preserve">chute de </w:t>
+      </w:r>
+      <w:r>
+        <w:t xml:space="preserve">tension D-S </w:t>
+      </w:r>
+      <w:r>
+        <w:t>à</w:t>
+      </w:r>
+      <w:r>
+        <w:t xml:space="preserve"> augmente</w:t>
+      </w:r>
+      <w:r>
+        <w:t>r et</w:t>
+      </w:r>
+      <w:r>
+        <w:t xml:space="preserve"> empêche le circuit </w:t>
+      </w:r>
+      <w:r>
+        <w:t>de subir un</w:t>
+      </w:r>
+      <w:r>
+        <w:t>e</w:t>
+      </w:r>
+      <w:r>
+        <w:t xml:space="preserve"> chute de tension inverse de plus de quelques </w:t>
+      </w:r>
+      <w:r>
+        <w:t>microvolts</w:t>
+      </w:r>
+      <w:r>
+        <w:t>. J’ai fait une simulation falstad pour démontrer le fonctionnement du circuit de protection</w:t>
+      </w:r>
+      <w:r>
+        <w:t> :</w:t>
       </w:r>
     </w:p>
     <w:p>
       <w:r>
         <w:drawing>
-          <wp:anchor distT="0" distB="0" distL="114300" distR="114300" simplePos="0" relativeHeight="251684352" behindDoc="0" locked="0" layoutInCell="1" allowOverlap="1" wp14:anchorId="16BEFE77" wp14:editId="1394A318">
-            <wp:simplePos x="0" y="0"/>
-            <wp:positionH relativeFrom="margin">
-              <wp:posOffset>563525</wp:posOffset>
-            </wp:positionH>
-            <wp:positionV relativeFrom="paragraph">
-              <wp:posOffset>2613512</wp:posOffset>
-            </wp:positionV>
-            <wp:extent cx="4114165" cy="3752850"/>
-            <wp:effectExtent l="0" t="0" r="635" b="0"/>
-            <wp:wrapTopAndBottom/>
-            <wp:docPr id="643850376" name="Image 1" descr="Une image contenant capture d’écran, diagramme, texte, conception&#10;&#10;Le contenu généré par l’IA peut être incorrect."/>
+          <wp:inline distT="0" distB="0" distL="0" distR="0" wp14:anchorId="3DCEDEA9" wp14:editId="40F55D14">
+            <wp:extent cx="5760720" cy="2360295"/>
+            <wp:effectExtent l="0" t="0" r="0" b="1905"/>
+            <wp:docPr id="164622864" name="Image 1" descr="Une image contenant capture d’écran, diagramme&#10;&#10;Le contenu généré par l’IA peut être incorrect."/>
             <wp:cNvGraphicFramePr>
               <a:graphicFrameLocks xmlns:a="http://schemas.openxmlformats.org/drawingml/2006/main" noChangeAspect="1"/>
             </wp:cNvGraphicFramePr>
@@ -10594,242 +10400,93 @@
               <a:graphicData uri="http://schemas.openxmlformats.org/drawingml/2006/picture">
                 <pic:pic xmlns:pic="http://schemas.openxmlformats.org/drawingml/2006/picture">
                   <pic:nvPicPr>
-                    <pic:cNvPr id="643850376" name="Image 1" descr="Une image contenant capture d’écran, diagramme, texte, conception&#10;&#10;Le contenu généré par l’IA peut être incorrect."/>
+                    <pic:cNvPr id="164622864" name="Image 1" descr="Une image contenant capture d’écran, diagramme&#10;&#10;Le contenu généré par l’IA peut être incorrect."/>
                     <pic:cNvPicPr/>
                   </pic:nvPicPr>
-                  <pic:blipFill rotWithShape="1">
-                    <a:blip r:embed="rId27">
-                      <a:extLst>
-                        <a:ext uri="{28A0092B-C50C-407E-A947-70E740481C1C}">
-                          <a14:useLocalDpi xmlns:a14="http://schemas.microsoft.com/office/drawing/2010/main" val="0"/>
-                        </a:ext>
-                      </a:extLst>
-                    </a:blip>
-                    <a:srcRect l="8306"/>
-                    <a:stretch/>
+                  <pic:blipFill>
+                    <a:blip r:embed="rId28"/>
+                    <a:stretch>
+                      <a:fillRect/>
+                    </a:stretch>
                   </pic:blipFill>
-                  <pic:spPr bwMode="auto">
+                  <pic:spPr>
                     <a:xfrm>
                       <a:off x="0" y="0"/>
-                      <a:ext cx="4114165" cy="3752850"/>
+                      <a:ext cx="5760720" cy="2360295"/>
                     </a:xfrm>
                     <a:prstGeom prst="rect">
                       <a:avLst/>
                     </a:prstGeom>
-                    <a:ln>
-                      <a:noFill/>
-                    </a:ln>
-                    <a:extLst>
-                      <a:ext uri="{53640926-AAD7-44D8-BBD7-CCE9431645EC}">
-                        <a14:shadowObscured xmlns:a14="http://schemas.microsoft.com/office/drawing/2010/main"/>
-                      </a:ext>
-                    </a:extLst>
                   </pic:spPr>
                 </pic:pic>
               </a:graphicData>
             </a:graphic>
-            <wp14:sizeRelH relativeFrom="margin">
-              <wp14:pctWidth>0</wp14:pctWidth>
-            </wp14:sizeRelH>
-            <wp14:sizeRelV relativeFrom="margin">
-              <wp14:pctHeight>0</wp14:pctHeight>
-            </wp14:sizeRelV>
-          </wp:anchor>
+          </wp:inline>
         </w:drawing>
       </w:r>
+    </w:p>
+    <w:p>
+      <w:r>
+        <w:t xml:space="preserve">On peut </w:t>
+      </w:r>
+      <w:r>
+        <w:t xml:space="preserve">donc voir sur la simulation que quand la tension </w:t>
+      </w:r>
+      <w:r>
+        <w:t>du générateur est en alternance négative,</w:t>
+      </w:r>
+      <w:r>
+        <w:t xml:space="preserve"> la</w:t>
+      </w:r>
+      <w:r>
+        <w:t xml:space="preserve"> tension de la</w:t>
+      </w:r>
+      <w:r>
+        <w:t xml:space="preserve"> résistance de charge de 1k</w:t>
+      </w:r>
       <w:r>
         <w:rPr>
-          <w:b/>
-          <w:bCs/>
+          <w:rFonts w:cstheme="minorHAnsi"/>
         </w:rPr>
-        <w:t xml:space="preserve">Groupe 5 : Alimentation. </w:t>
-      </w:r>
-      <w:r>
-        <w:t xml:space="preserve">Cette partie </w:t>
-      </w:r>
-      <w:r>
-        <w:t xml:space="preserve">était dans le schéma bloc mais absente dans le </w:t>
-      </w:r>
-      <w:r>
-        <w:t xml:space="preserve">prototype de </w:t>
-      </w:r>
-      <w:proofErr w:type="spellStart"/>
-      <w:r>
-        <w:t>M.Egli</w:t>
-      </w:r>
-      <w:proofErr w:type="spellEnd"/>
-      <w:r>
-        <w:t xml:space="preserve"> et j’ai donc du la créer entièrement. En lisant le cahier </w:t>
-      </w:r>
-      <w:r>
-        <w:t>des charges</w:t>
-      </w:r>
-      <w:r>
-        <w:t xml:space="preserve"> on m’a dit qu’il fallait un</w:t>
-      </w:r>
-      <w:r>
-        <w:t xml:space="preserve">e tension d’alimentation de 5V réguler à 3.3V pour le MCU. J’ai donc </w:t>
-      </w:r>
-      <w:r>
-        <w:t>cherché</w:t>
-      </w:r>
-      <w:r>
-        <w:t xml:space="preserve"> un régulateur qui serait utilisable </w:t>
-      </w:r>
-      <w:r>
-        <w:t xml:space="preserve">et ensuite j’ai recherché des circuits de protection </w:t>
-      </w:r>
-      <w:r>
-        <w:t>à la polarisation inversé.</w:t>
-      </w:r>
-      <w:r>
-        <w:t xml:space="preserve"> Un papier</w:t>
-      </w:r>
-      <w:r>
-        <w:t xml:space="preserve"> du fabricant </w:t>
-      </w:r>
-      <w:proofErr w:type="spellStart"/>
-      <w:r>
-        <w:t>Onsemi</w:t>
-      </w:r>
-      <w:proofErr w:type="spellEnd"/>
-      <w:r>
-        <w:t xml:space="preserve"> m’a été recommandé par mon frère au sujet des différent types de protection et je l’ai utilisé pour créer et dimensionné mo</w:t>
-      </w:r>
-      <w:r>
-        <w:t xml:space="preserve">n circuit de protection. Il est composé d’une diode </w:t>
-      </w:r>
-      <w:proofErr w:type="spellStart"/>
-      <w:r>
-        <w:t>zener</w:t>
-      </w:r>
-      <w:proofErr w:type="spellEnd"/>
-      <w:r>
-        <w:t>, d’une résistance et d’un MOSFET canal P. Le fonctionnement est décrit dans l’article (</w:t>
-      </w:r>
-      <w:hyperlink r:id="rId28" w:history="1">
-        <w:r>
-          <w:rPr>
-            <w:rStyle w:val="Lienhypertexte"/>
-          </w:rPr>
-          <w:t xml:space="preserve">AND90146 - MOSFET </w:t>
-        </w:r>
-        <w:proofErr w:type="spellStart"/>
-        <w:r>
-          <w:rPr>
-            <w:rStyle w:val="Lienhypertexte"/>
-          </w:rPr>
-          <w:t>Selection</w:t>
-        </w:r>
-        <w:proofErr w:type="spellEnd"/>
-        <w:r>
-          <w:rPr>
-            <w:rStyle w:val="Lienhypertexte"/>
-          </w:rPr>
-          <w:t xml:space="preserve"> for Reverse </w:t>
-        </w:r>
-        <w:proofErr w:type="spellStart"/>
-        <w:r>
-          <w:rPr>
-            <w:rStyle w:val="Lienhypertexte"/>
-          </w:rPr>
-          <w:t>Polarity</w:t>
-        </w:r>
-        <w:proofErr w:type="spellEnd"/>
-        <w:r>
-          <w:rPr>
-            <w:rStyle w:val="Lienhypertexte"/>
-          </w:rPr>
-          <w:t xml:space="preserve"> Protection</w:t>
-        </w:r>
-      </w:hyperlink>
-      <w:r>
-        <w:t xml:space="preserve">) </w:t>
-      </w:r>
-      <w:r>
-        <w:t xml:space="preserve">mais globalement, en fonctionnement normale, </w:t>
-      </w:r>
-      <w:r>
-        <w:t>Le MOSFET est polarisé</w:t>
-      </w:r>
-      <w:r>
-        <w:t xml:space="preserve"> par une tension imposé</w:t>
-      </w:r>
-      <w:r>
-        <w:t>e</w:t>
-      </w:r>
-      <w:r>
-        <w:t xml:space="preserve"> par la tension </w:t>
-      </w:r>
-      <w:proofErr w:type="spellStart"/>
-      <w:r>
-        <w:t>zener</w:t>
-      </w:r>
-      <w:proofErr w:type="spellEnd"/>
-      <w:r>
-        <w:t xml:space="preserve"> de la diode </w:t>
-      </w:r>
-      <w:r>
-        <w:t>et le courant traversant la diode est lui-même limité par la résistance</w:t>
-      </w:r>
-      <w:r>
-        <w:t xml:space="preserve">. En quand la polarité est inversée, la tension G-S du MOSFET est bloqué à </w:t>
-      </w:r>
-      <w:r>
-        <w:t>~0.7V ce qui empêche le MOSFET de conduire</w:t>
-      </w:r>
-      <w:r>
-        <w:t xml:space="preserve"> et amène l</w:t>
-      </w:r>
-      <w:r>
-        <w:t xml:space="preserve">a </w:t>
-      </w:r>
-      <w:r>
-        <w:t xml:space="preserve">chute de </w:t>
-      </w:r>
-      <w:r>
-        <w:t xml:space="preserve">tension D-S </w:t>
-      </w:r>
-      <w:r>
-        <w:t>à</w:t>
-      </w:r>
-      <w:r>
-        <w:t xml:space="preserve"> augmente</w:t>
-      </w:r>
-      <w:r>
-        <w:t>r et</w:t>
-      </w:r>
-      <w:r>
-        <w:t xml:space="preserve"> empêche le circuit </w:t>
-      </w:r>
-      <w:r>
-        <w:t>de subir un</w:t>
-      </w:r>
-      <w:r>
-        <w:t>e</w:t>
-      </w:r>
-      <w:r>
-        <w:t xml:space="preserve"> chute de tension inverse de plus de quelques </w:t>
-      </w:r>
-      <w:r>
-        <w:t>microvolts</w:t>
-      </w:r>
-      <w:r>
-        <w:t xml:space="preserve">. J’ai fait une simulation </w:t>
-      </w:r>
-      <w:proofErr w:type="spellStart"/>
-      <w:r>
-        <w:t>falstad</w:t>
-      </w:r>
-      <w:proofErr w:type="spellEnd"/>
-      <w:r>
-        <w:t xml:space="preserve"> pour démontrer le fonctionnement du circuit de protection</w:t>
-      </w:r>
-      <w:r>
-        <w:t> :</w:t>
-      </w:r>
-    </w:p>
-    <w:p/>
+        <w:t>Ω</w:t>
+      </w:r>
+      <w:r>
+        <w:t xml:space="preserve"> ne passe jamais en dessous des -219.</w:t>
+      </w:r>
+      <w:r>
+        <w:t>971</w:t>
+      </w:r>
+      <w:r>
+        <w:rPr>
+          <w:rFonts w:cstheme="minorHAnsi"/>
+        </w:rPr>
+        <w:t>µ</w:t>
+      </w:r>
+      <w:r>
+        <w:t>V</w:t>
+      </w:r>
+      <w:r>
+        <w:t xml:space="preserve"> e</w:t>
+      </w:r>
+      <w:r>
+        <w:t>t celle du MOSFET</w:t>
+      </w:r>
+      <w:r>
+        <w:t xml:space="preserve"> monte à 5V</w:t>
+      </w:r>
+      <w:r>
+        <w:t xml:space="preserve"> </w:t>
+      </w:r>
+      <w:r>
+        <w:t>en revanche</w:t>
+      </w:r>
+      <w:r>
+        <w:t xml:space="preserve">, entre le générateur et la charge, on a une chute de tension de </w:t>
+      </w:r>
+      <w:r>
+        <w:t>0.569V. Cette chute n’est pas très importante car 1 : elle dépend du MOSFET choisi et 2 : la tension de sortie du régulateur est de 3.3V</w:t>
+      </w:r>
+    </w:p>
     <w:p/>
     <w:p>
       <w:pPr>
@@ -10867,15 +10524,7 @@
         <w:t xml:space="preserve"> calculer le courant maximum </w:t>
       </w:r>
       <w:r>
-        <w:t>avant de pouvoir la mesurer. Je suis donc aller voir dans les cas extrêmes pour l’</w:t>
-      </w:r>
-      <w:proofErr w:type="spellStart"/>
-      <w:r>
-        <w:t>uC</w:t>
-      </w:r>
-      <w:proofErr w:type="spellEnd"/>
-      <w:r>
-        <w:t xml:space="preserve"> </w:t>
+        <w:t xml:space="preserve">avant de pouvoir la mesurer. Je suis donc aller voir dans les cas extrêmes pour l’uC </w:t>
       </w:r>
       <w:r>
         <w:t>ce qui nous donne un courant max de 105mA (</w:t>
@@ -10885,44 +10534,8 @@
           <w:rPr>
             <w:rStyle w:val="Lienhypertexte"/>
           </w:rPr>
-          <w:t>Datasheet - STM32L072x8 STM32L072xB STM32L072xZ - Ultra-</w:t>
-        </w:r>
-        <w:proofErr w:type="spellStart"/>
-        <w:r>
-          <w:rPr>
-            <w:rStyle w:val="Lienhypertexte"/>
-          </w:rPr>
-          <w:t>low</w:t>
-        </w:r>
-        <w:proofErr w:type="spellEnd"/>
-        <w:r>
-          <w:rPr>
-            <w:rStyle w:val="Lienhypertexte"/>
-          </w:rPr>
-          <w:t>-power 32-bit MCU Arm®-</w:t>
-        </w:r>
-        <w:proofErr w:type="spellStart"/>
-        <w:r>
-          <w:rPr>
-            <w:rStyle w:val="Lienhypertexte"/>
-          </w:rPr>
-          <w:t>based</w:t>
-        </w:r>
-        <w:proofErr w:type="spellEnd"/>
-        <w:r>
-          <w:rPr>
-            <w:rStyle w:val="Lienhypertexte"/>
-          </w:rPr>
-          <w:t xml:space="preserve"> Cortex®-M0+, up to 192KB Flash, 20KB SRAM, 6KB EEPROM, USB, ADC, </w:t>
-        </w:r>
-        <w:proofErr w:type="spellStart"/>
-        <w:r>
-          <w:rPr>
-            <w:rStyle w:val="Lienhypertexte"/>
-          </w:rPr>
-          <w:t>DACs</w:t>
-        </w:r>
-        <w:proofErr w:type="spellEnd"/>
+          <w:t>Datasheet - STM32L072x8 STM32L072xB STM32L072xZ - Ultra-low-power 32-bit MCU Arm®-based Cortex®-M0+, up to 192KB Flash, 20KB SRAM, 6KB EEPROM, USB, ADC, DACs</w:t>
+        </w:r>
       </w:hyperlink>
       <w:r>
         <w:t xml:space="preserve"> P.</w:t>
@@ -10941,7 +10554,7 @@
           <w:noProof/>
         </w:rPr>
         <w:drawing>
-          <wp:anchor distT="0" distB="0" distL="114300" distR="114300" simplePos="0" relativeHeight="251676160" behindDoc="0" locked="0" layoutInCell="1" allowOverlap="1" wp14:anchorId="3D24E313" wp14:editId="241CAEFC">
+          <wp:anchor distT="0" distB="0" distL="114300" distR="114300" simplePos="0" relativeHeight="251676160" behindDoc="0" locked="0" layoutInCell="1" allowOverlap="1" wp14:anchorId="3D24E313" wp14:editId="7CD77C45">
             <wp:simplePos x="0" y="0"/>
             <wp:positionH relativeFrom="margin">
               <wp:align>center</wp:align>
@@ -11010,23 +10623,7 @@
         <w:t xml:space="preserve">extrêmes </w:t>
       </w:r>
       <w:r>
-        <w:t xml:space="preserve">de leur côté aussi. Pour la matrice de </w:t>
-      </w:r>
-      <w:proofErr w:type="spellStart"/>
-      <w:r>
-        <w:t>LEDs</w:t>
-      </w:r>
-      <w:proofErr w:type="spellEnd"/>
-      <w:r>
-        <w:t xml:space="preserve">, on pourra activer un maximum de 2 </w:t>
-      </w:r>
-      <w:proofErr w:type="spellStart"/>
-      <w:r>
-        <w:t>LEDs</w:t>
-      </w:r>
-      <w:proofErr w:type="spellEnd"/>
-      <w:r>
-        <w:t xml:space="preserve"> à la fois</w:t>
+        <w:t>de leur côté aussi. Pour la matrice de LEDs, on pourra activer un maximum de 2 LEDs à la fois</w:t>
       </w:r>
       <w:r>
         <w:t>. Avec la matrice de touches, j’estime que toutes les touches tireront le courant maximum en tout temps.</w:t>
@@ -11160,68 +10757,14 @@
       <w:r>
         <w:t>(</w:t>
       </w:r>
-      <w:proofErr w:type="spellStart"/>
-      <w:r>
-        <w:fldChar w:fldCharType="begin"/>
-      </w:r>
-      <w:r>
-        <w:instrText>HYPERLINK "https://www.st.com/resource/en/application_note/an4467-getting-started-with-stm32l0xx-hardware-development-stmicroelectronics.pdf"</w:instrText>
-      </w:r>
-      <w:r>
-        <w:fldChar w:fldCharType="separate"/>
-      </w:r>
-      <w:r>
-        <w:rPr>
-          <w:rStyle w:val="Lienhypertexte"/>
-        </w:rPr>
-        <w:t>Getting</w:t>
-      </w:r>
-      <w:proofErr w:type="spellEnd"/>
-      <w:r>
-        <w:rPr>
-          <w:rStyle w:val="Lienhypertexte"/>
-        </w:rPr>
-        <w:t xml:space="preserve"> </w:t>
-      </w:r>
-      <w:proofErr w:type="spellStart"/>
-      <w:r>
-        <w:rPr>
-          <w:rStyle w:val="Lienhypertexte"/>
-        </w:rPr>
-        <w:t>started</w:t>
-      </w:r>
-      <w:proofErr w:type="spellEnd"/>
-      <w:r>
-        <w:rPr>
-          <w:rStyle w:val="Lienhypertexte"/>
-        </w:rPr>
-        <w:t xml:space="preserve"> </w:t>
-      </w:r>
-      <w:proofErr w:type="spellStart"/>
-      <w:r>
-        <w:rPr>
-          <w:rStyle w:val="Lienhypertexte"/>
-        </w:rPr>
-        <w:t>with</w:t>
-      </w:r>
-      <w:proofErr w:type="spellEnd"/>
-      <w:r>
-        <w:rPr>
-          <w:rStyle w:val="Lienhypertexte"/>
-        </w:rPr>
-        <w:t xml:space="preserve"> STM32L0xx hardware </w:t>
-      </w:r>
-      <w:proofErr w:type="spellStart"/>
-      <w:r>
-        <w:rPr>
-          <w:rStyle w:val="Lienhypertexte"/>
-        </w:rPr>
-        <w:t>development</w:t>
-      </w:r>
-      <w:proofErr w:type="spellEnd"/>
-      <w:r>
-        <w:fldChar w:fldCharType="end"/>
-      </w:r>
+      <w:hyperlink r:id="rId32" w:history="1">
+        <w:r>
+          <w:rPr>
+            <w:rStyle w:val="Lienhypertexte"/>
+          </w:rPr>
+          <w:t>Getting started with STM32L0xx hardware development</w:t>
+        </w:r>
+      </w:hyperlink>
       <w:r>
         <w:t>)</w:t>
       </w:r>
@@ -11268,7 +10811,7 @@
           <w:noProof/>
         </w:rPr>
         <w:drawing>
-          <wp:anchor distT="0" distB="0" distL="114300" distR="114300" simplePos="0" relativeHeight="251675136" behindDoc="0" locked="0" layoutInCell="1" allowOverlap="1" wp14:anchorId="650B7E38" wp14:editId="5274B2E4">
+          <wp:anchor distT="0" distB="0" distL="114300" distR="114300" simplePos="0" relativeHeight="251675136" behindDoc="0" locked="0" layoutInCell="1" allowOverlap="1" wp14:anchorId="650B7E38" wp14:editId="0D4DCDA9">
             <wp:simplePos x="0" y="0"/>
             <wp:positionH relativeFrom="column">
               <wp:posOffset>1766570</wp:posOffset>
@@ -11293,7 +10836,7 @@
                     </pic:cNvPicPr>
                   </pic:nvPicPr>
                   <pic:blipFill rotWithShape="1">
-                    <a:blip r:embed="rId32" cstate="print">
+                    <a:blip r:embed="rId33" cstate="print">
                       <a:extLst>
                         <a:ext uri="{28A0092B-C50C-407E-A947-70E740481C1C}">
                           <a14:useLocalDpi xmlns:a14="http://schemas.microsoft.com/office/drawing/2010/main" val="0"/>
@@ -11355,7 +10898,7 @@
                     <pic:cNvPicPr/>
                   </pic:nvPicPr>
                   <pic:blipFill>
-                    <a:blip r:embed="rId33">
+                    <a:blip r:embed="rId34">
                       <a:extLst>
                         <a:ext uri="{28A0092B-C50C-407E-A947-70E740481C1C}">
                           <a14:useLocalDpi xmlns:a14="http://schemas.microsoft.com/office/drawing/2010/main" val="0"/>
@@ -11382,15 +10925,7 @@
         </w:drawing>
       </w:r>
       <w:r>
-        <w:t xml:space="preserve">Pour la protection du circuit contre une polarisation inverse des TP1 et TP2, j’ai choisi d’utiliser un MOSFET </w:t>
-      </w:r>
-      <w:proofErr w:type="spellStart"/>
-      <w:r>
-        <w:t>channel</w:t>
-      </w:r>
-      <w:proofErr w:type="spellEnd"/>
-      <w:r>
-        <w:t xml:space="preserve"> P avec cette configuration :</w:t>
+        <w:t>Pour la protection du circuit contre une polarisation inverse des TP1 et TP2, j’ai choisi d’utiliser un MOSFET channel P avec cette configuration :</w:t>
       </w:r>
     </w:p>
     <w:p/>
@@ -11401,40 +10936,12 @@
       <w:r>
         <w:t>le papier de ONSEMI sur la sélection des MOSFET pour la protection de polarisation inverse (</w:t>
       </w:r>
-      <w:hyperlink r:id="rId34" w:history="1">
+      <w:hyperlink r:id="rId35" w:history="1">
         <w:r>
           <w:rPr>
             <w:rStyle w:val="Lienhypertexte"/>
           </w:rPr>
-          <w:t xml:space="preserve">AND90146 - MOSFET </w:t>
-        </w:r>
-        <w:proofErr w:type="spellStart"/>
-        <w:r>
-          <w:rPr>
-            <w:rStyle w:val="Lienhypertexte"/>
-          </w:rPr>
-          <w:t>Selection</w:t>
-        </w:r>
-        <w:proofErr w:type="spellEnd"/>
-        <w:r>
-          <w:rPr>
-            <w:rStyle w:val="Lienhypertexte"/>
-          </w:rPr>
-          <w:t xml:space="preserve"> for Reverse </w:t>
-        </w:r>
-        <w:proofErr w:type="spellStart"/>
-        <w:r>
-          <w:rPr>
-            <w:rStyle w:val="Lienhypertexte"/>
-          </w:rPr>
-          <w:t>Polarity</w:t>
-        </w:r>
-        <w:proofErr w:type="spellEnd"/>
-        <w:r>
-          <w:rPr>
-            <w:rStyle w:val="Lienhypertexte"/>
-          </w:rPr>
-          <w:t xml:space="preserve"> Protection</w:t>
+          <w:t>AND90146 - MOSFET Selection for Reverse Polarity Protection</w:t>
         </w:r>
       </w:hyperlink>
       <w:r>
@@ -11497,15 +11004,7 @@
         <w:t xml:space="preserve"> en boitier SOD-123</w:t>
       </w:r>
       <w:r>
-        <w:t xml:space="preserve"> et j’ai simplifier le schéma de manière </w:t>
-      </w:r>
-      <w:proofErr w:type="spellStart"/>
-      <w:r>
-        <w:t>a</w:t>
-      </w:r>
-      <w:proofErr w:type="spellEnd"/>
-      <w:r>
-        <w:t xml:space="preserve"> pouvoir calculer R14.</w:t>
+        <w:t xml:space="preserve"> et j’ai simplifier le schéma de manière a pouvoir calculer R14.</w:t>
       </w:r>
     </w:p>
     <w:p/>
@@ -11685,23 +11184,7 @@
                 <w:sz w:val="18"/>
                 <w:szCs w:val="18"/>
               </w:rPr>
-              <w:t xml:space="preserve">Mes. </w:t>
-            </w:r>
-            <w:proofErr w:type="spellStart"/>
-            <w:r>
-              <w:rPr>
-                <w:sz w:val="18"/>
-                <w:szCs w:val="18"/>
-              </w:rPr>
-              <w:t>Ref</w:t>
-            </w:r>
-            <w:proofErr w:type="spellEnd"/>
-            <w:r>
-              <w:rPr>
-                <w:sz w:val="18"/>
-                <w:szCs w:val="18"/>
-              </w:rPr>
-              <w:t>.</w:t>
+              <w:t>Mes. Ref.</w:t>
             </w:r>
           </w:p>
         </w:tc>
@@ -12563,7 +12046,6 @@
       <w:bookmarkStart w:id="47" w:name="_Toc40260317"/>
       <w:bookmarkStart w:id="48" w:name="_Toc40260364"/>
       <w:bookmarkStart w:id="49" w:name="_Toc72079942"/>
-      <w:proofErr w:type="spellStart"/>
       <w:r>
         <w:t>Layout</w:t>
       </w:r>
@@ -12572,7 +12054,6 @@
       <w:bookmarkEnd w:id="47"/>
       <w:bookmarkEnd w:id="48"/>
       <w:bookmarkEnd w:id="49"/>
-      <w:proofErr w:type="spellEnd"/>
     </w:p>
     <w:p>
       <w:pPr>
@@ -12598,16 +12079,11 @@
         <w:pStyle w:val="Titre4"/>
       </w:pPr>
       <w:r>
-        <w:t xml:space="preserve">Diamètres des </w:t>
-      </w:r>
-      <w:proofErr w:type="spellStart"/>
-      <w:r>
-        <w:t>v</w:t>
+        <w:t>Diamètres des v</w:t>
       </w:r>
       <w:r>
         <w:t>ias</w:t>
       </w:r>
-      <w:proofErr w:type="spellEnd"/>
     </w:p>
     <w:p>
       <w:pPr>
@@ -12643,7 +12119,6 @@
       <w:bookmarkStart w:id="52" w:name="_Toc40260323"/>
       <w:bookmarkStart w:id="53" w:name="_Toc40260370"/>
       <w:bookmarkStart w:id="54" w:name="_Toc72079943"/>
-      <w:proofErr w:type="spellStart"/>
       <w:r>
         <w:t>Firmware</w:t>
       </w:r>
@@ -12652,7 +12127,6 @@
       <w:bookmarkEnd w:id="52"/>
       <w:bookmarkEnd w:id="53"/>
       <w:bookmarkEnd w:id="54"/>
-      <w:proofErr w:type="spellEnd"/>
     </w:p>
     <w:p>
       <w:pPr>
@@ -12666,21 +12140,17 @@
       <w:pPr>
         <w:pStyle w:val="Titre3"/>
       </w:pPr>
-      <w:proofErr w:type="spellStart"/>
       <w:r>
         <w:t>Flowchart</w:t>
       </w:r>
-      <w:proofErr w:type="spellEnd"/>
     </w:p>
     <w:p>
       <w:pPr>
         <w:pStyle w:val="Titre3"/>
       </w:pPr>
-      <w:proofErr w:type="spellStart"/>
       <w:r>
         <w:t>Structogramme</w:t>
       </w:r>
-      <w:proofErr w:type="spellEnd"/>
     </w:p>
     <w:p>
       <w:pPr>
@@ -12704,11 +12174,9 @@
       <w:pPr>
         <w:pStyle w:val="Titre3"/>
       </w:pPr>
-      <w:proofErr w:type="spellStart"/>
       <w:r>
         <w:t>Structogramme</w:t>
       </w:r>
-      <w:proofErr w:type="spellEnd"/>
     </w:p>
     <w:p>
       <w:pPr>
@@ -12816,14 +12284,9 @@
       </w:pPr>
       <w:bookmarkStart w:id="65" w:name="_Toc72079950"/>
       <w:r>
-        <w:t xml:space="preserve">Validation </w:t>
-      </w:r>
-      <w:proofErr w:type="spellStart"/>
-      <w:r>
-        <w:t>Eurocircuits</w:t>
+        <w:t>Validation Eurocircuits</w:t>
       </w:r>
       <w:bookmarkEnd w:id="65"/>
-      <w:proofErr w:type="spellEnd"/>
     </w:p>
     <w:p>
       <w:pPr>
@@ -12924,11 +12387,9 @@
             <w:shd w:val="clear" w:color="auto" w:fill="D9D9D9" w:themeFill="background1" w:themeFillShade="D9"/>
           </w:tcPr>
           <w:p>
-            <w:proofErr w:type="spellStart"/>
             <w:r>
               <w:t>pcb</w:t>
             </w:r>
-            <w:proofErr w:type="spellEnd"/>
           </w:p>
         </w:tc>
         <w:tc>
@@ -12950,23 +12411,7 @@
                 <w:b/>
                 <w:bCs/>
               </w:rPr>
-              <w:t xml:space="preserve"> (.</w:t>
-            </w:r>
-            <w:proofErr w:type="spellStart"/>
-            <w:r>
-              <w:rPr>
-                <w:b/>
-                <w:bCs/>
-              </w:rPr>
-              <w:t>pdf</w:t>
-            </w:r>
-            <w:proofErr w:type="spellEnd"/>
-            <w:r>
-              <w:rPr>
-                <w:b/>
-                <w:bCs/>
-              </w:rPr>
-              <w:t>)</w:t>
+              <w:t xml:space="preserve"> (.pdf)</w:t>
             </w:r>
           </w:p>
         </w:tc>
@@ -13067,13 +12512,13 @@
                           <pic:cNvPicPr/>
                         </pic:nvPicPr>
                         <pic:blipFill>
-                          <a:blip r:embed="rId35" cstate="print">
+                          <a:blip r:embed="rId36" cstate="print">
                             <a:extLst>
                               <a:ext uri="{28A0092B-C50C-407E-A947-70E740481C1C}">
                                 <a14:useLocalDpi xmlns:a14="http://schemas.microsoft.com/office/drawing/2010/main" val="0"/>
                               </a:ext>
                               <a:ext uri="{96DAC541-7B7A-43D3-8B79-37D633B846F1}">
-                                <asvg:svgBlip xmlns:asvg="http://schemas.microsoft.com/office/drawing/2016/SVG/main" r:embed="rId36"/>
+                                <asvg:svgBlip xmlns:asvg="http://schemas.microsoft.com/office/drawing/2016/SVG/main" r:embed="rId37"/>
                               </a:ext>
                             </a:extLst>
                           </a:blip>
@@ -13158,7 +12603,6 @@
               </w:rPr>
               <w:t>\</w:t>
             </w:r>
-            <w:proofErr w:type="spellStart"/>
             <w:r>
               <w:rPr>
                 <w:sz w:val="18"/>
@@ -13167,7 +12611,6 @@
               </w:rPr>
               <w:t>projectname</w:t>
             </w:r>
-            <w:proofErr w:type="spellEnd"/>
             <w:r>
               <w:rPr>
                 <w:sz w:val="18"/>
@@ -13176,7 +12619,6 @@
               </w:rPr>
               <w:t>\</w:t>
             </w:r>
-            <w:proofErr w:type="spellStart"/>
             <w:r>
               <w:rPr>
                 <w:sz w:val="18"/>
@@ -13185,7 +12627,6 @@
               </w:rPr>
               <w:t>pcb</w:t>
             </w:r>
-            <w:proofErr w:type="spellEnd"/>
             <w:r>
               <w:rPr>
                 <w:sz w:val="18"/>
@@ -13194,7 +12635,6 @@
               </w:rPr>
               <w:t>\</w:t>
             </w:r>
-            <w:proofErr w:type="spellStart"/>
             <w:r>
               <w:rPr>
                 <w:sz w:val="18"/>
@@ -13203,7 +12643,6 @@
               </w:rPr>
               <w:t>pdf</w:t>
             </w:r>
-            <w:proofErr w:type="spellEnd"/>
             <w:r>
               <w:rPr>
                 <w:sz w:val="18"/>
@@ -13235,11 +12674,9 @@
             <w:shd w:val="clear" w:color="auto" w:fill="D9D9D9" w:themeFill="background1" w:themeFillShade="D9"/>
           </w:tcPr>
           <w:p>
-            <w:proofErr w:type="spellStart"/>
             <w:r>
               <w:t>pcb</w:t>
             </w:r>
-            <w:proofErr w:type="spellEnd"/>
           </w:p>
         </w:tc>
         <w:tc>
@@ -13261,23 +12698,7 @@
                 <w:b/>
                 <w:bCs/>
               </w:rPr>
-              <w:t xml:space="preserve"> (.</w:t>
-            </w:r>
-            <w:proofErr w:type="spellStart"/>
-            <w:r>
-              <w:rPr>
-                <w:b/>
-                <w:bCs/>
-              </w:rPr>
-              <w:t>pdf</w:t>
-            </w:r>
-            <w:proofErr w:type="spellEnd"/>
-            <w:r>
-              <w:rPr>
-                <w:b/>
-                <w:bCs/>
-              </w:rPr>
-              <w:t>)</w:t>
+              <w:t xml:space="preserve"> (.pdf)</w:t>
             </w:r>
           </w:p>
         </w:tc>
@@ -13401,13 +12822,13 @@
                           <pic:cNvPicPr/>
                         </pic:nvPicPr>
                         <pic:blipFill>
-                          <a:blip r:embed="rId35" cstate="print">
+                          <a:blip r:embed="rId36" cstate="print">
                             <a:extLst>
                               <a:ext uri="{28A0092B-C50C-407E-A947-70E740481C1C}">
                                 <a14:useLocalDpi xmlns:a14="http://schemas.microsoft.com/office/drawing/2010/main" val="0"/>
                               </a:ext>
                               <a:ext uri="{96DAC541-7B7A-43D3-8B79-37D633B846F1}">
-                                <asvg:svgBlip xmlns:asvg="http://schemas.microsoft.com/office/drawing/2016/SVG/main" r:embed="rId36"/>
+                                <asvg:svgBlip xmlns:asvg="http://schemas.microsoft.com/office/drawing/2016/SVG/main" r:embed="rId37"/>
                               </a:ext>
                             </a:extLst>
                           </a:blip>
@@ -13529,13 +12950,13 @@
                           <pic:cNvPicPr/>
                         </pic:nvPicPr>
                         <pic:blipFill>
-                          <a:blip r:embed="rId35" cstate="print">
+                          <a:blip r:embed="rId36" cstate="print">
                             <a:extLst>
                               <a:ext uri="{28A0092B-C50C-407E-A947-70E740481C1C}">
                                 <a14:useLocalDpi xmlns:a14="http://schemas.microsoft.com/office/drawing/2010/main" val="0"/>
                               </a:ext>
                               <a:ext uri="{96DAC541-7B7A-43D3-8B79-37D633B846F1}">
-                                <asvg:svgBlip xmlns:asvg="http://schemas.microsoft.com/office/drawing/2016/SVG/main" r:embed="rId36"/>
+                                <asvg:svgBlip xmlns:asvg="http://schemas.microsoft.com/office/drawing/2016/SVG/main" r:embed="rId37"/>
                               </a:ext>
                             </a:extLst>
                           </a:blip>
@@ -13620,7 +13041,6 @@
               </w:rPr>
               <w:t>\</w:t>
             </w:r>
-            <w:proofErr w:type="spellStart"/>
             <w:r>
               <w:rPr>
                 <w:sz w:val="18"/>
@@ -13629,7 +13049,6 @@
               </w:rPr>
               <w:t>projectname</w:t>
             </w:r>
-            <w:proofErr w:type="spellEnd"/>
             <w:r>
               <w:rPr>
                 <w:sz w:val="18"/>
@@ -13638,7 +13057,6 @@
               </w:rPr>
               <w:t>\</w:t>
             </w:r>
-            <w:proofErr w:type="spellStart"/>
             <w:r>
               <w:rPr>
                 <w:sz w:val="18"/>
@@ -13647,7 +13065,6 @@
               </w:rPr>
               <w:t>pcb</w:t>
             </w:r>
-            <w:proofErr w:type="spellEnd"/>
             <w:r>
               <w:rPr>
                 <w:sz w:val="18"/>
@@ -13656,7 +13073,6 @@
               </w:rPr>
               <w:t>\</w:t>
             </w:r>
-            <w:proofErr w:type="spellStart"/>
             <w:r>
               <w:rPr>
                 <w:sz w:val="18"/>
@@ -13665,7 +13081,6 @@
               </w:rPr>
               <w:t>pdf</w:t>
             </w:r>
-            <w:proofErr w:type="spellEnd"/>
             <w:r>
               <w:rPr>
                 <w:sz w:val="18"/>
@@ -13697,11 +13112,9 @@
             <w:shd w:val="clear" w:color="auto" w:fill="D9D9D9" w:themeFill="background1" w:themeFillShade="D9"/>
           </w:tcPr>
           <w:p>
-            <w:proofErr w:type="spellStart"/>
             <w:r>
               <w:t>pcb</w:t>
             </w:r>
-            <w:proofErr w:type="spellEnd"/>
           </w:p>
         </w:tc>
         <w:tc>
@@ -13883,7 +13296,6 @@
               </w:rPr>
               <w:t>\</w:t>
             </w:r>
-            <w:proofErr w:type="spellStart"/>
             <w:r>
               <w:rPr>
                 <w:sz w:val="18"/>
@@ -13892,7 +13304,6 @@
               </w:rPr>
               <w:t>projectname</w:t>
             </w:r>
-            <w:proofErr w:type="spellEnd"/>
             <w:r>
               <w:rPr>
                 <w:sz w:val="18"/>
@@ -13901,7 +13312,6 @@
               </w:rPr>
               <w:t>\</w:t>
             </w:r>
-            <w:proofErr w:type="spellStart"/>
             <w:r>
               <w:rPr>
                 <w:sz w:val="18"/>
@@ -13910,7 +13320,6 @@
               </w:rPr>
               <w:t>pcb</w:t>
             </w:r>
-            <w:proofErr w:type="spellEnd"/>
             <w:r>
               <w:rPr>
                 <w:sz w:val="18"/>
@@ -13942,11 +13351,9 @@
             <w:shd w:val="clear" w:color="auto" w:fill="D9D9D9" w:themeFill="background1" w:themeFillShade="D9"/>
           </w:tcPr>
           <w:p>
-            <w:proofErr w:type="spellStart"/>
             <w:r>
               <w:t>fwr</w:t>
             </w:r>
-            <w:proofErr w:type="spellEnd"/>
           </w:p>
         </w:tc>
         <w:tc>
@@ -13956,7 +13363,6 @@
             <w:shd w:val="clear" w:color="auto" w:fill="D9D9D9" w:themeFill="background1" w:themeFillShade="D9"/>
           </w:tcPr>
           <w:p>
-            <w:proofErr w:type="spellStart"/>
             <w:r>
               <w:rPr>
                 <w:b/>
@@ -13964,29 +13370,12 @@
               </w:rPr>
               <w:t>Firmware</w:t>
             </w:r>
-            <w:proofErr w:type="spellEnd"/>
             <w:r>
               <w:rPr>
                 <w:b/>
                 <w:bCs/>
               </w:rPr>
-              <w:t xml:space="preserve"> (.</w:t>
-            </w:r>
-            <w:proofErr w:type="spellStart"/>
-            <w:r>
-              <w:rPr>
-                <w:b/>
-                <w:bCs/>
-              </w:rPr>
-              <w:t>hex</w:t>
-            </w:r>
-            <w:proofErr w:type="spellEnd"/>
-            <w:r>
-              <w:rPr>
-                <w:b/>
-                <w:bCs/>
-              </w:rPr>
-              <w:t>)</w:t>
+              <w:t xml:space="preserve"> (.hex)</w:t>
             </w:r>
           </w:p>
         </w:tc>
@@ -14127,11 +13516,9 @@
             <w:shd w:val="clear" w:color="auto" w:fill="D9D9D9" w:themeFill="background1" w:themeFillShade="D9"/>
           </w:tcPr>
           <w:p>
-            <w:proofErr w:type="spellStart"/>
             <w:r>
               <w:t>swr</w:t>
             </w:r>
-            <w:proofErr w:type="spellEnd"/>
           </w:p>
         </w:tc>
         <w:tc>
@@ -14332,23 +13719,7 @@
                 <w:b/>
                 <w:bCs/>
               </w:rPr>
-              <w:t xml:space="preserve"> (.</w:t>
-            </w:r>
-            <w:proofErr w:type="spellStart"/>
-            <w:r>
-              <w:rPr>
-                <w:b/>
-                <w:bCs/>
-              </w:rPr>
-              <w:t>pdf</w:t>
-            </w:r>
-            <w:proofErr w:type="spellEnd"/>
-            <w:r>
-              <w:rPr>
-                <w:b/>
-                <w:bCs/>
-              </w:rPr>
-              <w:t>)</w:t>
+              <w:t xml:space="preserve"> (.pdf)</w:t>
             </w:r>
           </w:p>
         </w:tc>
@@ -14489,11 +13860,9 @@
             <w:shd w:val="clear" w:color="auto" w:fill="D9D9D9" w:themeFill="background1" w:themeFillShade="D9"/>
           </w:tcPr>
           <w:p>
-            <w:proofErr w:type="spellStart"/>
             <w:r>
               <w:t>rpt</w:t>
             </w:r>
-            <w:proofErr w:type="spellEnd"/>
           </w:p>
         </w:tc>
         <w:tc>
@@ -14508,23 +13877,7 @@
                 <w:b/>
                 <w:bCs/>
               </w:rPr>
-              <w:t>Liste de matériel (.</w:t>
-            </w:r>
-            <w:proofErr w:type="spellStart"/>
-            <w:r>
-              <w:rPr>
-                <w:b/>
-                <w:bCs/>
-              </w:rPr>
-              <w:t>pdf</w:t>
-            </w:r>
-            <w:proofErr w:type="spellEnd"/>
-            <w:r>
-              <w:rPr>
-                <w:b/>
-                <w:bCs/>
-              </w:rPr>
-              <w:t>)</w:t>
+              <w:t>Liste de matériel (.pdf)</w:t>
             </w:r>
           </w:p>
         </w:tc>
@@ -14665,13 +14018,13 @@
                           <pic:cNvPicPr/>
                         </pic:nvPicPr>
                         <pic:blipFill>
-                          <a:blip r:embed="rId35" cstate="print">
+                          <a:blip r:embed="rId36" cstate="print">
                             <a:extLst>
                               <a:ext uri="{28A0092B-C50C-407E-A947-70E740481C1C}">
                                 <a14:useLocalDpi xmlns:a14="http://schemas.microsoft.com/office/drawing/2010/main" val="0"/>
                               </a:ext>
                               <a:ext uri="{96DAC541-7B7A-43D3-8B79-37D633B846F1}">
-                                <asvg:svgBlip xmlns:asvg="http://schemas.microsoft.com/office/drawing/2016/SVG/main" r:embed="rId36"/>
+                                <asvg:svgBlip xmlns:asvg="http://schemas.microsoft.com/office/drawing/2016/SVG/main" r:embed="rId37"/>
                               </a:ext>
                             </a:extLst>
                           </a:blip>
@@ -14757,7 +14110,6 @@
               </w:rPr>
               <w:t>\</w:t>
             </w:r>
-            <w:proofErr w:type="spellStart"/>
             <w:r>
               <w:rPr>
                 <w:sz w:val="18"/>
@@ -14766,7 +14118,6 @@
               </w:rPr>
               <w:t>projectname</w:t>
             </w:r>
-            <w:proofErr w:type="spellEnd"/>
             <w:r>
               <w:rPr>
                 <w:sz w:val="18"/>
@@ -14775,7 +14126,6 @@
               </w:rPr>
               <w:t>\</w:t>
             </w:r>
-            <w:proofErr w:type="spellStart"/>
             <w:r>
               <w:rPr>
                 <w:sz w:val="18"/>
@@ -14784,7 +14134,6 @@
               </w:rPr>
               <w:t>pcb</w:t>
             </w:r>
-            <w:proofErr w:type="spellEnd"/>
             <w:r>
               <w:rPr>
                 <w:sz w:val="18"/>
@@ -14793,23 +14142,13 @@
               </w:rPr>
               <w:t>\</w:t>
             </w:r>
-            <w:proofErr w:type="spellStart"/>
             <w:r>
               <w:rPr>
                 <w:sz w:val="18"/>
                 <w:szCs w:val="18"/>
                 <w:lang w:val="de-CH"/>
               </w:rPr>
-              <w:t>bom</w:t>
-            </w:r>
-            <w:proofErr w:type="spellEnd"/>
-            <w:r>
-              <w:rPr>
-                <w:sz w:val="18"/>
-                <w:szCs w:val="18"/>
-                <w:lang w:val="de-CH"/>
-              </w:rPr>
-              <w:t>\</w:t>
+              <w:t>bom\</w:t>
             </w:r>
           </w:p>
         </w:tc>
@@ -14903,13 +14242,8 @@
           </w:tcPr>
           <w:p>
             <w:r>
-              <w:t xml:space="preserve">EMF, 1705 Fribourg, </w:t>
+              <w:t>EMF, 1705 Fribourg, Switzerland</w:t>
             </w:r>
-            <w:proofErr w:type="spellStart"/>
-            <w:r>
-              <w:t>Switzerland</w:t>
-            </w:r>
-            <w:proofErr w:type="spellEnd"/>
           </w:p>
         </w:tc>
         <w:tc>
@@ -14951,19 +14285,9 @@
             <w:pPr>
               <w:jc w:val="center"/>
             </w:pPr>
-            <w:proofErr w:type="spellStart"/>
             <w:r>
-              <w:t>myname</w:t>
+              <w:t>myname myfirstname</w:t>
             </w:r>
-            <w:proofErr w:type="spellEnd"/>
-            <w:r>
-              <w:t xml:space="preserve"> </w:t>
-            </w:r>
-            <w:proofErr w:type="spellStart"/>
-            <w:r>
-              <w:t>myfirstname</w:t>
-            </w:r>
-            <w:proofErr w:type="spellEnd"/>
           </w:p>
         </w:tc>
       </w:tr>
@@ -14999,7 +14323,7 @@
           <w:numId w:val="30"/>
         </w:numPr>
       </w:pPr>
-      <w:hyperlink r:id="rId37" w:history="1">
+      <w:hyperlink r:id="rId38" w:history="1">
         <w:r>
           <w:rPr>
             <w:rStyle w:val="Lienhypertexte"/>
@@ -15104,11 +14428,9 @@
             <w:tcW w:w="2266" w:type="dxa"/>
           </w:tcPr>
           <w:p>
-            <w:proofErr w:type="spellStart"/>
             <w:r>
               <w:t>gauchl</w:t>
             </w:r>
-            <w:proofErr w:type="spellEnd"/>
           </w:p>
         </w:tc>
         <w:tc>
@@ -15164,8 +14486,8 @@
     </w:p>
     <w:p/>
     <w:sectPr>
-      <w:headerReference w:type="default" r:id="rId38"/>
-      <w:footerReference w:type="default" r:id="rId39"/>
+      <w:headerReference w:type="default" r:id="rId39"/>
+      <w:footerReference w:type="default" r:id="rId40"/>
       <w:pgSz w:w="11906" w:h="16838"/>
       <w:pgMar w:top="1417" w:right="1417" w:bottom="1417" w:left="1417" w:header="708" w:footer="708" w:gutter="0"/>
       <w:pgNumType w:start="0"/>
@@ -15212,6 +14534,7 @@
         <w:docPartUnique/>
       </w:docPartObj>
     </w:sdtPr>
+    <w:sdtEndPr/>
     <w:sdtContent>
       <w:p>
         <w:pPr>
@@ -17256,6 +16579,7 @@
   <w:style w:type="character" w:default="1" w:styleId="Policepardfaut">
     <w:name w:val="Default Paragraph Font"/>
     <w:uiPriority w:val="1"/>
+    <w:semiHidden/>
     <w:unhideWhenUsed/>
   </w:style>
   <w:style w:type="table" w:default="1" w:styleId="TableauNormal">

</xml_diff>